<commit_message>
added one research paper for Backgroung Reasearch
</commit_message>
<xml_diff>
--- a/report/7COM1079_Group_A104_Report.docx
+++ b/report/7COM1079_Group_A104_Report.docx
@@ -2035,13 +2035,7 @@
         <w:rPr>
           <w:rFonts w:ascii="Times New Roman" w:eastAsia="Times New Roman" w:hAnsi="Times New Roman" w:cs="Times New Roman"/>
         </w:rPr>
-        <w:t xml:space="preserve">In an article by </w:t>
-      </w:r>
-      <w:r>
-        <w:rPr>
-          <w:rFonts w:ascii="Times New Roman" w:eastAsia="Times New Roman" w:hAnsi="Times New Roman" w:cs="Times New Roman"/>
-        </w:rPr>
-        <w:t xml:space="preserve">Usman G. </w:t>
+        <w:t xml:space="preserve">In an article by Usman G. </w:t>
       </w:r>
       <w:r>
         <w:rPr>
@@ -2624,6 +2618,16 @@
     <w:p>
       <w:pPr>
         <w:pStyle w:val="ListParagraph"/>
+        <w:rPr>
+          <w:rFonts w:ascii="Times New Roman" w:eastAsia="Times New Roman" w:hAnsi="Times New Roman" w:cs="Times New Roman"/>
+          <w:b/>
+          <w:bCs/>
+        </w:rPr>
+      </w:pPr>
+    </w:p>
+    <w:p>
+      <w:pPr>
+        <w:pStyle w:val="ListParagraph"/>
         <w:numPr>
           <w:ilvl w:val="1"/>
           <w:numId w:val="32"/>
@@ -2638,123 +2642,94 @@
       <w:r>
         <w:rPr>
           <w:rFonts w:ascii="Times New Roman" w:eastAsia="Times New Roman" w:hAnsi="Times New Roman" w:cs="Times New Roman"/>
-        </w:rPr>
-        <w:t>Research papers (at least 3 relevant to your topic / DS)</w:t>
-      </w:r>
-      <w:r>
-        <w:rPr>
-          <w:rFonts w:ascii="Times New Roman" w:eastAsia="Times New Roman" w:hAnsi="Times New Roman" w:cs="Times New Roman"/>
-        </w:rPr>
-        <w:t xml:space="preserve"> </w:t>
-      </w:r>
-      <w:r>
-        <w:rPr>
-          <w:rFonts w:ascii="Times New Roman" w:eastAsia="Times New Roman" w:hAnsi="Times New Roman" w:cs="Times New Roman"/>
           <w:b/>
           <w:bCs/>
         </w:rPr>
+        <w:t>Research papers</w:t>
+      </w:r>
+      <w:r>
+        <w:rPr>
+          <w:rFonts w:ascii="Times New Roman" w:eastAsia="Times New Roman" w:hAnsi="Times New Roman" w:cs="Times New Roman"/>
+          <w:b/>
+          <w:bCs/>
+        </w:rPr>
+        <w:t xml:space="preserve"> </w:t>
+      </w:r>
+      <w:r>
+        <w:rPr>
+          <w:rFonts w:ascii="Times New Roman" w:eastAsia="Times New Roman" w:hAnsi="Times New Roman" w:cs="Times New Roman"/>
+          <w:b/>
+          <w:bCs/>
+        </w:rPr>
+        <w:t>(at least 3 relevant to your topic / DS)</w:t>
+      </w:r>
+      <w:r>
+        <w:rPr>
+          <w:rFonts w:ascii="Times New Roman" w:eastAsia="Times New Roman" w:hAnsi="Times New Roman" w:cs="Times New Roman"/>
+        </w:rPr>
+        <w:t xml:space="preserve"> </w:t>
+      </w:r>
+      <w:r>
+        <w:rPr>
+          <w:rFonts w:ascii="Times New Roman" w:eastAsia="Times New Roman" w:hAnsi="Times New Roman" w:cs="Times New Roman"/>
+          <w:b/>
+          <w:bCs/>
+        </w:rPr>
         <w:t>(200 words)</w:t>
       </w:r>
     </w:p>
     <w:p>
       <w:pPr>
         <w:pStyle w:val="ListParagraph"/>
-        <w:numPr>
-          <w:ilvl w:val="0"/>
-          <w:numId w:val="25"/>
-        </w:numPr>
-        <w:rPr>
-          <w:rFonts w:ascii="Times New Roman" w:eastAsia="Times New Roman" w:hAnsi="Times New Roman" w:cs="Times New Roman"/>
-        </w:rPr>
-      </w:pPr>
-      <w:r>
-        <w:rPr>
-          <w:rFonts w:ascii="Times New Roman" w:eastAsia="Times New Roman" w:hAnsi="Times New Roman" w:cs="Times New Roman"/>
-          <w:i/>
-          <w:highlight w:val="yellow"/>
-        </w:rPr>
-        <w:t>Was the data set used for some research papers?</w:t>
-      </w:r>
-      <w:r>
-        <w:rPr>
-          <w:rFonts w:ascii="Times New Roman" w:eastAsia="Times New Roman" w:hAnsi="Times New Roman" w:cs="Times New Roman"/>
-          <w:highlight w:val="yellow"/>
-        </w:rPr>
-        <w:t xml:space="preserve"> </w:t>
-      </w:r>
-      <w:r>
-        <w:rPr>
-          <w:rFonts w:ascii="Times New Roman" w:eastAsia="Times New Roman" w:hAnsi="Times New Roman" w:cs="Times New Roman"/>
-          <w:i/>
-          <w:iCs/>
-          <w:highlight w:val="yellow"/>
-        </w:rPr>
-        <w:t>Summarise and</w:t>
-      </w:r>
-      <w:r>
-        <w:rPr>
-          <w:rFonts w:ascii="Times New Roman" w:eastAsia="Times New Roman" w:hAnsi="Times New Roman" w:cs="Times New Roman"/>
-          <w:highlight w:val="yellow"/>
-        </w:rPr>
-        <w:t xml:space="preserve"> </w:t>
-      </w:r>
-      <w:r>
-        <w:rPr>
-          <w:rFonts w:ascii="Times New Roman" w:eastAsia="Times New Roman" w:hAnsi="Times New Roman" w:cs="Times New Roman"/>
-          <w:i/>
-          <w:highlight w:val="yellow"/>
-        </w:rPr>
-        <w:t>r</w:t>
-      </w:r>
-      <w:r>
-        <w:rPr>
-          <w:rFonts w:ascii="Times New Roman" w:eastAsia="Times New Roman" w:hAnsi="Times New Roman" w:cs="Times New Roman"/>
-          <w:i/>
-          <w:highlight w:val="yellow"/>
-        </w:rPr>
-        <w:t>eference at least 3 relevant research papers to your topic / DS</w:t>
-      </w:r>
-      <w:r>
-        <w:rPr>
-          <w:rFonts w:ascii="Times New Roman" w:eastAsia="Times New Roman" w:hAnsi="Times New Roman" w:cs="Times New Roman"/>
-          <w:i/>
-          <w:highlight w:val="yellow"/>
-        </w:rPr>
-        <w:t>.</w:t>
-      </w:r>
-      <w:r>
-        <w:rPr>
-          <w:rFonts w:ascii="Times New Roman" w:eastAsia="Times New Roman" w:hAnsi="Times New Roman" w:cs="Times New Roman"/>
-          <w:i/>
-          <w:highlight w:val="yellow"/>
-        </w:rPr>
-        <w:t xml:space="preserve"> See </w:t>
-      </w:r>
-      <w:hyperlink r:id="rId8" w:history="1">
-        <w:r>
+        <w:ind w:left="1440"/>
+        <w:rPr>
+          <w:rFonts w:ascii="Times New Roman" w:eastAsia="Times New Roman" w:hAnsi="Times New Roman" w:cs="Times New Roman"/>
+          <w:b/>
+          <w:bCs/>
+        </w:rPr>
+      </w:pPr>
+    </w:p>
+    <w:p>
+      <w:pPr>
+        <w:pStyle w:val="ListParagraph"/>
+        <w:ind w:left="1440"/>
+        <w:rPr>
+          <w:rFonts w:ascii="Times New Roman" w:hAnsi="Times New Roman" w:cs="Times New Roman"/>
+        </w:rPr>
+      </w:pPr>
+      <w:r>
+        <w:rPr>
+          <w:rFonts w:ascii="Times New Roman" w:hAnsi="Times New Roman" w:cs="Times New Roman"/>
+        </w:rPr>
+        <w:t xml:space="preserve">Occupational stress has been widely explored in both organisational psychology and health research, with many studies showing that different professions experience stress in different ways. </w:t>
+      </w:r>
+      <w:sdt>
+        <w:sdtPr>
           <w:rPr>
-            <w:rStyle w:val="Hyperlink"/>
-            <w:rFonts w:ascii="Times New Roman" w:eastAsia="Times New Roman" w:hAnsi="Times New Roman" w:cs="Times New Roman"/>
-            <w:i/>
-            <w:highlight w:val="yellow"/>
+            <w:rFonts w:ascii="Times New Roman" w:hAnsi="Times New Roman" w:cs="Times New Roman"/>
+            <w:color w:val="000000"/>
           </w:rPr>
-          <w:t>https://herts.instructure.com/courses/61421/modules</w:t>
-        </w:r>
-      </w:hyperlink>
-      <w:r>
-        <w:rPr>
-          <w:rFonts w:ascii="Times New Roman" w:eastAsia="Times New Roman" w:hAnsi="Times New Roman" w:cs="Times New Roman"/>
-          <w:i/>
-          <w:highlight w:val="yellow"/>
-        </w:rPr>
-        <w:t xml:space="preserve"> for writing.</w:t>
-      </w:r>
-      <w:r>
-        <w:rPr>
-          <w:rFonts w:ascii="Times New Roman" w:eastAsia="Times New Roman" w:hAnsi="Times New Roman" w:cs="Times New Roman"/>
-          <w:i/>
-        </w:rPr>
-        <w:t xml:space="preserve"> </w:t>
+          <w:tag w:val="MENDELEY_CITATION_v3_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"/>
+          <w:id w:val="605386655"/>
+          <w:placeholder>
+            <w:docPart w:val="822E86C6BB8146B4842220807431D7FD"/>
+          </w:placeholder>
+        </w:sdtPr>
+        <w:sdtContent>
+          <w:r>
+            <w:rPr>
+              <w:rFonts w:ascii="Times New Roman" w:hAnsi="Times New Roman" w:cs="Times New Roman"/>
+              <w:color w:val="000000"/>
+            </w:rPr>
+            <w:t>Shanafelt et al. (2015)</w:t>
+          </w:r>
+        </w:sdtContent>
+      </w:sdt>
+      <w:r>
+        <w:rPr>
+          <w:rFonts w:ascii="Times New Roman" w:hAnsi="Times New Roman" w:cs="Times New Roman"/>
+        </w:rPr>
+        <w:t xml:space="preserve"> conducted a large national survey of U.S. physicians, in which 6,880 doctors responded to questions about burnout and work–life balance. Their findings showed that doctors reported substantially higher levels of work-related pressure than the general workforce, highlighting how clinical decision-making, long shifts and emotional responsibility contribute to increased stress in medical roles.</w:t>
       </w:r>
     </w:p>
     <w:p>
@@ -3802,6 +3777,7 @@
         <w:rPr>
           <w:rFonts w:ascii="Times New Roman" w:eastAsia="Times New Roman" w:hAnsi="Times New Roman" w:cs="Times New Roman"/>
         </w:rPr>
+        <w:lastRenderedPageBreak/>
         <w:t>What went well</w:t>
       </w:r>
       <w:r>
@@ -4071,7 +4047,6 @@
           <w:iCs/>
           <w:highlight w:val="yellow"/>
         </w:rPr>
-        <w:lastRenderedPageBreak/>
         <w:t>Please comment on the GitHub log output, and refer to it as being</w:t>
       </w:r>
       <w:r>
@@ -4639,7 +4614,7 @@
         </w:rPr>
         <w:t xml:space="preserve"> (2024) “Frequency of Stressful Activities Amongst Doctors, Engineers and Teachers”, Pakistan Journal of Medicine and Dentistry, 3(4). Available at: </w:t>
       </w:r>
-      <w:hyperlink r:id="rId9" w:history="1">
+      <w:hyperlink r:id="rId8" w:history="1">
         <w:r>
           <w:rPr>
             <w:rStyle w:val="Hyperlink"/>
@@ -4814,19 +4789,11 @@
           <w:rFonts w:ascii="Times New Roman" w:eastAsia="Times New Roman" w:hAnsi="Times New Roman" w:cs="Times New Roman"/>
         </w:rPr>
       </w:pPr>
-      <w:proofErr w:type="spellStart"/>
-      <w:r>
-        <w:rPr>
-          <w:rFonts w:ascii="Times New Roman" w:eastAsia="Times New Roman" w:hAnsi="Times New Roman" w:cs="Times New Roman"/>
-        </w:rPr>
-        <w:t>Analysis.R</w:t>
-      </w:r>
-      <w:proofErr w:type="spellEnd"/>
-      <w:r>
-        <w:rPr>
-          <w:rFonts w:ascii="Times New Roman" w:eastAsia="Times New Roman" w:hAnsi="Times New Roman" w:cs="Times New Roman"/>
-        </w:rPr>
-        <w:t xml:space="preserve"> code with the appropriate statistics to test the hypotheses. </w:t>
+      <w:r>
+        <w:rPr>
+          <w:rFonts w:ascii="Times New Roman" w:eastAsia="Times New Roman" w:hAnsi="Times New Roman" w:cs="Times New Roman"/>
+        </w:rPr>
+        <w:t xml:space="preserve">Analysis.R code with the appropriate statistics to test the hypotheses. </w:t>
       </w:r>
     </w:p>
     <w:p>
@@ -4959,8 +4926,8 @@
       </w:pPr>
     </w:p>
     <w:sectPr>
-      <w:footerReference w:type="even" r:id="rId10"/>
-      <w:footerReference w:type="default" r:id="rId11"/>
+      <w:footerReference w:type="even" r:id="rId9"/>
+      <w:footerReference w:type="default" r:id="rId10"/>
       <w:pgSz w:w="11906" w:h="16838"/>
       <w:pgMar w:top="1440" w:right="1440" w:bottom="1440" w:left="1440" w:header="708" w:footer="708" w:gutter="0"/>
       <w:cols w:space="708"/>
@@ -9253,7 +9220,6 @@
   <w:style w:type="character" w:default="1" w:styleId="DefaultParagraphFont">
     <w:name w:val="Default Paragraph Font"/>
     <w:uiPriority w:val="1"/>
-    <w:semiHidden/>
     <w:unhideWhenUsed/>
   </w:style>
   <w:style w:type="table" w:default="1" w:styleId="TableNormal">
@@ -9719,6 +9685,607 @@
 </w:styles>
 </file>
 
+<file path=word/glossary/document.xml><?xml version="1.0" encoding="utf-8"?>
+<w:glossaryDocument xmlns:wpc="http://schemas.microsoft.com/office/word/2010/wordprocessingCanvas" xmlns:cx="http://schemas.microsoft.com/office/drawing/2014/chartex" xmlns:cx1="http://schemas.microsoft.com/office/drawing/2015/9/8/chartex" xmlns:cx2="http://schemas.microsoft.com/office/drawing/2015/10/21/chartex" xmlns:cx3="http://schemas.microsoft.com/office/drawing/2016/5/9/chartex" xmlns:cx4="http://schemas.microsoft.com/office/drawing/2016/5/10/chartex" xmlns:cx5="http://schemas.microsoft.com/office/drawing/2016/5/11/chartex" xmlns:cx6="http://schemas.microsoft.com/office/drawing/2016/5/12/chartex" xmlns:cx7="http://schemas.microsoft.com/office/drawing/2016/5/13/chartex" xmlns:cx8="http://schemas.microsoft.com/office/drawing/2016/5/14/chartex" xmlns:mc="http://schemas.openxmlformats.org/markup-compatibility/2006" xmlns:aink="http://schemas.microsoft.com/office/drawing/2016/ink" xmlns:am3d="http://schemas.microsoft.com/office/drawing/2017/model3d" xmlns:o="urn:schemas-microsoft-com:office:office" xmlns:oel="http://schemas.microsoft.com/office/2019/extlst" xmlns:r="http://schemas.openxmlformats.org/officeDocument/2006/relationships" xmlns:m="http://schemas.openxmlformats.org/officeDocument/2006/math" xmlns:v="urn:schemas-microsoft-com:vml" xmlns:wp14="http://schemas.microsoft.com/office/word/2010/wordprocessingDrawing" xmlns:wp="http://schemas.openxmlformats.org/drawingml/2006/wordprocessingDrawing" xmlns:w10="urn:schemas-microsoft-com:office:word" xmlns:w="http://schemas.openxmlformats.org/wordprocessingml/2006/main" xmlns:w14="http://schemas.microsoft.com/office/word/2010/wordml" xmlns:w15="http://schemas.microsoft.com/office/word/2012/wordml" xmlns:w16cex="http://schemas.microsoft.com/office/word/2018/wordml/cex" xmlns:w16cid="http://schemas.microsoft.com/office/word/2016/wordml/cid" xmlns:w16="http://schemas.microsoft.com/office/word/2018/wordml" xmlns:w16du="http://schemas.microsoft.com/office/word/2023/wordml/word16du" xmlns:w16sdtdh="http://schemas.microsoft.com/office/word/2020/wordml/sdtdatahash" xmlns:w16sdtfl="http://schemas.microsoft.com/office/word/2024/wordml/sdtformatlock" xmlns:w16se="http://schemas.microsoft.com/office/word/2015/wordml/symex" xmlns:wpg="http://schemas.microsoft.com/office/word/2010/wordprocessingGroup" xmlns:wpi="http://schemas.microsoft.com/office/word/2010/wordprocessingInk" xmlns:wne="http://schemas.microsoft.com/office/word/2006/wordml" xmlns:wps="http://schemas.microsoft.com/office/word/2010/wordprocessingShape" mc:Ignorable="w14 w15 w16se w16cid w16 w16cex w16sdtdh w16sdtfl w16du wp14">
+  <w:docParts>
+    <w:docPart>
+      <w:docPartPr>
+        <w:name w:val="822E86C6BB8146B4842220807431D7FD"/>
+        <w:category>
+          <w:name w:val="General"/>
+          <w:gallery w:val="placeholder"/>
+        </w:category>
+        <w:types>
+          <w:type w:val="bbPlcHdr"/>
+        </w:types>
+        <w:behaviors>
+          <w:behavior w:val="content"/>
+        </w:behaviors>
+        <w:guid w:val="{EDCB4537-09E7-4C13-891E-42C6637D92E7}"/>
+      </w:docPartPr>
+      <w:docPartBody>
+        <w:p>
+          <w:pPr>
+            <w:pStyle w:val="822E86C6BB8146B4842220807431D7FD"/>
+          </w:pPr>
+          <w:r>
+            <w:rPr>
+              <w:rStyle w:val="PlaceholderText"/>
+            </w:rPr>
+            <w:t>Click or tap here to enter text.</w:t>
+          </w:r>
+        </w:p>
+      </w:docPartBody>
+    </w:docPart>
+  </w:docParts>
+</w:glossaryDocument>
+</file>
+
+<file path=word/glossary/fontTable.xml><?xml version="1.0" encoding="utf-8"?>
+<w:fonts xmlns:mc="http://schemas.openxmlformats.org/markup-compatibility/2006" xmlns:r="http://schemas.openxmlformats.org/officeDocument/2006/relationships" xmlns:w="http://schemas.openxmlformats.org/wordprocessingml/2006/main" xmlns:w14="http://schemas.microsoft.com/office/word/2010/wordml" xmlns:w15="http://schemas.microsoft.com/office/word/2012/wordml" xmlns:w16cex="http://schemas.microsoft.com/office/word/2018/wordml/cex" xmlns:w16cid="http://schemas.microsoft.com/office/word/2016/wordml/cid" xmlns:w16="http://schemas.microsoft.com/office/word/2018/wordml" xmlns:w16du="http://schemas.microsoft.com/office/word/2023/wordml/word16du" xmlns:w16sdtdh="http://schemas.microsoft.com/office/word/2020/wordml/sdtdatahash" xmlns:w16sdtfl="http://schemas.microsoft.com/office/word/2024/wordml/sdtformatlock" xmlns:w16se="http://schemas.microsoft.com/office/word/2015/wordml/symex" mc:Ignorable="w14 w15 w16se w16cid w16 w16cex w16sdtdh w16sdtfl w16du">
+  <w:font w:name="Symbol">
+    <w:panose1 w:val="05050102010706020507"/>
+    <w:charset w:val="02"/>
+    <w:family w:val="roman"/>
+    <w:pitch w:val="variable"/>
+    <w:sig w:usb0="00000000" w:usb1="10000000" w:usb2="00000000" w:usb3="00000000" w:csb0="80000000" w:csb1="00000000"/>
+  </w:font>
+  <w:font w:name="Times New Roman">
+    <w:panose1 w:val="02020603050405020304"/>
+    <w:charset w:val="00"/>
+    <w:family w:val="roman"/>
+    <w:pitch w:val="variable"/>
+    <w:sig w:usb0="E0002EFF" w:usb1="C000785B" w:usb2="00000009" w:usb3="00000000" w:csb0="000001FF" w:csb1="00000000"/>
+  </w:font>
+  <w:font w:name="Courier New">
+    <w:panose1 w:val="02070309020205020404"/>
+    <w:charset w:val="00"/>
+    <w:family w:val="modern"/>
+    <w:pitch w:val="fixed"/>
+    <w:sig w:usb0="E0002EFF" w:usb1="C0007843" w:usb2="00000009" w:usb3="00000000" w:csb0="000001FF" w:csb1="00000000"/>
+  </w:font>
+  <w:font w:name="Wingdings">
+    <w:panose1 w:val="05000000000000000000"/>
+    <w:charset w:val="02"/>
+    <w:family w:val="auto"/>
+    <w:pitch w:val="variable"/>
+    <w:sig w:usb0="00000000" w:usb1="10000000" w:usb2="00000000" w:usb3="00000000" w:csb0="80000000" w:csb1="00000000"/>
+  </w:font>
+  <w:font w:name="Aptos">
+    <w:charset w:val="00"/>
+    <w:family w:val="swiss"/>
+    <w:pitch w:val="variable"/>
+    <w:sig w:usb0="20000287" w:usb1="00000003" w:usb2="00000000" w:usb3="00000000" w:csb0="0000019F" w:csb1="00000000"/>
+  </w:font>
+  <w:font w:name="Arial">
+    <w:panose1 w:val="020B0604020202020204"/>
+    <w:charset w:val="00"/>
+    <w:family w:val="swiss"/>
+    <w:pitch w:val="variable"/>
+    <w:sig w:usb0="E0002EFF" w:usb1="C000785B" w:usb2="00000009" w:usb3="00000000" w:csb0="000001FF" w:csb1="00000000"/>
+  </w:font>
+  <w:font w:name="Aptos Display">
+    <w:charset w:val="00"/>
+    <w:family w:val="swiss"/>
+    <w:pitch w:val="variable"/>
+    <w:sig w:usb0="20000287" w:usb1="00000003" w:usb2="00000000" w:usb3="00000000" w:csb0="0000019F" w:csb1="00000000"/>
+  </w:font>
+  <w:font w:name="Yu Gothic Light">
+    <w:altName w:val="游ゴシック Light"/>
+    <w:panose1 w:val="020B0300000000000000"/>
+    <w:charset w:val="80"/>
+    <w:family w:val="swiss"/>
+    <w:pitch w:val="variable"/>
+    <w:sig w:usb0="E00002FF" w:usb1="2AC7FDFF" w:usb2="00000016" w:usb3="00000000" w:csb0="0002009F" w:csb1="00000000"/>
+  </w:font>
+  <w:font w:name="Yu Gothic">
+    <w:altName w:val="游ゴシック"/>
+    <w:panose1 w:val="020B0400000000000000"/>
+    <w:charset w:val="80"/>
+    <w:family w:val="swiss"/>
+    <w:pitch w:val="variable"/>
+    <w:sig w:usb0="E00002FF" w:usb1="2AC7FDFF" w:usb2="00000016" w:usb3="00000000" w:csb0="0002009F" w:csb1="00000000"/>
+  </w:font>
+</w:fonts>
+</file>
+
+<file path=word/glossary/settings.xml><?xml version="1.0" encoding="utf-8"?>
+<w:settings xmlns:mc="http://schemas.openxmlformats.org/markup-compatibility/2006" xmlns:o="urn:schemas-microsoft-com:office:office" xmlns:r="http://schemas.openxmlformats.org/officeDocument/2006/relationships" xmlns:m="http://schemas.openxmlformats.org/officeDocument/2006/math" xmlns:v="urn:schemas-microsoft-com:vml" xmlns:w10="urn:schemas-microsoft-com:office:word" xmlns:w="http://schemas.openxmlformats.org/wordprocessingml/2006/main" xmlns:w14="http://schemas.microsoft.com/office/word/2010/wordml" xmlns:w15="http://schemas.microsoft.com/office/word/2012/wordml" xmlns:w16cex="http://schemas.microsoft.com/office/word/2018/wordml/cex" xmlns:w16cid="http://schemas.microsoft.com/office/word/2016/wordml/cid" xmlns:w16="http://schemas.microsoft.com/office/word/2018/wordml" xmlns:w16du="http://schemas.microsoft.com/office/word/2023/wordml/word16du" xmlns:w16sdtdh="http://schemas.microsoft.com/office/word/2020/wordml/sdtdatahash" xmlns:w16sdtfl="http://schemas.microsoft.com/office/word/2024/wordml/sdtformatlock" xmlns:w16se="http://schemas.microsoft.com/office/word/2015/wordml/symex" xmlns:sl="http://schemas.openxmlformats.org/schemaLibrary/2006/main" mc:Ignorable="w14 w15 w16se w16cid w16 w16cex w16sdtdh w16sdtfl w16du">
+  <w:view w:val="normal"/>
+  <w:defaultTabStop w:val="720"/>
+  <w:characterSpacingControl w:val="doNotCompress"/>
+  <w:compat>
+    <w:useFELayout/>
+    <w:compatSetting w:name="compatibilityMode" w:uri="http://schemas.microsoft.com/office/word" w:val="15"/>
+    <w:compatSetting w:name="overrideTableStyleFontSizeAndJustification" w:uri="http://schemas.microsoft.com/office/word" w:val="1"/>
+    <w:compatSetting w:name="enableOpenTypeFeatures" w:uri="http://schemas.microsoft.com/office/word" w:val="1"/>
+    <w:compatSetting w:name="doNotFlipMirrorIndents" w:uri="http://schemas.microsoft.com/office/word" w:val="1"/>
+    <w:compatSetting w:name="differentiateMultirowTableHeaders" w:uri="http://schemas.microsoft.com/office/word" w:val="1"/>
+    <w:compatSetting w:name="useWord2013TrackBottomHyphenation" w:uri="http://schemas.microsoft.com/office/word" w:val="0"/>
+  </w:compat>
+  <w:rsids>
+    <w:rsidRoot w:val="00E17AB7"/>
+    <w:rsid w:val="0020251E"/>
+    <w:rsid w:val="00BA35E9"/>
+    <w:rsid w:val="00E17AB7"/>
+  </w:rsids>
+  <m:mathPr>
+    <m:mathFont m:val="Cambria Math"/>
+    <m:brkBin m:val="before"/>
+    <m:brkBinSub m:val="--"/>
+    <m:smallFrac m:val="0"/>
+    <m:dispDef/>
+    <m:lMargin m:val="0"/>
+    <m:rMargin m:val="0"/>
+    <m:defJc m:val="centerGroup"/>
+    <m:wrapIndent m:val="1440"/>
+    <m:intLim m:val="subSup"/>
+    <m:naryLim m:val="undOvr"/>
+  </m:mathPr>
+  <w:themeFontLang w:val="en-GB"/>
+  <w:clrSchemeMapping w:bg1="light1" w:t1="dark1" w:bg2="light2" w:t2="dark2" w:accent1="accent1" w:accent2="accent2" w:accent3="accent3" w:accent4="accent4" w:accent5="accent5" w:accent6="accent6" w:hyperlink="hyperlink" w:followedHyperlink="followedHyperlink"/>
+  <w:decimalSymbol w:val="."/>
+  <w:listSeparator w:val=","/>
+  <w15:chartTrackingRefBased/>
+</w:settings>
+</file>
+
+<file path=word/glossary/styles.xml><?xml version="1.0" encoding="utf-8"?>
+<w:styles xmlns:mc="http://schemas.openxmlformats.org/markup-compatibility/2006" xmlns:r="http://schemas.openxmlformats.org/officeDocument/2006/relationships" xmlns:w="http://schemas.openxmlformats.org/wordprocessingml/2006/main" xmlns:w14="http://schemas.microsoft.com/office/word/2010/wordml" xmlns:w15="http://schemas.microsoft.com/office/word/2012/wordml" xmlns:w16cex="http://schemas.microsoft.com/office/word/2018/wordml/cex" xmlns:w16cid="http://schemas.microsoft.com/office/word/2016/wordml/cid" xmlns:w16="http://schemas.microsoft.com/office/word/2018/wordml" xmlns:w16du="http://schemas.microsoft.com/office/word/2023/wordml/word16du" xmlns:w16sdtdh="http://schemas.microsoft.com/office/word/2020/wordml/sdtdatahash" xmlns:w16sdtfl="http://schemas.microsoft.com/office/word/2024/wordml/sdtformatlock" xmlns:w16se="http://schemas.microsoft.com/office/word/2015/wordml/symex" mc:Ignorable="w14 w15 w16se w16cid w16 w16cex w16sdtdh w16sdtfl w16du">
+  <w:docDefaults>
+    <w:rPrDefault>
+      <w:rPr>
+        <w:rFonts w:asciiTheme="minorHAnsi" w:eastAsiaTheme="minorEastAsia" w:hAnsiTheme="minorHAnsi" w:cstheme="minorBidi"/>
+        <w:kern w:val="2"/>
+        <w:sz w:val="24"/>
+        <w:szCs w:val="24"/>
+        <w:lang w:val="en-GB" w:eastAsia="en-GB" w:bidi="ar-SA"/>
+        <w14:ligatures w14:val="standardContextual"/>
+      </w:rPr>
+    </w:rPrDefault>
+    <w:pPrDefault>
+      <w:pPr>
+        <w:spacing w:after="160" w:line="278" w:lineRule="auto"/>
+      </w:pPr>
+    </w:pPrDefault>
+  </w:docDefaults>
+  <w:latentStyles w:defLockedState="0" w:defUIPriority="99" w:defSemiHidden="0" w:defUnhideWhenUsed="0" w:defQFormat="0" w:count="376">
+    <w:lsdException w:name="Normal" w:uiPriority="0" w:qFormat="1"/>
+    <w:lsdException w:name="heading 1" w:uiPriority="9" w:qFormat="1"/>
+    <w:lsdException w:name="heading 2" w:semiHidden="1" w:uiPriority="9" w:unhideWhenUsed="1" w:qFormat="1"/>
+    <w:lsdException w:name="heading 3" w:semiHidden="1" w:uiPriority="9" w:unhideWhenUsed="1" w:qFormat="1"/>
+    <w:lsdException w:name="heading 4" w:semiHidden="1" w:uiPriority="9" w:unhideWhenUsed="1" w:qFormat="1"/>
+    <w:lsdException w:name="heading 5" w:semiHidden="1" w:uiPriority="9" w:unhideWhenUsed="1" w:qFormat="1"/>
+    <w:lsdException w:name="heading 6" w:semiHidden="1" w:uiPriority="9" w:unhideWhenUsed="1" w:qFormat="1"/>
+    <w:lsdException w:name="heading 7" w:semiHidden="1" w:uiPriority="9" w:unhideWhenUsed="1" w:qFormat="1"/>
+    <w:lsdException w:name="heading 8" w:semiHidden="1" w:uiPriority="9" w:unhideWhenUsed="1" w:qFormat="1"/>
+    <w:lsdException w:name="heading 9" w:semiHidden="1" w:uiPriority="9" w:unhideWhenUsed="1" w:qFormat="1"/>
+    <w:lsdException w:name="index 1" w:semiHidden="1" w:unhideWhenUsed="1"/>
+    <w:lsdException w:name="index 2" w:semiHidden="1" w:unhideWhenUsed="1"/>
+    <w:lsdException w:name="index 3" w:semiHidden="1" w:unhideWhenUsed="1"/>
+    <w:lsdException w:name="index 4" w:semiHidden="1" w:unhideWhenUsed="1"/>
+    <w:lsdException w:name="index 5" w:semiHidden="1" w:unhideWhenUsed="1"/>
+    <w:lsdException w:name="index 6" w:semiHidden="1" w:unhideWhenUsed="1"/>
+    <w:lsdException w:name="index 7" w:semiHidden="1" w:unhideWhenUsed="1"/>
+    <w:lsdException w:name="index 8" w:semiHidden="1" w:unhideWhenUsed="1"/>
+    <w:lsdException w:name="index 9" w:semiHidden="1" w:unhideWhenUsed="1"/>
+    <w:lsdException w:name="toc 1" w:semiHidden="1" w:uiPriority="39" w:unhideWhenUsed="1"/>
+    <w:lsdException w:name="toc 2" w:semiHidden="1" w:uiPriority="39" w:unhideWhenUsed="1"/>
+    <w:lsdException w:name="toc 3" w:semiHidden="1" w:uiPriority="39" w:unhideWhenUsed="1"/>
+    <w:lsdException w:name="toc 4" w:semiHidden="1" w:uiPriority="39" w:unhideWhenUsed="1"/>
+    <w:lsdException w:name="toc 5" w:semiHidden="1" w:uiPriority="39" w:unhideWhenUsed="1"/>
+    <w:lsdException w:name="toc 6" w:semiHidden="1" w:uiPriority="39" w:unhideWhenUsed="1"/>
+    <w:lsdException w:name="toc 7" w:semiHidden="1" w:uiPriority="39" w:unhideWhenUsed="1"/>
+    <w:lsdException w:name="toc 8" w:semiHidden="1" w:uiPriority="39" w:unhideWhenUsed="1"/>
+    <w:lsdException w:name="toc 9" w:semiHidden="1" w:uiPriority="39" w:unhideWhenUsed="1"/>
+    <w:lsdException w:name="Normal Indent" w:semiHidden="1" w:unhideWhenUsed="1"/>
+    <w:lsdException w:name="footnote text" w:semiHidden="1" w:unhideWhenUsed="1"/>
+    <w:lsdException w:name="annotation text" w:semiHidden="1" w:unhideWhenUsed="1"/>
+    <w:lsdException w:name="header" w:semiHidden="1" w:unhideWhenUsed="1"/>
+    <w:lsdException w:name="footer" w:semiHidden="1" w:unhideWhenUsed="1"/>
+    <w:lsdException w:name="index heading" w:semiHidden="1" w:unhideWhenUsed="1"/>
+    <w:lsdException w:name="caption" w:semiHidden="1" w:uiPriority="35" w:unhideWhenUsed="1" w:qFormat="1"/>
+    <w:lsdException w:name="table of figures" w:semiHidden="1" w:unhideWhenUsed="1"/>
+    <w:lsdException w:name="envelope address" w:semiHidden="1" w:unhideWhenUsed="1"/>
+    <w:lsdException w:name="envelope return" w:semiHidden="1" w:unhideWhenUsed="1"/>
+    <w:lsdException w:name="footnote reference" w:semiHidden="1" w:unhideWhenUsed="1"/>
+    <w:lsdException w:name="annotation reference" w:semiHidden="1" w:unhideWhenUsed="1"/>
+    <w:lsdException w:name="line number" w:semiHidden="1" w:unhideWhenUsed="1"/>
+    <w:lsdException w:name="page number" w:semiHidden="1" w:unhideWhenUsed="1"/>
+    <w:lsdException w:name="endnote reference" w:semiHidden="1" w:unhideWhenUsed="1"/>
+    <w:lsdException w:name="endnote text" w:semiHidden="1" w:unhideWhenUsed="1"/>
+    <w:lsdException w:name="table of authorities" w:semiHidden="1" w:unhideWhenUsed="1"/>
+    <w:lsdException w:name="macro" w:semiHidden="1" w:unhideWhenUsed="1"/>
+    <w:lsdException w:name="toa heading" w:semiHidden="1" w:unhideWhenUsed="1"/>
+    <w:lsdException w:name="List" w:semiHidden="1" w:unhideWhenUsed="1"/>
+    <w:lsdException w:name="List Bullet" w:semiHidden="1" w:unhideWhenUsed="1"/>
+    <w:lsdException w:name="List Number" w:semiHidden="1" w:unhideWhenUsed="1"/>
+    <w:lsdException w:name="List 2" w:semiHidden="1" w:unhideWhenUsed="1"/>
+    <w:lsdException w:name="List 3" w:semiHidden="1" w:unhideWhenUsed="1"/>
+    <w:lsdException w:name="List 4" w:semiHidden="1" w:unhideWhenUsed="1"/>
+    <w:lsdException w:name="List 5" w:semiHidden="1" w:unhideWhenUsed="1"/>
+    <w:lsdException w:name="List Bullet 2" w:semiHidden="1" w:unhideWhenUsed="1"/>
+    <w:lsdException w:name="List Bullet 3" w:semiHidden="1" w:unhideWhenUsed="1"/>
+    <w:lsdException w:name="List Bullet 4" w:semiHidden="1" w:unhideWhenUsed="1"/>
+    <w:lsdException w:name="List Bullet 5" w:semiHidden="1" w:unhideWhenUsed="1"/>
+    <w:lsdException w:name="List Number 2" w:semiHidden="1" w:unhideWhenUsed="1"/>
+    <w:lsdException w:name="List Number 3" w:semiHidden="1" w:unhideWhenUsed="1"/>
+    <w:lsdException w:name="List Number 4" w:semiHidden="1" w:unhideWhenUsed="1"/>
+    <w:lsdException w:name="List Number 5" w:semiHidden="1" w:unhideWhenUsed="1"/>
+    <w:lsdException w:name="Title" w:uiPriority="10" w:qFormat="1"/>
+    <w:lsdException w:name="Closing" w:semiHidden="1" w:unhideWhenUsed="1"/>
+    <w:lsdException w:name="Signature" w:semiHidden="1" w:unhideWhenUsed="1"/>
+    <w:lsdException w:name="Default Paragraph Font" w:semiHidden="1" w:uiPriority="1" w:unhideWhenUsed="1"/>
+    <w:lsdException w:name="Body Text" w:semiHidden="1" w:unhideWhenUsed="1"/>
+    <w:lsdException w:name="Body Text Indent" w:semiHidden="1" w:unhideWhenUsed="1"/>
+    <w:lsdException w:name="List Continue" w:semiHidden="1" w:unhideWhenUsed="1"/>
+    <w:lsdException w:name="List Continue 2" w:semiHidden="1" w:unhideWhenUsed="1"/>
+    <w:lsdException w:name="List Continue 3" w:semiHidden="1" w:unhideWhenUsed="1"/>
+    <w:lsdException w:name="List Continue 4" w:semiHidden="1" w:unhideWhenUsed="1"/>
+    <w:lsdException w:name="List Continue 5" w:semiHidden="1" w:unhideWhenUsed="1"/>
+    <w:lsdException w:name="Message Header" w:semiHidden="1" w:unhideWhenUsed="1"/>
+    <w:lsdException w:name="Subtitle" w:uiPriority="11" w:qFormat="1"/>
+    <w:lsdException w:name="Salutation" w:semiHidden="1" w:unhideWhenUsed="1"/>
+    <w:lsdException w:name="Date" w:semiHidden="1" w:unhideWhenUsed="1"/>
+    <w:lsdException w:name="Body Text First Indent" w:semiHidden="1" w:unhideWhenUsed="1"/>
+    <w:lsdException w:name="Body Text First Indent 2" w:semiHidden="1" w:unhideWhenUsed="1"/>
+    <w:lsdException w:name="Note Heading" w:semiHidden="1" w:unhideWhenUsed="1"/>
+    <w:lsdException w:name="Body Text 2" w:semiHidden="1" w:unhideWhenUsed="1"/>
+    <w:lsdException w:name="Body Text 3" w:semiHidden="1" w:unhideWhenUsed="1"/>
+    <w:lsdException w:name="Body Text Indent 2" w:semiHidden="1" w:unhideWhenUsed="1"/>
+    <w:lsdException w:name="Body Text Indent 3" w:semiHidden="1" w:unhideWhenUsed="1"/>
+    <w:lsdException w:name="Block Text" w:semiHidden="1" w:unhideWhenUsed="1"/>
+    <w:lsdException w:name="Hyperlink" w:semiHidden="1" w:unhideWhenUsed="1"/>
+    <w:lsdException w:name="FollowedHyperlink" w:semiHidden="1" w:unhideWhenUsed="1"/>
+    <w:lsdException w:name="Strong" w:uiPriority="22" w:qFormat="1"/>
+    <w:lsdException w:name="Emphasis" w:uiPriority="20" w:qFormat="1"/>
+    <w:lsdException w:name="Document Map" w:semiHidden="1" w:unhideWhenUsed="1"/>
+    <w:lsdException w:name="Plain Text" w:semiHidden="1" w:unhideWhenUsed="1"/>
+    <w:lsdException w:name="E-mail Signature" w:semiHidden="1" w:unhideWhenUsed="1"/>
+    <w:lsdException w:name="HTML Top of Form" w:semiHidden="1" w:unhideWhenUsed="1"/>
+    <w:lsdException w:name="HTML Bottom of Form" w:semiHidden="1" w:unhideWhenUsed="1"/>
+    <w:lsdException w:name="Normal (Web)" w:semiHidden="1" w:unhideWhenUsed="1"/>
+    <w:lsdException w:name="HTML Acronym" w:semiHidden="1" w:unhideWhenUsed="1"/>
+    <w:lsdException w:name="HTML Address" w:semiHidden="1" w:unhideWhenUsed="1"/>
+    <w:lsdException w:name="HTML Cite" w:semiHidden="1" w:unhideWhenUsed="1"/>
+    <w:lsdException w:name="HTML Code" w:semiHidden="1" w:unhideWhenUsed="1"/>
+    <w:lsdException w:name="HTML Definition" w:semiHidden="1" w:unhideWhenUsed="1"/>
+    <w:lsdException w:name="HTML Keyboard" w:semiHidden="1" w:unhideWhenUsed="1"/>
+    <w:lsdException w:name="HTML Preformatted" w:semiHidden="1" w:unhideWhenUsed="1"/>
+    <w:lsdException w:name="HTML Sample" w:semiHidden="1" w:unhideWhenUsed="1"/>
+    <w:lsdException w:name="HTML Typewriter" w:semiHidden="1" w:unhideWhenUsed="1"/>
+    <w:lsdException w:name="HTML Variable" w:semiHidden="1" w:unhideWhenUsed="1"/>
+    <w:lsdException w:name="Normal Table" w:semiHidden="1" w:unhideWhenUsed="1"/>
+    <w:lsdException w:name="annotation subject" w:semiHidden="1" w:unhideWhenUsed="1"/>
+    <w:lsdException w:name="No List" w:semiHidden="1" w:unhideWhenUsed="1"/>
+    <w:lsdException w:name="Outline List 1" w:semiHidden="1" w:unhideWhenUsed="1"/>
+    <w:lsdException w:name="Outline List 2" w:semiHidden="1" w:unhideWhenUsed="1"/>
+    <w:lsdException w:name="Outline List 3" w:semiHidden="1" w:unhideWhenUsed="1"/>
+    <w:lsdException w:name="Table Simple 1" w:semiHidden="1" w:unhideWhenUsed="1"/>
+    <w:lsdException w:name="Table Simple 2" w:semiHidden="1" w:unhideWhenUsed="1"/>
+    <w:lsdException w:name="Table Simple 3" w:semiHidden="1" w:unhideWhenUsed="1"/>
+    <w:lsdException w:name="Table Classic 1" w:semiHidden="1" w:unhideWhenUsed="1"/>
+    <w:lsdException w:name="Table Classic 2" w:semiHidden="1" w:unhideWhenUsed="1"/>
+    <w:lsdException w:name="Table Classic 3" w:semiHidden="1" w:unhideWhenUsed="1"/>
+    <w:lsdException w:name="Table Classic 4" w:semiHidden="1" w:unhideWhenUsed="1"/>
+    <w:lsdException w:name="Table Colorful 1" w:semiHidden="1" w:unhideWhenUsed="1"/>
+    <w:lsdException w:name="Table Colorful 2" w:semiHidden="1" w:unhideWhenUsed="1"/>
+    <w:lsdException w:name="Table Colorful 3" w:semiHidden="1" w:unhideWhenUsed="1"/>
+    <w:lsdException w:name="Table Columns 1" w:semiHidden="1" w:unhideWhenUsed="1"/>
+    <w:lsdException w:name="Table Columns 2" w:semiHidden="1" w:unhideWhenUsed="1"/>
+    <w:lsdException w:name="Table Columns 3" w:semiHidden="1" w:unhideWhenUsed="1"/>
+    <w:lsdException w:name="Table Columns 4" w:semiHidden="1" w:unhideWhenUsed="1"/>
+    <w:lsdException w:name="Table Columns 5" w:semiHidden="1" w:unhideWhenUsed="1"/>
+    <w:lsdException w:name="Table Grid 1" w:semiHidden="1" w:unhideWhenUsed="1"/>
+    <w:lsdException w:name="Table Grid 2" w:semiHidden="1" w:unhideWhenUsed="1"/>
+    <w:lsdException w:name="Table Grid 3" w:semiHidden="1" w:unhideWhenUsed="1"/>
+    <w:lsdException w:name="Table Grid 4" w:semiHidden="1" w:unhideWhenUsed="1"/>
+    <w:lsdException w:name="Table Grid 5" w:semiHidden="1" w:unhideWhenUsed="1"/>
+    <w:lsdException w:name="Table Grid 6" w:semiHidden="1" w:unhideWhenUsed="1"/>
+    <w:lsdException w:name="Table Grid 7" w:semiHidden="1" w:unhideWhenUsed="1"/>
+    <w:lsdException w:name="Table Grid 8" w:semiHidden="1" w:unhideWhenUsed="1"/>
+    <w:lsdException w:name="Table List 1" w:semiHidden="1" w:unhideWhenUsed="1"/>
+    <w:lsdException w:name="Table List 2" w:semiHidden="1" w:unhideWhenUsed="1"/>
+    <w:lsdException w:name="Table List 3" w:semiHidden="1" w:unhideWhenUsed="1"/>
+    <w:lsdException w:name="Table List 4" w:semiHidden="1" w:unhideWhenUsed="1"/>
+    <w:lsdException w:name="Table List 5" w:semiHidden="1" w:unhideWhenUsed="1"/>
+    <w:lsdException w:name="Table List 6" w:semiHidden="1" w:unhideWhenUsed="1"/>
+    <w:lsdException w:name="Table List 7" w:semiHidden="1" w:unhideWhenUsed="1"/>
+    <w:lsdException w:name="Table List 8" w:semiHidden="1" w:unhideWhenUsed="1"/>
+    <w:lsdException w:name="Table 3D effects 1" w:semiHidden="1" w:unhideWhenUsed="1"/>
+    <w:lsdException w:name="Table 3D effects 2" w:semiHidden="1" w:unhideWhenUsed="1"/>
+    <w:lsdException w:name="Table 3D effects 3" w:semiHidden="1" w:unhideWhenUsed="1"/>
+    <w:lsdException w:name="Table Contemporary" w:semiHidden="1" w:unhideWhenUsed="1"/>
+    <w:lsdException w:name="Table Elegant" w:semiHidden="1" w:unhideWhenUsed="1"/>
+    <w:lsdException w:name="Table Professional" w:semiHidden="1" w:unhideWhenUsed="1"/>
+    <w:lsdException w:name="Table Subtle 1" w:semiHidden="1" w:unhideWhenUsed="1"/>
+    <w:lsdException w:name="Table Subtle 2" w:semiHidden="1" w:unhideWhenUsed="1"/>
+    <w:lsdException w:name="Table Web 1" w:semiHidden="1" w:unhideWhenUsed="1"/>
+    <w:lsdException w:name="Table Web 2" w:semiHidden="1" w:unhideWhenUsed="1"/>
+    <w:lsdException w:name="Table Web 3" w:semiHidden="1" w:unhideWhenUsed="1"/>
+    <w:lsdException w:name="Balloon Text" w:semiHidden="1" w:unhideWhenUsed="1"/>
+    <w:lsdException w:name="Table Grid" w:uiPriority="39"/>
+    <w:lsdException w:name="Table Theme" w:semiHidden="1" w:unhideWhenUsed="1"/>
+    <w:lsdException w:name="Placeholder Text" w:semiHidden="1"/>
+    <w:lsdException w:name="No Spacing" w:uiPriority="1" w:qFormat="1"/>
+    <w:lsdException w:name="Light Shading" w:uiPriority="60"/>
+    <w:lsdException w:name="Light List" w:uiPriority="61"/>
+    <w:lsdException w:name="Light Grid" w:uiPriority="62"/>
+    <w:lsdException w:name="Medium Shading 1" w:uiPriority="63"/>
+    <w:lsdException w:name="Medium Shading 2" w:uiPriority="64"/>
+    <w:lsdException w:name="Medium List 1" w:uiPriority="65"/>
+    <w:lsdException w:name="Medium List 2" w:uiPriority="66"/>
+    <w:lsdException w:name="Medium Grid 1" w:uiPriority="67"/>
+    <w:lsdException w:name="Medium Grid 2" w:uiPriority="68"/>
+    <w:lsdException w:name="Medium Grid 3" w:uiPriority="69"/>
+    <w:lsdException w:name="Dark List" w:uiPriority="70"/>
+    <w:lsdException w:name="Colorful Shading" w:uiPriority="71"/>
+    <w:lsdException w:name="Colorful List" w:uiPriority="72"/>
+    <w:lsdException w:name="Colorful Grid" w:uiPriority="73"/>
+    <w:lsdException w:name="Light Shading Accent 1" w:uiPriority="60"/>
+    <w:lsdException w:name="Light List Accent 1" w:uiPriority="61"/>
+    <w:lsdException w:name="Light Grid Accent 1" w:uiPriority="62"/>
+    <w:lsdException w:name="Medium Shading 1 Accent 1" w:uiPriority="63"/>
+    <w:lsdException w:name="Medium Shading 2 Accent 1" w:uiPriority="64"/>
+    <w:lsdException w:name="Medium List 1 Accent 1" w:uiPriority="65"/>
+    <w:lsdException w:name="Revision" w:semiHidden="1"/>
+    <w:lsdException w:name="List Paragraph" w:uiPriority="34" w:qFormat="1"/>
+    <w:lsdException w:name="Quote" w:uiPriority="29" w:qFormat="1"/>
+    <w:lsdException w:name="Intense Quote" w:uiPriority="30" w:qFormat="1"/>
+    <w:lsdException w:name="Medium List 2 Accent 1" w:uiPriority="66"/>
+    <w:lsdException w:name="Medium Grid 1 Accent 1" w:uiPriority="67"/>
+    <w:lsdException w:name="Medium Grid 2 Accent 1" w:uiPriority="68"/>
+    <w:lsdException w:name="Medium Grid 3 Accent 1" w:uiPriority="69"/>
+    <w:lsdException w:name="Dark List Accent 1" w:uiPriority="70"/>
+    <w:lsdException w:name="Colorful Shading Accent 1" w:uiPriority="71"/>
+    <w:lsdException w:name="Colorful List Accent 1" w:uiPriority="72"/>
+    <w:lsdException w:name="Colorful Grid Accent 1" w:uiPriority="73"/>
+    <w:lsdException w:name="Light Shading Accent 2" w:uiPriority="60"/>
+    <w:lsdException w:name="Light List Accent 2" w:uiPriority="61"/>
+    <w:lsdException w:name="Light Grid Accent 2" w:uiPriority="62"/>
+    <w:lsdException w:name="Medium Shading 1 Accent 2" w:uiPriority="63"/>
+    <w:lsdException w:name="Medium Shading 2 Accent 2" w:uiPriority="64"/>
+    <w:lsdException w:name="Medium List 1 Accent 2" w:uiPriority="65"/>
+    <w:lsdException w:name="Medium List 2 Accent 2" w:uiPriority="66"/>
+    <w:lsdException w:name="Medium Grid 1 Accent 2" w:uiPriority="67"/>
+    <w:lsdException w:name="Medium Grid 2 Accent 2" w:uiPriority="68"/>
+    <w:lsdException w:name="Medium Grid 3 Accent 2" w:uiPriority="69"/>
+    <w:lsdException w:name="Dark List Accent 2" w:uiPriority="70"/>
+    <w:lsdException w:name="Colorful Shading Accent 2" w:uiPriority="71"/>
+    <w:lsdException w:name="Colorful List Accent 2" w:uiPriority="72"/>
+    <w:lsdException w:name="Colorful Grid Accent 2" w:uiPriority="73"/>
+    <w:lsdException w:name="Light Shading Accent 3" w:uiPriority="60"/>
+    <w:lsdException w:name="Light List Accent 3" w:uiPriority="61"/>
+    <w:lsdException w:name="Light Grid Accent 3" w:uiPriority="62"/>
+    <w:lsdException w:name="Medium Shading 1 Accent 3" w:uiPriority="63"/>
+    <w:lsdException w:name="Medium Shading 2 Accent 3" w:uiPriority="64"/>
+    <w:lsdException w:name="Medium List 1 Accent 3" w:uiPriority="65"/>
+    <w:lsdException w:name="Medium List 2 Accent 3" w:uiPriority="66"/>
+    <w:lsdException w:name="Medium Grid 1 Accent 3" w:uiPriority="67"/>
+    <w:lsdException w:name="Medium Grid 2 Accent 3" w:uiPriority="68"/>
+    <w:lsdException w:name="Medium Grid 3 Accent 3" w:uiPriority="69"/>
+    <w:lsdException w:name="Dark List Accent 3" w:uiPriority="70"/>
+    <w:lsdException w:name="Colorful Shading Accent 3" w:uiPriority="71"/>
+    <w:lsdException w:name="Colorful List Accent 3" w:uiPriority="72"/>
+    <w:lsdException w:name="Colorful Grid Accent 3" w:uiPriority="73"/>
+    <w:lsdException w:name="Light Shading Accent 4" w:uiPriority="60"/>
+    <w:lsdException w:name="Light List Accent 4" w:uiPriority="61"/>
+    <w:lsdException w:name="Light Grid Accent 4" w:uiPriority="62"/>
+    <w:lsdException w:name="Medium Shading 1 Accent 4" w:uiPriority="63"/>
+    <w:lsdException w:name="Medium Shading 2 Accent 4" w:uiPriority="64"/>
+    <w:lsdException w:name="Medium List 1 Accent 4" w:uiPriority="65"/>
+    <w:lsdException w:name="Medium List 2 Accent 4" w:uiPriority="66"/>
+    <w:lsdException w:name="Medium Grid 1 Accent 4" w:uiPriority="67"/>
+    <w:lsdException w:name="Medium Grid 2 Accent 4" w:uiPriority="68"/>
+    <w:lsdException w:name="Medium Grid 3 Accent 4" w:uiPriority="69"/>
+    <w:lsdException w:name="Dark List Accent 4" w:uiPriority="70"/>
+    <w:lsdException w:name="Colorful Shading Accent 4" w:uiPriority="71"/>
+    <w:lsdException w:name="Colorful List Accent 4" w:uiPriority="72"/>
+    <w:lsdException w:name="Colorful Grid Accent 4" w:uiPriority="73"/>
+    <w:lsdException w:name="Light Shading Accent 5" w:uiPriority="60"/>
+    <w:lsdException w:name="Light List Accent 5" w:uiPriority="61"/>
+    <w:lsdException w:name="Light Grid Accent 5" w:uiPriority="62"/>
+    <w:lsdException w:name="Medium Shading 1 Accent 5" w:uiPriority="63"/>
+    <w:lsdException w:name="Medium Shading 2 Accent 5" w:uiPriority="64"/>
+    <w:lsdException w:name="Medium List 1 Accent 5" w:uiPriority="65"/>
+    <w:lsdException w:name="Medium List 2 Accent 5" w:uiPriority="66"/>
+    <w:lsdException w:name="Medium Grid 1 Accent 5" w:uiPriority="67"/>
+    <w:lsdException w:name="Medium Grid 2 Accent 5" w:uiPriority="68"/>
+    <w:lsdException w:name="Medium Grid 3 Accent 5" w:uiPriority="69"/>
+    <w:lsdException w:name="Dark List Accent 5" w:uiPriority="70"/>
+    <w:lsdException w:name="Colorful Shading Accent 5" w:uiPriority="71"/>
+    <w:lsdException w:name="Colorful List Accent 5" w:uiPriority="72"/>
+    <w:lsdException w:name="Colorful Grid Accent 5" w:uiPriority="73"/>
+    <w:lsdException w:name="Light Shading Accent 6" w:uiPriority="60"/>
+    <w:lsdException w:name="Light List Accent 6" w:uiPriority="61"/>
+    <w:lsdException w:name="Light Grid Accent 6" w:uiPriority="62"/>
+    <w:lsdException w:name="Medium Shading 1 Accent 6" w:uiPriority="63"/>
+    <w:lsdException w:name="Medium Shading 2 Accent 6" w:uiPriority="64"/>
+    <w:lsdException w:name="Medium List 1 Accent 6" w:uiPriority="65"/>
+    <w:lsdException w:name="Medium List 2 Accent 6" w:uiPriority="66"/>
+    <w:lsdException w:name="Medium Grid 1 Accent 6" w:uiPriority="67"/>
+    <w:lsdException w:name="Medium Grid 2 Accent 6" w:uiPriority="68"/>
+    <w:lsdException w:name="Medium Grid 3 Accent 6" w:uiPriority="69"/>
+    <w:lsdException w:name="Dark List Accent 6" w:uiPriority="70"/>
+    <w:lsdException w:name="Colorful Shading Accent 6" w:uiPriority="71"/>
+    <w:lsdException w:name="Colorful List Accent 6" w:uiPriority="72"/>
+    <w:lsdException w:name="Colorful Grid Accent 6" w:uiPriority="73"/>
+    <w:lsdException w:name="Subtle Emphasis" w:uiPriority="19" w:qFormat="1"/>
+    <w:lsdException w:name="Intense Emphasis" w:uiPriority="21" w:qFormat="1"/>
+    <w:lsdException w:name="Subtle Reference" w:uiPriority="31" w:qFormat="1"/>
+    <w:lsdException w:name="Intense Reference" w:uiPriority="32" w:qFormat="1"/>
+    <w:lsdException w:name="Book Title" w:uiPriority="33" w:qFormat="1"/>
+    <w:lsdException w:name="Bibliography" w:semiHidden="1" w:uiPriority="37" w:unhideWhenUsed="1"/>
+    <w:lsdException w:name="TOC Heading" w:semiHidden="1" w:uiPriority="39" w:unhideWhenUsed="1" w:qFormat="1"/>
+    <w:lsdException w:name="Plain Table 1" w:uiPriority="41"/>
+    <w:lsdException w:name="Plain Table 2" w:uiPriority="42"/>
+    <w:lsdException w:name="Plain Table 3" w:uiPriority="43"/>
+    <w:lsdException w:name="Plain Table 4" w:uiPriority="44"/>
+    <w:lsdException w:name="Plain Table 5" w:uiPriority="45"/>
+    <w:lsdException w:name="Grid Table Light" w:uiPriority="40"/>
+    <w:lsdException w:name="Grid Table 1 Light" w:uiPriority="46"/>
+    <w:lsdException w:name="Grid Table 2" w:uiPriority="47"/>
+    <w:lsdException w:name="Grid Table 3" w:uiPriority="48"/>
+    <w:lsdException w:name="Grid Table 4" w:uiPriority="49"/>
+    <w:lsdException w:name="Grid Table 5 Dark" w:uiPriority="50"/>
+    <w:lsdException w:name="Grid Table 6 Colorful" w:uiPriority="51"/>
+    <w:lsdException w:name="Grid Table 7 Colorful" w:uiPriority="52"/>
+    <w:lsdException w:name="Grid Table 1 Light Accent 1" w:uiPriority="46"/>
+    <w:lsdException w:name="Grid Table 2 Accent 1" w:uiPriority="47"/>
+    <w:lsdException w:name="Grid Table 3 Accent 1" w:uiPriority="48"/>
+    <w:lsdException w:name="Grid Table 4 Accent 1" w:uiPriority="49"/>
+    <w:lsdException w:name="Grid Table 5 Dark Accent 1" w:uiPriority="50"/>
+    <w:lsdException w:name="Grid Table 6 Colorful Accent 1" w:uiPriority="51"/>
+    <w:lsdException w:name="Grid Table 7 Colorful Accent 1" w:uiPriority="52"/>
+    <w:lsdException w:name="Grid Table 1 Light Accent 2" w:uiPriority="46"/>
+    <w:lsdException w:name="Grid Table 2 Accent 2" w:uiPriority="47"/>
+    <w:lsdException w:name="Grid Table 3 Accent 2" w:uiPriority="48"/>
+    <w:lsdException w:name="Grid Table 4 Accent 2" w:uiPriority="49"/>
+    <w:lsdException w:name="Grid Table 5 Dark Accent 2" w:uiPriority="50"/>
+    <w:lsdException w:name="Grid Table 6 Colorful Accent 2" w:uiPriority="51"/>
+    <w:lsdException w:name="Grid Table 7 Colorful Accent 2" w:uiPriority="52"/>
+    <w:lsdException w:name="Grid Table 1 Light Accent 3" w:uiPriority="46"/>
+    <w:lsdException w:name="Grid Table 2 Accent 3" w:uiPriority="47"/>
+    <w:lsdException w:name="Grid Table 3 Accent 3" w:uiPriority="48"/>
+    <w:lsdException w:name="Grid Table 4 Accent 3" w:uiPriority="49"/>
+    <w:lsdException w:name="Grid Table 5 Dark Accent 3" w:uiPriority="50"/>
+    <w:lsdException w:name="Grid Table 6 Colorful Accent 3" w:uiPriority="51"/>
+    <w:lsdException w:name="Grid Table 7 Colorful Accent 3" w:uiPriority="52"/>
+    <w:lsdException w:name="Grid Table 1 Light Accent 4" w:uiPriority="46"/>
+    <w:lsdException w:name="Grid Table 2 Accent 4" w:uiPriority="47"/>
+    <w:lsdException w:name="Grid Table 3 Accent 4" w:uiPriority="48"/>
+    <w:lsdException w:name="Grid Table 4 Accent 4" w:uiPriority="49"/>
+    <w:lsdException w:name="Grid Table 5 Dark Accent 4" w:uiPriority="50"/>
+    <w:lsdException w:name="Grid Table 6 Colorful Accent 4" w:uiPriority="51"/>
+    <w:lsdException w:name="Grid Table 7 Colorful Accent 4" w:uiPriority="52"/>
+    <w:lsdException w:name="Grid Table 1 Light Accent 5" w:uiPriority="46"/>
+    <w:lsdException w:name="Grid Table 2 Accent 5" w:uiPriority="47"/>
+    <w:lsdException w:name="Grid Table 3 Accent 5" w:uiPriority="48"/>
+    <w:lsdException w:name="Grid Table 4 Accent 5" w:uiPriority="49"/>
+    <w:lsdException w:name="Grid Table 5 Dark Accent 5" w:uiPriority="50"/>
+    <w:lsdException w:name="Grid Table 6 Colorful Accent 5" w:uiPriority="51"/>
+    <w:lsdException w:name="Grid Table 7 Colorful Accent 5" w:uiPriority="52"/>
+    <w:lsdException w:name="Grid Table 1 Light Accent 6" w:uiPriority="46"/>
+    <w:lsdException w:name="Grid Table 2 Accent 6" w:uiPriority="47"/>
+    <w:lsdException w:name="Grid Table 3 Accent 6" w:uiPriority="48"/>
+    <w:lsdException w:name="Grid Table 4 Accent 6" w:uiPriority="49"/>
+    <w:lsdException w:name="Grid Table 5 Dark Accent 6" w:uiPriority="50"/>
+    <w:lsdException w:name="Grid Table 6 Colorful Accent 6" w:uiPriority="51"/>
+    <w:lsdException w:name="Grid Table 7 Colorful Accent 6" w:uiPriority="52"/>
+    <w:lsdException w:name="List Table 1 Light" w:uiPriority="46"/>
+    <w:lsdException w:name="List Table 2" w:uiPriority="47"/>
+    <w:lsdException w:name="List Table 3" w:uiPriority="48"/>
+    <w:lsdException w:name="List Table 4" w:uiPriority="49"/>
+    <w:lsdException w:name="List Table 5 Dark" w:uiPriority="50"/>
+    <w:lsdException w:name="List Table 6 Colorful" w:uiPriority="51"/>
+    <w:lsdException w:name="List Table 7 Colorful" w:uiPriority="52"/>
+    <w:lsdException w:name="List Table 1 Light Accent 1" w:uiPriority="46"/>
+    <w:lsdException w:name="List Table 2 Accent 1" w:uiPriority="47"/>
+    <w:lsdException w:name="List Table 3 Accent 1" w:uiPriority="48"/>
+    <w:lsdException w:name="List Table 4 Accent 1" w:uiPriority="49"/>
+    <w:lsdException w:name="List Table 5 Dark Accent 1" w:uiPriority="50"/>
+    <w:lsdException w:name="List Table 6 Colorful Accent 1" w:uiPriority="51"/>
+    <w:lsdException w:name="List Table 7 Colorful Accent 1" w:uiPriority="52"/>
+    <w:lsdException w:name="List Table 1 Light Accent 2" w:uiPriority="46"/>
+    <w:lsdException w:name="List Table 2 Accent 2" w:uiPriority="47"/>
+    <w:lsdException w:name="List Table 3 Accent 2" w:uiPriority="48"/>
+    <w:lsdException w:name="List Table 4 Accent 2" w:uiPriority="49"/>
+    <w:lsdException w:name="List Table 5 Dark Accent 2" w:uiPriority="50"/>
+    <w:lsdException w:name="List Table 6 Colorful Accent 2" w:uiPriority="51"/>
+    <w:lsdException w:name="List Table 7 Colorful Accent 2" w:uiPriority="52"/>
+    <w:lsdException w:name="List Table 1 Light Accent 3" w:uiPriority="46"/>
+    <w:lsdException w:name="List Table 2 Accent 3" w:uiPriority="47"/>
+    <w:lsdException w:name="List Table 3 Accent 3" w:uiPriority="48"/>
+    <w:lsdException w:name="List Table 4 Accent 3" w:uiPriority="49"/>
+    <w:lsdException w:name="List Table 5 Dark Accent 3" w:uiPriority="50"/>
+    <w:lsdException w:name="List Table 6 Colorful Accent 3" w:uiPriority="51"/>
+    <w:lsdException w:name="List Table 7 Colorful Accent 3" w:uiPriority="52"/>
+    <w:lsdException w:name="List Table 1 Light Accent 4" w:uiPriority="46"/>
+    <w:lsdException w:name="List Table 2 Accent 4" w:uiPriority="47"/>
+    <w:lsdException w:name="List Table 3 Accent 4" w:uiPriority="48"/>
+    <w:lsdException w:name="List Table 4 Accent 4" w:uiPriority="49"/>
+    <w:lsdException w:name="List Table 5 Dark Accent 4" w:uiPriority="50"/>
+    <w:lsdException w:name="List Table 6 Colorful Accent 4" w:uiPriority="51"/>
+    <w:lsdException w:name="List Table 7 Colorful Accent 4" w:uiPriority="52"/>
+    <w:lsdException w:name="List Table 1 Light Accent 5" w:uiPriority="46"/>
+    <w:lsdException w:name="List Table 2 Accent 5" w:uiPriority="47"/>
+    <w:lsdException w:name="List Table 3 Accent 5" w:uiPriority="48"/>
+    <w:lsdException w:name="List Table 4 Accent 5" w:uiPriority="49"/>
+    <w:lsdException w:name="List Table 5 Dark Accent 5" w:uiPriority="50"/>
+    <w:lsdException w:name="List Table 6 Colorful Accent 5" w:uiPriority="51"/>
+    <w:lsdException w:name="List Table 7 Colorful Accent 5" w:uiPriority="52"/>
+    <w:lsdException w:name="List Table 1 Light Accent 6" w:uiPriority="46"/>
+    <w:lsdException w:name="List Table 2 Accent 6" w:uiPriority="47"/>
+    <w:lsdException w:name="List Table 3 Accent 6" w:uiPriority="48"/>
+    <w:lsdException w:name="List Table 4 Accent 6" w:uiPriority="49"/>
+    <w:lsdException w:name="List Table 5 Dark Accent 6" w:uiPriority="50"/>
+    <w:lsdException w:name="List Table 6 Colorful Accent 6" w:uiPriority="51"/>
+    <w:lsdException w:name="List Table 7 Colorful Accent 6" w:uiPriority="52"/>
+    <w:lsdException w:name="Mention" w:semiHidden="1" w:unhideWhenUsed="1"/>
+    <w:lsdException w:name="Smart Hyperlink" w:semiHidden="1" w:unhideWhenUsed="1"/>
+    <w:lsdException w:name="Hashtag" w:semiHidden="1" w:unhideWhenUsed="1"/>
+    <w:lsdException w:name="Unresolved Mention" w:semiHidden="1" w:unhideWhenUsed="1"/>
+    <w:lsdException w:name="Smart Link" w:semiHidden="1" w:unhideWhenUsed="1"/>
+  </w:latentStyles>
+  <w:style w:type="paragraph" w:default="1" w:styleId="Normal">
+    <w:name w:val="Normal"/>
+    <w:qFormat/>
+  </w:style>
+  <w:style w:type="character" w:default="1" w:styleId="DefaultParagraphFont">
+    <w:name w:val="Default Paragraph Font"/>
+    <w:uiPriority w:val="1"/>
+    <w:semiHidden/>
+    <w:unhideWhenUsed/>
+  </w:style>
+  <w:style w:type="table" w:default="1" w:styleId="TableNormal">
+    <w:name w:val="Normal Table"/>
+    <w:uiPriority w:val="99"/>
+    <w:semiHidden/>
+    <w:unhideWhenUsed/>
+    <w:tblPr>
+      <w:tblInd w:w="0" w:type="dxa"/>
+      <w:tblCellMar>
+        <w:top w:w="0" w:type="dxa"/>
+        <w:left w:w="108" w:type="dxa"/>
+        <w:bottom w:w="0" w:type="dxa"/>
+        <w:right w:w="108" w:type="dxa"/>
+      </w:tblCellMar>
+    </w:tblPr>
+  </w:style>
+  <w:style w:type="numbering" w:default="1" w:styleId="NoList">
+    <w:name w:val="No List"/>
+    <w:uiPriority w:val="99"/>
+    <w:semiHidden/>
+    <w:unhideWhenUsed/>
+  </w:style>
+  <w:style w:type="character" w:styleId="PlaceholderText">
+    <w:name w:val="Placeholder Text"/>
+    <w:basedOn w:val="DefaultParagraphFont"/>
+    <w:uiPriority w:val="99"/>
+    <w:semiHidden/>
+    <w:rsid w:val="00E17AB7"/>
+    <w:rPr>
+      <w:color w:val="666666"/>
+    </w:rPr>
+  </w:style>
+  <w:style w:type="paragraph" w:customStyle="1" w:styleId="3971631E3AE6499B963792D350699D38">
+    <w:name w:val="3971631E3AE6499B963792D350699D38"/>
+    <w:rsid w:val="00E17AB7"/>
+  </w:style>
+  <w:style w:type="paragraph" w:customStyle="1" w:styleId="822E86C6BB8146B4842220807431D7FD">
+    <w:name w:val="822E86C6BB8146B4842220807431D7FD"/>
+    <w:rsid w:val="00E17AB7"/>
+  </w:style>
+</w:styles>
+</file>
+
+<file path=word/glossary/webSettings.xml><?xml version="1.0" encoding="utf-8"?>
+<w:webSettings xmlns:mc="http://schemas.openxmlformats.org/markup-compatibility/2006" xmlns:r="http://schemas.openxmlformats.org/officeDocument/2006/relationships" xmlns:w="http://schemas.openxmlformats.org/wordprocessingml/2006/main" xmlns:w14="http://schemas.microsoft.com/office/word/2010/wordml" xmlns:w15="http://schemas.microsoft.com/office/word/2012/wordml" xmlns:w16cex="http://schemas.microsoft.com/office/word/2018/wordml/cex" xmlns:w16cid="http://schemas.microsoft.com/office/word/2016/wordml/cid" xmlns:w16="http://schemas.microsoft.com/office/word/2018/wordml" xmlns:w16du="http://schemas.microsoft.com/office/word/2023/wordml/word16du" xmlns:w16sdtdh="http://schemas.microsoft.com/office/word/2020/wordml/sdtdatahash" xmlns:w16sdtfl="http://schemas.microsoft.com/office/word/2024/wordml/sdtformatlock" xmlns:w16se="http://schemas.microsoft.com/office/word/2015/wordml/symex" mc:Ignorable="w14 w15 w16se w16cid w16 w16cex w16sdtdh w16sdtfl w16du">
+  <w:optimizeForBrowser/>
+  <w:allowPNG/>
+</w:webSettings>
+</file>
+
 <file path=word/theme/theme1.xml><?xml version="1.0" encoding="utf-8"?>
 <a:theme xmlns:a="http://schemas.openxmlformats.org/drawingml/2006/main" name="Office Theme">
   <a:themeElements>

</xml_diff>

<commit_message>
Added second research paper for BG research
</commit_message>
<xml_diff>
--- a/report/7COM1079_Group_A104_Report.docx
+++ b/report/7COM1079_Group_A104_Report.docx
@@ -2750,6 +2750,82 @@
     </w:p>
     <w:p>
       <w:pPr>
+        <w:pStyle w:val="ListParagraph"/>
+        <w:ind w:left="1440"/>
+        <w:rPr>
+          <w:rFonts w:ascii="Times New Roman" w:hAnsi="Times New Roman" w:cs="Times New Roman"/>
+        </w:rPr>
+      </w:pPr>
+    </w:p>
+    <w:p>
+      <w:pPr>
+        <w:pStyle w:val="ListParagraph"/>
+        <w:ind w:left="1440"/>
+        <w:rPr>
+          <w:rFonts w:ascii="Times New Roman" w:hAnsi="Times New Roman" w:cs="Times New Roman"/>
+        </w:rPr>
+      </w:pPr>
+      <w:r>
+        <w:rPr>
+          <w:rFonts w:ascii="Times New Roman" w:hAnsi="Times New Roman" w:cs="Times New Roman"/>
+        </w:rPr>
+        <w:t>In contrast, research on engineering occupations provides insight into how stress appears in technically demanding environments.</w:t>
+      </w:r>
+      <w:r>
+        <w:rPr>
+          <w:rFonts w:ascii="Times New Roman" w:hAnsi="Times New Roman" w:cs="Times New Roman"/>
+        </w:rPr>
+        <w:t xml:space="preserve"> </w:t>
+      </w:r>
+      <w:sdt>
+        <w:sdtPr>
+          <w:rPr>
+            <w:rFonts w:ascii="Times New Roman" w:hAnsi="Times New Roman" w:cs="Times New Roman"/>
+            <w:color w:val="000000"/>
+          </w:rPr>
+          <w:tag w:val="MENDELEY_CITATION_v3_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"/>
+          <w:id w:val="-1662462371"/>
+          <w:placeholder>
+            <w:docPart w:val="F6EF149536B84AF285F7102C49317FE0"/>
+          </w:placeholder>
+        </w:sdtPr>
+        <w:sdtContent>
+          <w:r>
+            <w:rPr>
+              <w:rFonts w:ascii="Times New Roman" w:hAnsi="Times New Roman" w:cs="Times New Roman"/>
+              <w:color w:val="000000"/>
+            </w:rPr>
+            <w:t>LIU et al. (2024)</w:t>
+          </w:r>
+        </w:sdtContent>
+      </w:sdt>
+      <w:r>
+        <w:rPr>
+          <w:rFonts w:ascii="Times New Roman" w:hAnsi="Times New Roman" w:cs="Times New Roman"/>
+        </w:rPr>
+        <w:t xml:space="preserve"> </w:t>
+      </w:r>
+      <w:r>
+        <w:rPr>
+          <w:rFonts w:ascii="Times New Roman" w:hAnsi="Times New Roman" w:cs="Times New Roman"/>
+        </w:rPr>
+        <w:t xml:space="preserve">examined occupational stress among locomotive engineers in the Yangtze River Delta region and surveyed nearly 8,000 participants using recognised measures of sleep quality and well-being such as Pittsburgh Sleep Quality Index (PSQI). The study found </w:t>
+      </w:r>
+      <w:r>
+        <w:rPr>
+          <w:rFonts w:ascii="Times New Roman" w:hAnsi="Times New Roman" w:cs="Times New Roman"/>
+        </w:rPr>
+        <w:t xml:space="preserve">showed that good sleep quality and higher well-being were associated with a reduced likelihood of stress, while factors like frequent night shifts and long commutes increased stress risk. </w:t>
+      </w:r>
+      <w:r>
+        <w:rPr>
+          <w:rFonts w:ascii="Times New Roman" w:hAnsi="Times New Roman" w:cs="Times New Roman"/>
+        </w:rPr>
+        <w:t xml:space="preserve">These findings demonstrate how lifestyle and work patterns shape stress experiences in engineering roles. </w:t>
+      </w:r>
+    </w:p>
+    <w:p>
+      <w:pPr>
         <w:rPr>
           <w:rFonts w:ascii="Times New Roman" w:eastAsia="Times New Roman" w:hAnsi="Times New Roman" w:cs="Times New Roman"/>
         </w:rPr>
@@ -3513,6 +3589,7 @@
         <w:rPr>
           <w:rFonts w:ascii="Times New Roman" w:eastAsia="Times New Roman" w:hAnsi="Times New Roman" w:cs="Times New Roman"/>
         </w:rPr>
+        <w:lastRenderedPageBreak/>
         <w:t xml:space="preserve"> </w:t>
       </w:r>
     </w:p>
@@ -3686,7 +3763,6 @@
         <w:rPr>
           <w:rFonts w:ascii="Times New Roman" w:eastAsia="Times New Roman" w:hAnsi="Times New Roman" w:cs="Times New Roman"/>
         </w:rPr>
-        <w:lastRenderedPageBreak/>
         <w:t>Stress Level, the dependent variable, is an ordinal datatype with less than 8 unique values.</w:t>
       </w:r>
     </w:p>
@@ -4404,6 +4480,7 @@
         <w:rPr>
           <w:rFonts w:ascii="Times New Roman" w:eastAsia="Times New Roman" w:hAnsi="Times New Roman" w:cs="Times New Roman"/>
         </w:rPr>
+        <w:lastRenderedPageBreak/>
         <w:t xml:space="preserve"> </w:t>
       </w:r>
     </w:p>
@@ -4710,7 +4787,6 @@
         <w:rPr>
           <w:rFonts w:ascii="Times New Roman" w:eastAsia="Times New Roman" w:hAnsi="Times New Roman" w:cs="Times New Roman"/>
         </w:rPr>
-        <w:lastRenderedPageBreak/>
         <w:t xml:space="preserve">Usman G. </w:t>
       </w:r>
       <w:r>
@@ -9433,6 +9509,7 @@
   <w:style w:type="character" w:default="1" w:styleId="DefaultParagraphFont">
     <w:name w:val="Default Paragraph Font"/>
     <w:uiPriority w:val="1"/>
+    <w:semiHidden/>
     <w:unhideWhenUsed/>
   </w:style>
   <w:style w:type="table" w:default="1" w:styleId="TableNormal">
@@ -9948,6 +10025,35 @@
         </w:p>
       </w:docPartBody>
     </w:docPart>
+    <w:docPart>
+      <w:docPartPr>
+        <w:name w:val="F6EF149536B84AF285F7102C49317FE0"/>
+        <w:category>
+          <w:name w:val="General"/>
+          <w:gallery w:val="placeholder"/>
+        </w:category>
+        <w:types>
+          <w:type w:val="bbPlcHdr"/>
+        </w:types>
+        <w:behaviors>
+          <w:behavior w:val="content"/>
+        </w:behaviors>
+        <w:guid w:val="{CCADF61A-E1C9-4C01-B45B-00ECF1E8985B}"/>
+      </w:docPartPr>
+      <w:docPartBody>
+        <w:p>
+          <w:pPr>
+            <w:pStyle w:val="F6EF149536B84AF285F7102C49317FE0"/>
+          </w:pPr>
+          <w:r>
+            <w:rPr>
+              <w:rStyle w:val="PlaceholderText"/>
+            </w:rPr>
+            <w:t>Click or tap here to enter text.</w:t>
+          </w:r>
+        </w:p>
+      </w:docPartBody>
+    </w:docPart>
   </w:docParts>
 </w:glossaryDocument>
 </file>
@@ -10036,9 +10142,12 @@
   </w:compat>
   <w:rsids>
     <w:rsidRoot w:val="00971FE2"/>
+    <w:rsid w:val="001551D6"/>
     <w:rsid w:val="0020251E"/>
     <w:rsid w:val="00434C71"/>
+    <w:rsid w:val="00797ABC"/>
     <w:rsid w:val="00971FE2"/>
+    <w:rsid w:val="00D13753"/>
   </w:rsids>
   <m:mathPr>
     <m:mathFont m:val="Cambria Math"/>
@@ -10494,18 +10603,14 @@
     <w:basedOn w:val="DefaultParagraphFont"/>
     <w:uiPriority w:val="99"/>
     <w:semiHidden/>
-    <w:rsid w:val="00971FE2"/>
+    <w:rsid w:val="00797ABC"/>
     <w:rPr>
       <w:color w:val="666666"/>
     </w:rPr>
   </w:style>
-  <w:style w:type="paragraph" w:customStyle="1" w:styleId="648154B16C6B41549649F44A19002527">
-    <w:name w:val="648154B16C6B41549649F44A19002527"/>
-    <w:rsid w:val="00971FE2"/>
-  </w:style>
-  <w:style w:type="paragraph" w:customStyle="1" w:styleId="95FAD27F6A024DAD9A82FD7FE3B16EE8">
-    <w:name w:val="95FAD27F6A024DAD9A82FD7FE3B16EE8"/>
-    <w:rsid w:val="00971FE2"/>
+  <w:style w:type="paragraph" w:customStyle="1" w:styleId="F6EF149536B84AF285F7102C49317FE0">
+    <w:name w:val="F6EF149536B84AF285F7102C49317FE0"/>
+    <w:rsid w:val="00797ABC"/>
   </w:style>
 </w:styles>
 </file>

</xml_diff>

<commit_message>
Updated all three research papers for BG research
</commit_message>
<xml_diff>
--- a/report/7COM1079_Group_A104_Report.docx
+++ b/report/7COM1079_Group_A104_Report.docx
@@ -2759,8 +2759,9 @@
     </w:p>
     <w:p>
       <w:pPr>
-        <w:pStyle w:val="ListParagraph"/>
+        <w:spacing w:after="160" w:line="278" w:lineRule="auto"/>
         <w:ind w:left="1440"/>
+        <w:contextualSpacing/>
         <w:rPr>
           <w:rFonts w:ascii="Times New Roman" w:hAnsi="Times New Roman" w:cs="Times New Roman"/>
         </w:rPr>
@@ -2821,13 +2822,75 @@
         <w:rPr>
           <w:rFonts w:ascii="Times New Roman" w:hAnsi="Times New Roman" w:cs="Times New Roman"/>
         </w:rPr>
-        <w:t xml:space="preserve">These findings demonstrate how lifestyle and work patterns shape stress experiences in engineering roles. </w:t>
-      </w:r>
-    </w:p>
-    <w:p>
-      <w:pPr>
-        <w:rPr>
-          <w:rFonts w:ascii="Times New Roman" w:eastAsia="Times New Roman" w:hAnsi="Times New Roman" w:cs="Times New Roman"/>
+        <w:t>These findings demonstrate how lifestyle and work patterns shape stress experiences in engineering roles.</w:t>
+      </w:r>
+      <w:r>
+        <w:rPr>
+          <w:rFonts w:ascii="Times New Roman" w:hAnsi="Times New Roman" w:cs="Times New Roman"/>
+        </w:rPr>
+        <w:t xml:space="preserve"> </w:t>
+      </w:r>
+    </w:p>
+    <w:p>
+      <w:pPr>
+        <w:spacing w:after="160" w:line="278" w:lineRule="auto"/>
+        <w:ind w:left="1440"/>
+        <w:contextualSpacing/>
+        <w:rPr>
+          <w:rFonts w:ascii="Times New Roman" w:hAnsi="Times New Roman" w:cs="Times New Roman"/>
+        </w:rPr>
+      </w:pPr>
+    </w:p>
+    <w:p>
+      <w:pPr>
+        <w:spacing w:after="160" w:line="278" w:lineRule="auto"/>
+        <w:ind w:left="1440"/>
+        <w:contextualSpacing/>
+        <w:rPr>
+          <w:rFonts w:ascii="Times New Roman" w:eastAsia="Aptos" w:hAnsi="Times New Roman" w:cs="Times New Roman"/>
+        </w:rPr>
+      </w:pPr>
+      <w:r>
+        <w:rPr>
+          <w:rFonts w:ascii="Times New Roman" w:eastAsia="Aptos" w:hAnsi="Times New Roman" w:cs="Times New Roman"/>
+        </w:rPr>
+        <w:t xml:space="preserve">Broader research further supports the idea that stress varies across occupations. </w:t>
+      </w:r>
+      <w:sdt>
+        <w:sdtPr>
+          <w:rPr>
+            <w:rFonts w:ascii="Times New Roman" w:eastAsia="Aptos" w:hAnsi="Times New Roman" w:cs="Times New Roman"/>
+            <w:color w:val="000000"/>
+          </w:rPr>
+          <w:tag w:val="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"/>
+          <w:id w:val="1968618399"/>
+          <w:placeholder>
+            <w:docPart w:val="4DF79FF2BEA64B81B3C1389B1A5F0B7E"/>
+          </w:placeholder>
+        </w:sdtPr>
+        <w:sdtContent>
+          <w:r>
+            <w:rPr>
+              <w:rFonts w:ascii="Times New Roman" w:eastAsia="Aptos" w:hAnsi="Times New Roman" w:cs="Times New Roman"/>
+              <w:color w:val="000000"/>
+            </w:rPr>
+            <w:t>Johnson et al. (1996)</w:t>
+          </w:r>
+        </w:sdtContent>
+      </w:sdt>
+      <w:r>
+        <w:rPr>
+          <w:rFonts w:ascii="Times New Roman" w:eastAsia="Aptos" w:hAnsi="Times New Roman" w:cs="Times New Roman"/>
+        </w:rPr>
+        <w:t xml:space="preserve"> showed that differences in job control and psychosocial work conditions contribute to varying levels of strain between professions. Together, these studies justify comparing stress levels between doctors and engineers.</w:t>
+      </w:r>
+    </w:p>
+    <w:p>
+      <w:pPr>
+        <w:pStyle w:val="ListParagraph"/>
+        <w:ind w:left="1440"/>
+        <w:rPr>
+          <w:rFonts w:ascii="Times New Roman" w:hAnsi="Times New Roman" w:cs="Times New Roman"/>
         </w:rPr>
       </w:pPr>
     </w:p>
@@ -2846,6 +2909,8 @@
       <w:r>
         <w:rPr>
           <w:rFonts w:ascii="Times New Roman" w:eastAsia="Times New Roman" w:hAnsi="Times New Roman" w:cs="Times New Roman"/>
+          <w:b/>
+          <w:bCs/>
         </w:rPr>
         <w:t>Why RQ is of interest (research gap and future directions according to the literature)</w:t>
       </w:r>
@@ -3364,6 +3429,7 @@
           <w:i/>
           <w:highlight w:val="yellow"/>
         </w:rPr>
+        <w:lastRenderedPageBreak/>
         <w:t>Make sure the title or caption and axis labels</w:t>
       </w:r>
       <w:r>
@@ -3589,7 +3655,6 @@
         <w:rPr>
           <w:rFonts w:ascii="Times New Roman" w:eastAsia="Times New Roman" w:hAnsi="Times New Roman" w:cs="Times New Roman"/>
         </w:rPr>
-        <w:lastRenderedPageBreak/>
         <w:t xml:space="preserve"> </w:t>
       </w:r>
     </w:p>
@@ -4299,6 +4364,7 @@
           <w:iCs/>
           <w:highlight w:val="yellow"/>
         </w:rPr>
+        <w:lastRenderedPageBreak/>
         <w:t>From your Git log, select three most significant commits during this project and include the following for each:</w:t>
       </w:r>
     </w:p>
@@ -4480,7 +4546,6 @@
         <w:rPr>
           <w:rFonts w:ascii="Times New Roman" w:eastAsia="Times New Roman" w:hAnsi="Times New Roman" w:cs="Times New Roman"/>
         </w:rPr>
-        <w:lastRenderedPageBreak/>
         <w:t xml:space="preserve"> </w:t>
       </w:r>
     </w:p>
@@ -10054,6 +10119,35 @@
         </w:p>
       </w:docPartBody>
     </w:docPart>
+    <w:docPart>
+      <w:docPartPr>
+        <w:name w:val="4DF79FF2BEA64B81B3C1389B1A5F0B7E"/>
+        <w:category>
+          <w:name w:val="General"/>
+          <w:gallery w:val="placeholder"/>
+        </w:category>
+        <w:types>
+          <w:type w:val="bbPlcHdr"/>
+        </w:types>
+        <w:behaviors>
+          <w:behavior w:val="content"/>
+        </w:behaviors>
+        <w:guid w:val="{C71072D6-C802-4866-B36D-359C015BBFDE}"/>
+      </w:docPartPr>
+      <w:docPartBody>
+        <w:p>
+          <w:pPr>
+            <w:pStyle w:val="4DF79FF2BEA64B81B3C1389B1A5F0B7E"/>
+          </w:pPr>
+          <w:r>
+            <w:rPr>
+              <w:rStyle w:val="PlaceholderText"/>
+            </w:rPr>
+            <w:t>Click or tap here to enter text.</w:t>
+          </w:r>
+        </w:p>
+      </w:docPartBody>
+    </w:docPart>
   </w:docParts>
 </w:glossaryDocument>
 </file>
@@ -10143,10 +10237,12 @@
   <w:rsids>
     <w:rsidRoot w:val="00971FE2"/>
     <w:rsid w:val="001551D6"/>
+    <w:rsid w:val="00185D8D"/>
     <w:rsid w:val="0020251E"/>
     <w:rsid w:val="00434C71"/>
     <w:rsid w:val="00797ABC"/>
     <w:rsid w:val="00971FE2"/>
+    <w:rsid w:val="00C0617B"/>
     <w:rsid w:val="00D13753"/>
   </w:rsids>
   <m:mathPr>
@@ -10603,7 +10699,7 @@
     <w:basedOn w:val="DefaultParagraphFont"/>
     <w:uiPriority w:val="99"/>
     <w:semiHidden/>
-    <w:rsid w:val="00797ABC"/>
+    <w:rsid w:val="00C0617B"/>
     <w:rPr>
       <w:color w:val="666666"/>
     </w:rPr>
@@ -10611,6 +10707,14 @@
   <w:style w:type="paragraph" w:customStyle="1" w:styleId="F6EF149536B84AF285F7102C49317FE0">
     <w:name w:val="F6EF149536B84AF285F7102C49317FE0"/>
     <w:rsid w:val="00797ABC"/>
+  </w:style>
+  <w:style w:type="paragraph" w:customStyle="1" w:styleId="E32B62AB322E49D3AFAA15B7E747A76A">
+    <w:name w:val="E32B62AB322E49D3AFAA15B7E747A76A"/>
+    <w:rsid w:val="00C0617B"/>
+  </w:style>
+  <w:style w:type="paragraph" w:customStyle="1" w:styleId="4DF79FF2BEA64B81B3C1389B1A5F0B7E">
+    <w:name w:val="4DF79FF2BEA64B81B3C1389B1A5F0B7E"/>
+    <w:rsid w:val="00C0617B"/>
   </w:style>
 </w:styles>
 </file>

</xml_diff>

<commit_message>
Added references for the all research papers in reference list
</commit_message>
<xml_diff>
--- a/report/7COM1079_Group_A104_Report.docx
+++ b/report/7COM1079_Group_A104_Report.docx
@@ -4838,6 +4838,156 @@
           <w:bCs/>
           <w:i/>
           <w:iCs/>
+        </w:rPr>
+      </w:pPr>
+    </w:p>
+    <w:p>
+      <w:pPr>
+        <w:pStyle w:val="ListParagraph"/>
+        <w:rPr>
+          <w:rFonts w:ascii="Times New Roman" w:eastAsia="Times New Roman" w:hAnsi="Times New Roman" w:cs="Times New Roman"/>
+        </w:rPr>
+      </w:pPr>
+      <w:r>
+        <w:rPr>
+          <w:rFonts w:ascii="Times New Roman" w:eastAsia="Times New Roman" w:hAnsi="Times New Roman" w:cs="Times New Roman"/>
+        </w:rPr>
+        <w:t>Johnson, J.V., Stewart, W., Hall, E.M., Fredlund, P. and Theorell, T. (1996) ‘Long-term psychosocial work environment and cardiovascular mortality among Swedish men’, American journal of public health (1971), 86(3), pp. 324–331.</w:t>
+      </w:r>
+    </w:p>
+    <w:p>
+      <w:pPr>
+        <w:pStyle w:val="ListParagraph"/>
+        <w:rPr>
+          <w:rFonts w:ascii="Times New Roman" w:eastAsia="Times New Roman" w:hAnsi="Times New Roman" w:cs="Times New Roman"/>
+        </w:rPr>
+      </w:pPr>
+    </w:p>
+    <w:p>
+      <w:pPr>
+        <w:pStyle w:val="ListParagraph"/>
+        <w:rPr>
+          <w:rFonts w:ascii="Times New Roman" w:eastAsia="Times New Roman" w:hAnsi="Times New Roman" w:cs="Times New Roman"/>
+        </w:rPr>
+      </w:pPr>
+      <w:r>
+        <w:rPr>
+          <w:rFonts w:ascii="Times New Roman" w:eastAsia="Times New Roman" w:hAnsi="Times New Roman" w:cs="Times New Roman"/>
+        </w:rPr>
+        <w:t xml:space="preserve">LIU, Y., YANG, F., JIN, Y., WU, H., CAO, X. and YIN, Y. (2024) ‘Associations of well-being and sleep quality with occupational stress among locomotive engineers in the Yangtze River Delta region’, Huan </w:t>
+      </w:r>
+      <w:proofErr w:type="spellStart"/>
+      <w:r>
+        <w:rPr>
+          <w:rFonts w:ascii="Times New Roman" w:eastAsia="Times New Roman" w:hAnsi="Times New Roman" w:cs="Times New Roman"/>
+        </w:rPr>
+        <w:t>jing</w:t>
+      </w:r>
+      <w:proofErr w:type="spellEnd"/>
+      <w:r>
+        <w:rPr>
+          <w:rFonts w:ascii="Times New Roman" w:eastAsia="Times New Roman" w:hAnsi="Times New Roman" w:cs="Times New Roman"/>
+        </w:rPr>
+        <w:t xml:space="preserve"> </w:t>
+      </w:r>
+      <w:proofErr w:type="spellStart"/>
+      <w:r>
+        <w:rPr>
+          <w:rFonts w:ascii="Times New Roman" w:eastAsia="Times New Roman" w:hAnsi="Times New Roman" w:cs="Times New Roman"/>
+        </w:rPr>
+        <w:t>yu</w:t>
+      </w:r>
+      <w:proofErr w:type="spellEnd"/>
+      <w:r>
+        <w:rPr>
+          <w:rFonts w:ascii="Times New Roman" w:eastAsia="Times New Roman" w:hAnsi="Times New Roman" w:cs="Times New Roman"/>
+        </w:rPr>
+        <w:t xml:space="preserve"> </w:t>
+      </w:r>
+      <w:proofErr w:type="spellStart"/>
+      <w:r>
+        <w:rPr>
+          <w:rFonts w:ascii="Times New Roman" w:eastAsia="Times New Roman" w:hAnsi="Times New Roman" w:cs="Times New Roman"/>
+        </w:rPr>
+        <w:t>zhi</w:t>
+      </w:r>
+      <w:proofErr w:type="spellEnd"/>
+      <w:r>
+        <w:rPr>
+          <w:rFonts w:ascii="Times New Roman" w:eastAsia="Times New Roman" w:hAnsi="Times New Roman" w:cs="Times New Roman"/>
+        </w:rPr>
+        <w:t xml:space="preserve"> ye </w:t>
+      </w:r>
+      <w:proofErr w:type="spellStart"/>
+      <w:r>
+        <w:rPr>
+          <w:rFonts w:ascii="Times New Roman" w:eastAsia="Times New Roman" w:hAnsi="Times New Roman" w:cs="Times New Roman"/>
+        </w:rPr>
+        <w:t>yi</w:t>
+      </w:r>
+      <w:proofErr w:type="spellEnd"/>
+      <w:r>
+        <w:rPr>
+          <w:rFonts w:ascii="Times New Roman" w:eastAsia="Times New Roman" w:hAnsi="Times New Roman" w:cs="Times New Roman"/>
+        </w:rPr>
+        <w:t xml:space="preserve"> </w:t>
+      </w:r>
+      <w:proofErr w:type="spellStart"/>
+      <w:r>
+        <w:rPr>
+          <w:rFonts w:ascii="Times New Roman" w:eastAsia="Times New Roman" w:hAnsi="Times New Roman" w:cs="Times New Roman"/>
+        </w:rPr>
+        <w:t>xue</w:t>
+      </w:r>
+      <w:proofErr w:type="spellEnd"/>
+      <w:r>
+        <w:rPr>
+          <w:rFonts w:ascii="Times New Roman" w:eastAsia="Times New Roman" w:hAnsi="Times New Roman" w:cs="Times New Roman"/>
+        </w:rPr>
+        <w:t xml:space="preserve"> = Journal of environmental &amp; occupational medicine, 41(5), pp. 526–532.</w:t>
+      </w:r>
+    </w:p>
+    <w:p>
+      <w:pPr>
+        <w:pStyle w:val="ListParagraph"/>
+        <w:rPr>
+          <w:rFonts w:ascii="Times New Roman" w:eastAsia="Times New Roman" w:hAnsi="Times New Roman" w:cs="Times New Roman"/>
+        </w:rPr>
+      </w:pPr>
+    </w:p>
+    <w:p>
+      <w:pPr>
+        <w:pStyle w:val="ListParagraph"/>
+        <w:rPr>
+          <w:rFonts w:ascii="Times New Roman" w:eastAsia="Times New Roman" w:hAnsi="Times New Roman" w:cs="Times New Roman"/>
+        </w:rPr>
+      </w:pPr>
+      <w:r>
+        <w:rPr>
+          <w:rFonts w:ascii="Times New Roman" w:eastAsia="Times New Roman" w:hAnsi="Times New Roman" w:cs="Times New Roman"/>
+        </w:rPr>
+        <w:t xml:space="preserve">Shanafelt, T.D., Hasan, O., Dyrbye, L.N., Sinsky, C., Satele, D., Sloan, J. and West, C.P. (2015) ‘Changes in Burnout and Satisfaction </w:t>
+      </w:r>
+      <w:proofErr w:type="gramStart"/>
+      <w:r>
+        <w:rPr>
+          <w:rFonts w:ascii="Times New Roman" w:eastAsia="Times New Roman" w:hAnsi="Times New Roman" w:cs="Times New Roman"/>
+        </w:rPr>
+        <w:t>With</w:t>
+      </w:r>
+      <w:proofErr w:type="gramEnd"/>
+      <w:r>
+        <w:rPr>
+          <w:rFonts w:ascii="Times New Roman" w:eastAsia="Times New Roman" w:hAnsi="Times New Roman" w:cs="Times New Roman"/>
+        </w:rPr>
+        <w:t xml:space="preserve"> Work-Life Balance in Physicians and the General US Working Population Between 2011 and 2014’, Mayo Clinic proceedings, 90(12), pp. 1600–1613.</w:t>
+      </w:r>
+    </w:p>
+    <w:p>
+      <w:pPr>
+        <w:pStyle w:val="ListParagraph"/>
+        <w:rPr>
+          <w:rFonts w:ascii="Times New Roman" w:eastAsia="Times New Roman" w:hAnsi="Times New Roman" w:cs="Times New Roman"/>
         </w:rPr>
       </w:pPr>
     </w:p>
@@ -10236,6 +10386,7 @@
   </w:compat>
   <w:rsids>
     <w:rsidRoot w:val="00971FE2"/>
+    <w:rsid w:val="00104EF2"/>
     <w:rsid w:val="001551D6"/>
     <w:rsid w:val="00185D8D"/>
     <w:rsid w:val="0020251E"/>
@@ -10244,6 +10395,7 @@
     <w:rsid w:val="00971FE2"/>
     <w:rsid w:val="00C0617B"/>
     <w:rsid w:val="00D13753"/>
+    <w:rsid w:val="00D955E6"/>
   </w:rsids>
   <m:mathPr>
     <m:mathFont m:val="Cambria Math"/>
@@ -10708,10 +10860,6 @@
     <w:name w:val="F6EF149536B84AF285F7102C49317FE0"/>
     <w:rsid w:val="00797ABC"/>
   </w:style>
-  <w:style w:type="paragraph" w:customStyle="1" w:styleId="E32B62AB322E49D3AFAA15B7E747A76A">
-    <w:name w:val="E32B62AB322E49D3AFAA15B7E747A76A"/>
-    <w:rsid w:val="00C0617B"/>
-  </w:style>
   <w:style w:type="paragraph" w:customStyle="1" w:styleId="4DF79FF2BEA64B81B3C1389B1A5F0B7E">
     <w:name w:val="4DF79FF2BEA64B81B3C1389B1A5F0B7E"/>
     <w:rsid w:val="00C0617B"/>

</xml_diff>

<commit_message>
Updated section 4.2, added R code for analysis in section 8
</commit_message>
<xml_diff>
--- a/report/7COM1079_Group_A104_Report.docx
+++ b/report/7COM1079_Group_A104_Report.docx
@@ -2685,6 +2685,7 @@
       <w:pPr>
         <w:pStyle w:val="ListParagraph"/>
         <w:ind w:left="1440"/>
+        <w:jc w:val="both"/>
         <w:rPr>
           <w:rFonts w:ascii="Times New Roman" w:hAnsi="Times New Roman" w:cs="Times New Roman"/>
         </w:rPr>
@@ -2752,6 +2753,7 @@
       <w:pPr>
         <w:pStyle w:val="ListParagraph"/>
         <w:ind w:left="1440"/>
+        <w:jc w:val="both"/>
         <w:rPr>
           <w:rFonts w:ascii="Times New Roman" w:hAnsi="Times New Roman" w:cs="Times New Roman"/>
         </w:rPr>
@@ -2762,6 +2764,7 @@
         <w:spacing w:after="160" w:line="278" w:lineRule="auto"/>
         <w:ind w:left="1440"/>
         <w:contextualSpacing/>
+        <w:jc w:val="both"/>
         <w:rPr>
           <w:rFonts w:ascii="Times New Roman" w:hAnsi="Times New Roman" w:cs="Times New Roman"/>
         </w:rPr>
@@ -2836,6 +2839,7 @@
         <w:spacing w:after="160" w:line="278" w:lineRule="auto"/>
         <w:ind w:left="1440"/>
         <w:contextualSpacing/>
+        <w:jc w:val="both"/>
         <w:rPr>
           <w:rFonts w:ascii="Times New Roman" w:hAnsi="Times New Roman" w:cs="Times New Roman"/>
         </w:rPr>
@@ -2846,6 +2850,7 @@
         <w:spacing w:after="160" w:line="278" w:lineRule="auto"/>
         <w:ind w:left="1440"/>
         <w:contextualSpacing/>
+        <w:jc w:val="both"/>
         <w:rPr>
           <w:rFonts w:ascii="Times New Roman" w:eastAsia="Aptos" w:hAnsi="Times New Roman" w:cs="Times New Roman"/>
         </w:rPr>
@@ -3429,7 +3434,6 @@
           <w:i/>
           <w:highlight w:val="yellow"/>
         </w:rPr>
-        <w:lastRenderedPageBreak/>
         <w:t>Make sure the title or caption and axis labels</w:t>
       </w:r>
       <w:r>
@@ -3485,14 +3489,13 @@
         <w:ind w:hanging="720"/>
         <w:rPr>
           <w:rFonts w:ascii="Times New Roman" w:eastAsia="Times New Roman" w:hAnsi="Times New Roman" w:cs="Times New Roman"/>
-          <w:i/>
-          <w:iCs/>
-        </w:rPr>
-      </w:pPr>
-      <w:r>
-        <w:rPr>
-          <w:rFonts w:ascii="Times New Roman" w:eastAsia="Times New Roman" w:hAnsi="Times New Roman" w:cs="Times New Roman"/>
-        </w:rPr>
+        </w:rPr>
+      </w:pPr>
+      <w:r>
+        <w:rPr>
+          <w:rFonts w:ascii="Times New Roman" w:eastAsia="Times New Roman" w:hAnsi="Times New Roman" w:cs="Times New Roman"/>
+        </w:rPr>
+        <w:lastRenderedPageBreak/>
         <w:t>Additional information relating to understanding the data (optional)</w:t>
       </w:r>
       <w:r>
@@ -3512,8 +3515,6 @@
       <w:r>
         <w:rPr>
           <w:rFonts w:ascii="Times New Roman" w:eastAsia="Times New Roman" w:hAnsi="Times New Roman" w:cs="Times New Roman"/>
-          <w:i/>
-          <w:iCs/>
         </w:rPr>
         <w:t xml:space="preserve"> </w:t>
       </w:r>
@@ -3571,8 +3572,6 @@
         <w:ind w:hanging="720"/>
         <w:rPr>
           <w:rFonts w:ascii="Times New Roman" w:eastAsia="Times New Roman" w:hAnsi="Times New Roman" w:cs="Times New Roman"/>
-          <w:i/>
-          <w:iCs/>
         </w:rPr>
       </w:pPr>
       <w:r>
@@ -3700,8 +3699,6 @@
         <w:ind w:hanging="720"/>
         <w:rPr>
           <w:rFonts w:ascii="Times New Roman" w:eastAsia="Times New Roman" w:hAnsi="Times New Roman" w:cs="Times New Roman"/>
-          <w:i/>
-          <w:iCs/>
         </w:rPr>
       </w:pPr>
       <w:r>
@@ -3865,7 +3862,19 @@
         <w:rPr>
           <w:rFonts w:ascii="Times New Roman" w:eastAsia="Times New Roman" w:hAnsi="Times New Roman" w:cs="Times New Roman"/>
         </w:rPr>
-        <w:t xml:space="preserve"> indicated that the data</w:t>
+        <w:t xml:space="preserve"> indicate</w:t>
+      </w:r>
+      <w:r>
+        <w:rPr>
+          <w:rFonts w:ascii="Times New Roman" w:eastAsia="Times New Roman" w:hAnsi="Times New Roman" w:cs="Times New Roman"/>
+        </w:rPr>
+        <w:t>s</w:t>
+      </w:r>
+      <w:r>
+        <w:rPr>
+          <w:rFonts w:ascii="Times New Roman" w:eastAsia="Times New Roman" w:hAnsi="Times New Roman" w:cs="Times New Roman"/>
+        </w:rPr>
+        <w:t xml:space="preserve"> that the data</w:t>
       </w:r>
       <w:r>
         <w:rPr>
@@ -3902,8 +3911,6 @@
         <w:ind w:hanging="720"/>
         <w:rPr>
           <w:rFonts w:ascii="Times New Roman" w:eastAsia="Times New Roman" w:hAnsi="Times New Roman" w:cs="Times New Roman"/>
-          <w:i/>
-          <w:iCs/>
         </w:rPr>
       </w:pPr>
       <w:r>
@@ -3948,6 +3955,7 @@
     <w:p>
       <w:pPr>
         <w:ind w:left="1440"/>
+        <w:jc w:val="both"/>
         <w:rPr>
           <w:rFonts w:ascii="Times New Roman" w:eastAsia="Times New Roman" w:hAnsi="Times New Roman" w:cs="Times New Roman"/>
         </w:rPr>
@@ -3962,6 +3970,7 @@
     <w:p>
       <w:pPr>
         <w:ind w:left="1440"/>
+        <w:jc w:val="both"/>
         <w:rPr>
           <w:rFonts w:ascii="Times New Roman" w:eastAsia="Times New Roman" w:hAnsi="Times New Roman" w:cs="Times New Roman"/>
         </w:rPr>
@@ -3970,19 +3979,52 @@
     <w:p>
       <w:pPr>
         <w:ind w:left="1440"/>
-        <w:rPr>
-          <w:rFonts w:ascii="Times New Roman" w:eastAsia="Times New Roman" w:hAnsi="Times New Roman" w:cs="Times New Roman"/>
-          <w:i/>
-          <w:iCs/>
-        </w:rPr>
-      </w:pPr>
-      <w:r>
-        <w:rPr>
-          <w:rFonts w:ascii="Times New Roman" w:eastAsia="Times New Roman" w:hAnsi="Times New Roman" w:cs="Times New Roman"/>
-          <w:i/>
-          <w:iCs/>
-        </w:rPr>
-        <w:t>Interpretation goes here</w:t>
+        <w:jc w:val="both"/>
+        <w:rPr>
+          <w:rFonts w:ascii="Times New Roman" w:eastAsia="Times New Roman" w:hAnsi="Times New Roman" w:cs="Times New Roman"/>
+        </w:rPr>
+      </w:pPr>
+      <w:r>
+        <w:rPr>
+          <w:rFonts w:ascii="Times New Roman" w:eastAsia="Times New Roman" w:hAnsi="Times New Roman" w:cs="Times New Roman"/>
+        </w:rPr>
+        <w:t>If this was a real</w:t>
+      </w:r>
+      <w:r>
+        <w:rPr>
+          <w:rFonts w:ascii="Times New Roman" w:eastAsia="Times New Roman" w:hAnsi="Times New Roman" w:cs="Times New Roman"/>
+        </w:rPr>
+        <w:t>-</w:t>
+      </w:r>
+      <w:r>
+        <w:rPr>
+          <w:rFonts w:ascii="Times New Roman" w:eastAsia="Times New Roman" w:hAnsi="Times New Roman" w:cs="Times New Roman"/>
+        </w:rPr>
+        <w:t xml:space="preserve">world data sample, it could have been </w:t>
+      </w:r>
+      <w:r>
+        <w:rPr>
+          <w:rFonts w:ascii="Times New Roman" w:eastAsia="Times New Roman" w:hAnsi="Times New Roman" w:cs="Times New Roman"/>
+        </w:rPr>
+        <w:t>interpreted</w:t>
+      </w:r>
+      <w:r>
+        <w:rPr>
+          <w:rFonts w:ascii="Times New Roman" w:eastAsia="Times New Roman" w:hAnsi="Times New Roman" w:cs="Times New Roman"/>
+        </w:rPr>
+        <w:t xml:space="preserve"> that doctors </w:t>
+      </w:r>
+      <w:r>
+        <w:rPr>
+          <w:rFonts w:ascii="Times New Roman" w:eastAsia="Times New Roman" w:hAnsi="Times New Roman" w:cs="Times New Roman"/>
+        </w:rPr>
+        <w:t xml:space="preserve">faced higher stress levels in comparison to engineers due to various occupational factors </w:t>
+      </w:r>
+      <w:r>
+        <w:rPr>
+          <w:rFonts w:ascii="Times New Roman" w:eastAsia="Times New Roman" w:hAnsi="Times New Roman" w:cs="Times New Roman"/>
+        </w:rPr>
+        <w:t>such as long shifts, critical decision making in life-or-death situations and inadequate rest.</w:t>
       </w:r>
     </w:p>
     <w:p>
@@ -5094,14 +5136,20 @@
           <w:b/>
           <w:bCs/>
         </w:rPr>
-        <w:t xml:space="preserve">Appendices </w:t>
-      </w:r>
-      <w:r>
-        <w:rPr>
-          <w:rFonts w:ascii="Times New Roman" w:eastAsia="Times New Roman" w:hAnsi="Times New Roman" w:cs="Times New Roman"/>
-          <w:b/>
-          <w:bCs/>
-        </w:rPr>
+        <w:t>Appendices</w:t>
+      </w:r>
+    </w:p>
+    <w:p>
+      <w:pPr>
+        <w:pStyle w:val="NoSpacing"/>
+        <w:rPr>
+          <w:color w:val="333333"/>
+        </w:rPr>
+      </w:pPr>
+      <w:r>
+        <w:t xml:space="preserve"> </w:t>
+      </w:r>
+      <w:r>
         <w:t xml:space="preserve"> </w:t>
       </w:r>
     </w:p>
@@ -5116,8 +5164,6 @@
           <w:rFonts w:ascii="Times New Roman" w:eastAsia="Times New Roman" w:hAnsi="Times New Roman" w:cs="Times New Roman"/>
           <w:b/>
           <w:bCs/>
-          <w:i/>
-          <w:iCs/>
         </w:rPr>
       </w:pPr>
       <w:r>
@@ -5139,8 +5185,6 @@
           <w:rFonts w:ascii="Times New Roman" w:eastAsia="Times New Roman" w:hAnsi="Times New Roman" w:cs="Times New Roman"/>
           <w:b/>
           <w:bCs/>
-          <w:i/>
-          <w:iCs/>
         </w:rPr>
         <w:t>(not included in</w:t>
       </w:r>
@@ -5149,8 +5193,6 @@
           <w:rFonts w:ascii="Times New Roman" w:eastAsia="Times New Roman" w:hAnsi="Times New Roman" w:cs="Times New Roman"/>
           <w:b/>
           <w:bCs/>
-          <w:i/>
-          <w:iCs/>
         </w:rPr>
         <w:t xml:space="preserve"> the</w:t>
       </w:r>
@@ -5159,8 +5201,6 @@
           <w:rFonts w:ascii="Times New Roman" w:eastAsia="Times New Roman" w:hAnsi="Times New Roman" w:cs="Times New Roman"/>
           <w:b/>
           <w:bCs/>
-          <w:i/>
-          <w:iCs/>
         </w:rPr>
         <w:t xml:space="preserve"> wor</w:t>
       </w:r>
@@ -5169,8 +5209,6 @@
           <w:rFonts w:ascii="Times New Roman" w:eastAsia="Times New Roman" w:hAnsi="Times New Roman" w:cs="Times New Roman"/>
           <w:b/>
           <w:bCs/>
-          <w:i/>
-          <w:iCs/>
         </w:rPr>
         <w:t>d</w:t>
       </w:r>
@@ -5179,8 +5217,6 @@
           <w:rFonts w:ascii="Times New Roman" w:eastAsia="Times New Roman" w:hAnsi="Times New Roman" w:cs="Times New Roman"/>
           <w:b/>
           <w:bCs/>
-          <w:i/>
-          <w:iCs/>
         </w:rPr>
         <w:t xml:space="preserve"> count)</w:t>
       </w:r>
@@ -5193,20 +5229,296 @@
           <w:rFonts w:ascii="Times New Roman" w:eastAsia="Times New Roman" w:hAnsi="Times New Roman" w:cs="Times New Roman"/>
         </w:rPr>
       </w:pPr>
-      <w:proofErr w:type="spellStart"/>
-      <w:r>
-        <w:rPr>
-          <w:rFonts w:ascii="Times New Roman" w:eastAsia="Times New Roman" w:hAnsi="Times New Roman" w:cs="Times New Roman"/>
-        </w:rPr>
-        <w:t>Analysis.R</w:t>
-      </w:r>
-      <w:proofErr w:type="spellEnd"/>
-      <w:r>
-        <w:rPr>
-          <w:rFonts w:ascii="Times New Roman" w:eastAsia="Times New Roman" w:hAnsi="Times New Roman" w:cs="Times New Roman"/>
-        </w:rPr>
-        <w:t xml:space="preserve"> code with the appropriate statistics to test the hypotheses. </w:t>
-      </w:r>
+      <w:r>
+        <w:rPr>
+          <w:rFonts w:ascii="Times New Roman" w:eastAsia="Times New Roman" w:hAnsi="Times New Roman" w:cs="Times New Roman"/>
+        </w:rPr>
+        <w:t>Analysis.</w:t>
+      </w:r>
+      <w:r>
+        <w:rPr>
+          <w:rFonts w:ascii="Times New Roman" w:eastAsia="Times New Roman" w:hAnsi="Times New Roman" w:cs="Times New Roman"/>
+        </w:rPr>
+        <w:t xml:space="preserve"> </w:t>
+      </w:r>
+      <w:r>
+        <w:rPr>
+          <w:rFonts w:ascii="Times New Roman" w:eastAsia="Times New Roman" w:hAnsi="Times New Roman" w:cs="Times New Roman"/>
+        </w:rPr>
+        <w:t>R code with the appropriate statistics to test the hypotheses</w:t>
+      </w:r>
+      <w:r>
+        <w:rPr>
+          <w:rFonts w:ascii="Times New Roman" w:eastAsia="Times New Roman" w:hAnsi="Times New Roman" w:cs="Times New Roman"/>
+        </w:rPr>
+        <w:t xml:space="preserve">. </w:t>
+      </w:r>
+    </w:p>
+    <w:p>
+      <w:pPr>
+        <w:pStyle w:val="ListParagraph"/>
+        <w:ind w:left="2250" w:hanging="810"/>
+        <w:rPr>
+          <w:rFonts w:ascii="Times New Roman" w:eastAsia="Times New Roman" w:hAnsi="Times New Roman" w:cs="Times New Roman"/>
+        </w:rPr>
+      </w:pPr>
+    </w:p>
+    <w:p>
+      <w:pPr>
+        <w:pStyle w:val="ListParagraph"/>
+        <w:ind w:left="2250" w:hanging="810"/>
+        <w:rPr>
+          <w:rFonts w:ascii="Times New Roman" w:eastAsia="Times New Roman" w:hAnsi="Times New Roman" w:cs="Times New Roman"/>
+        </w:rPr>
+      </w:pPr>
+      <w:r>
+        <w:rPr>
+          <w:rFonts w:ascii="Times New Roman" w:eastAsia="Times New Roman" w:hAnsi="Times New Roman" w:cs="Times New Roman"/>
+          <w:b/>
+          <w:bCs/>
+        </w:rPr>
+        <w:t>A1. R code for Visualisation</w:t>
+      </w:r>
+    </w:p>
+    <w:p>
+      <w:pPr>
+        <w:pStyle w:val="ListParagraph"/>
+        <w:ind w:left="2250" w:hanging="810"/>
+        <w:rPr>
+          <w:rFonts w:ascii="Times New Roman" w:eastAsia="Times New Roman" w:hAnsi="Times New Roman" w:cs="Times New Roman"/>
+        </w:rPr>
+      </w:pPr>
+    </w:p>
+    <w:p>
+      <w:pPr>
+        <w:pStyle w:val="ListParagraph"/>
+        <w:ind w:left="2250" w:hanging="810"/>
+        <w:rPr>
+          <w:rFonts w:ascii="Times New Roman" w:eastAsia="Times New Roman" w:hAnsi="Times New Roman" w:cs="Times New Roman"/>
+        </w:rPr>
+      </w:pPr>
+    </w:p>
+    <w:p>
+      <w:pPr>
+        <w:pStyle w:val="ListParagraph"/>
+        <w:ind w:left="2250" w:hanging="810"/>
+        <w:rPr>
+          <w:rFonts w:ascii="Times New Roman" w:eastAsia="Times New Roman" w:hAnsi="Times New Roman" w:cs="Times New Roman"/>
+        </w:rPr>
+      </w:pPr>
+    </w:p>
+    <w:p>
+      <w:pPr>
+        <w:pStyle w:val="ListParagraph"/>
+        <w:ind w:left="2250" w:hanging="810"/>
+        <w:rPr>
+          <w:rFonts w:ascii="Times New Roman" w:eastAsia="Times New Roman" w:hAnsi="Times New Roman" w:cs="Times New Roman"/>
+          <w:b/>
+          <w:bCs/>
+        </w:rPr>
+      </w:pPr>
+      <w:r>
+        <w:rPr>
+          <w:rFonts w:ascii="Times New Roman" w:eastAsia="Times New Roman" w:hAnsi="Times New Roman" w:cs="Times New Roman"/>
+          <w:b/>
+          <w:bCs/>
+        </w:rPr>
+        <w:lastRenderedPageBreak/>
+        <w:t>A2. R code for Analysis</w:t>
+      </w:r>
+    </w:p>
+    <w:p>
+      <w:pPr>
+        <w:pStyle w:val="ListParagraph"/>
+        <w:ind w:left="2250" w:hanging="810"/>
+        <w:rPr>
+          <w:rFonts w:ascii="Times New Roman" w:eastAsia="Times New Roman" w:hAnsi="Times New Roman" w:cs="Times New Roman"/>
+          <w:b/>
+          <w:bCs/>
+        </w:rPr>
+      </w:pPr>
+    </w:p>
+    <w:p>
+      <w:pPr>
+        <w:pStyle w:val="ListParagraph"/>
+        <w:ind w:left="2250" w:hanging="810"/>
+        <w:rPr>
+          <w:rFonts w:ascii="Times New Roman" w:eastAsia="Times New Roman" w:hAnsi="Times New Roman" w:cs="Times New Roman"/>
+          <w:b/>
+          <w:bCs/>
+        </w:rPr>
+      </w:pPr>
+      <w:r>
+        <w:rPr>
+          <w:rFonts w:ascii="Times New Roman" w:eastAsia="Times New Roman" w:hAnsi="Times New Roman" w:cs="Times New Roman"/>
+        </w:rPr>
+        <w:t>#Reference dataset as df</w:t>
+      </w:r>
+    </w:p>
+    <w:p>
+      <w:pPr>
+        <w:pStyle w:val="ListParagraph"/>
+        <w:ind w:left="2250" w:hanging="810"/>
+        <w:rPr>
+          <w:rFonts w:ascii="Times New Roman" w:eastAsia="Times New Roman" w:hAnsi="Times New Roman" w:cs="Times New Roman"/>
+        </w:rPr>
+      </w:pPr>
+      <w:r>
+        <w:rPr>
+          <w:rFonts w:ascii="Times New Roman" w:eastAsia="Times New Roman" w:hAnsi="Times New Roman" w:cs="Times New Roman"/>
+        </w:rPr>
+        <w:t>df &lt;- read.csv("dataset/Sleep_health_and_lifestyle_dataset.csv")</w:t>
+      </w:r>
+    </w:p>
+    <w:p>
+      <w:pPr>
+        <w:pStyle w:val="ListParagraph"/>
+        <w:ind w:left="2250" w:hanging="810"/>
+        <w:rPr>
+          <w:rFonts w:ascii="Times New Roman" w:eastAsia="Times New Roman" w:hAnsi="Times New Roman" w:cs="Times New Roman"/>
+        </w:rPr>
+      </w:pPr>
+    </w:p>
+    <w:p>
+      <w:pPr>
+        <w:pStyle w:val="ListParagraph"/>
+        <w:ind w:left="2250" w:hanging="810"/>
+        <w:rPr>
+          <w:rFonts w:ascii="Times New Roman" w:eastAsia="Times New Roman" w:hAnsi="Times New Roman" w:cs="Times New Roman"/>
+        </w:rPr>
+      </w:pPr>
+      <w:r>
+        <w:rPr>
+          <w:rFonts w:ascii="Times New Roman" w:eastAsia="Times New Roman" w:hAnsi="Times New Roman" w:cs="Times New Roman"/>
+        </w:rPr>
+        <w:t xml:space="preserve">#Creates a subset </w:t>
+      </w:r>
+      <w:r>
+        <w:rPr>
+          <w:rFonts w:ascii="Times New Roman" w:eastAsia="Times New Roman" w:hAnsi="Times New Roman" w:cs="Times New Roman"/>
+        </w:rPr>
+        <w:t>of rows with only</w:t>
+      </w:r>
+      <w:r>
+        <w:rPr>
+          <w:rFonts w:ascii="Times New Roman" w:eastAsia="Times New Roman" w:hAnsi="Times New Roman" w:cs="Times New Roman"/>
+        </w:rPr>
+        <w:t xml:space="preserve"> doctor or engineer as occupation</w:t>
+      </w:r>
+    </w:p>
+    <w:p>
+      <w:pPr>
+        <w:pStyle w:val="ListParagraph"/>
+        <w:ind w:left="2250" w:hanging="810"/>
+        <w:rPr>
+          <w:rFonts w:ascii="Times New Roman" w:eastAsia="Times New Roman" w:hAnsi="Times New Roman" w:cs="Times New Roman"/>
+        </w:rPr>
+      </w:pPr>
+      <w:r>
+        <w:rPr>
+          <w:rFonts w:ascii="Times New Roman" w:eastAsia="Times New Roman" w:hAnsi="Times New Roman" w:cs="Times New Roman"/>
+        </w:rPr>
+        <w:t>subset_df &lt;- subset(df, Occupation == "Doctor" | Occupation == "Engineer")</w:t>
+      </w:r>
+    </w:p>
+    <w:p>
+      <w:pPr>
+        <w:pStyle w:val="ListParagraph"/>
+        <w:ind w:left="2250" w:hanging="810"/>
+        <w:rPr>
+          <w:rFonts w:ascii="Times New Roman" w:eastAsia="Times New Roman" w:hAnsi="Times New Roman" w:cs="Times New Roman"/>
+        </w:rPr>
+      </w:pPr>
+    </w:p>
+    <w:p>
+      <w:pPr>
+        <w:pStyle w:val="ListParagraph"/>
+        <w:ind w:left="2250" w:hanging="810"/>
+        <w:rPr>
+          <w:rFonts w:ascii="Times New Roman" w:eastAsia="Times New Roman" w:hAnsi="Times New Roman" w:cs="Times New Roman"/>
+        </w:rPr>
+      </w:pPr>
+      <w:r>
+        <w:rPr>
+          <w:rFonts w:ascii="Times New Roman" w:eastAsia="Times New Roman" w:hAnsi="Times New Roman" w:cs="Times New Roman"/>
+        </w:rPr>
+        <w:t xml:space="preserve">#Renaming the 8th column to Stress for better interpretation of the </w:t>
+      </w:r>
+      <w:r>
+        <w:rPr>
+          <w:rFonts w:ascii="Times New Roman" w:eastAsia="Times New Roman" w:hAnsi="Times New Roman" w:cs="Times New Roman"/>
+        </w:rPr>
+        <w:t>t</w:t>
+      </w:r>
+      <w:r>
+        <w:rPr>
+          <w:rFonts w:ascii="Times New Roman" w:eastAsia="Times New Roman" w:hAnsi="Times New Roman" w:cs="Times New Roman"/>
+        </w:rPr>
+        <w:t>est</w:t>
+      </w:r>
+    </w:p>
+    <w:p>
+      <w:pPr>
+        <w:pStyle w:val="ListParagraph"/>
+        <w:ind w:left="2250" w:hanging="810"/>
+        <w:rPr>
+          <w:rFonts w:ascii="Times New Roman" w:eastAsia="Times New Roman" w:hAnsi="Times New Roman" w:cs="Times New Roman"/>
+        </w:rPr>
+      </w:pPr>
+      <w:r>
+        <w:rPr>
+          <w:rFonts w:ascii="Times New Roman" w:eastAsia="Times New Roman" w:hAnsi="Times New Roman" w:cs="Times New Roman"/>
+        </w:rPr>
+        <w:t>colnames(subset_df)[8]&lt;- "Stress"</w:t>
+      </w:r>
+    </w:p>
+    <w:p>
+      <w:pPr>
+        <w:pStyle w:val="ListParagraph"/>
+        <w:ind w:left="2250" w:hanging="810"/>
+        <w:rPr>
+          <w:rFonts w:ascii="Times New Roman" w:eastAsia="Times New Roman" w:hAnsi="Times New Roman" w:cs="Times New Roman"/>
+        </w:rPr>
+      </w:pPr>
+    </w:p>
+    <w:p>
+      <w:pPr>
+        <w:pStyle w:val="ListParagraph"/>
+        <w:ind w:left="2250" w:hanging="810"/>
+        <w:rPr>
+          <w:rFonts w:ascii="Times New Roman" w:eastAsia="Times New Roman" w:hAnsi="Times New Roman" w:cs="Times New Roman"/>
+        </w:rPr>
+      </w:pPr>
+      <w:r>
+        <w:rPr>
+          <w:rFonts w:ascii="Times New Roman" w:eastAsia="Times New Roman" w:hAnsi="Times New Roman" w:cs="Times New Roman"/>
+        </w:rPr>
+        <w:t>#Runs the Wilcoxon Rank-Sum Test</w:t>
+      </w:r>
+    </w:p>
+    <w:p>
+      <w:pPr>
+        <w:pStyle w:val="ListParagraph"/>
+        <w:ind w:left="2250" w:hanging="810"/>
+        <w:rPr>
+          <w:rFonts w:ascii="Times New Roman" w:eastAsia="Times New Roman" w:hAnsi="Times New Roman" w:cs="Times New Roman"/>
+        </w:rPr>
+      </w:pPr>
+      <w:r>
+        <w:rPr>
+          <w:rFonts w:ascii="Times New Roman" w:eastAsia="Times New Roman" w:hAnsi="Times New Roman" w:cs="Times New Roman"/>
+        </w:rPr>
+        <w:t>wilcox.test(Stress ~ Occupation, data=subset_df)</w:t>
+      </w:r>
+    </w:p>
+    <w:p>
+      <w:pPr>
+        <w:pStyle w:val="ListParagraph"/>
+        <w:ind w:left="2250" w:hanging="810"/>
+        <w:rPr>
+          <w:rFonts w:ascii="Times New Roman" w:eastAsia="Times New Roman" w:hAnsi="Times New Roman" w:cs="Times New Roman"/>
+        </w:rPr>
+      </w:pPr>
     </w:p>
     <w:p>
       <w:pPr>
@@ -5299,6 +5611,16 @@
         </w:rPr>
         <w:t>It should compute appropriate statistics to test the hypotheses</w:t>
       </w:r>
+    </w:p>
+    <w:p>
+      <w:pPr>
+        <w:pStyle w:val="ListParagraph"/>
+        <w:ind w:left="1440"/>
+        <w:rPr>
+          <w:rFonts w:ascii="Times New Roman" w:eastAsia="Times New Roman" w:hAnsi="Times New Roman" w:cs="Times New Roman"/>
+          <w:highlight w:val="yellow"/>
+        </w:rPr>
+      </w:pPr>
     </w:p>
     <w:p>
       <w:pPr>
@@ -10208,6 +10530,12 @@
       <w:rFonts w:ascii="Times New Roman" w:hAnsi="Times New Roman" w:cs="Times New Roman"/>
     </w:rPr>
   </w:style>
+  <w:style w:type="paragraph" w:styleId="NoSpacing">
+    <w:name w:val="No Spacing"/>
+    <w:uiPriority w:val="1"/>
+    <w:qFormat/>
+    <w:rsid w:val="00633BB0"/>
+  </w:style>
 </w:styles>
 </file>
 
@@ -10392,7 +10720,9 @@
     <w:rsid w:val="0020251E"/>
     <w:rsid w:val="00434C71"/>
     <w:rsid w:val="00797ABC"/>
+    <w:rsid w:val="00835653"/>
     <w:rsid w:val="00971FE2"/>
+    <w:rsid w:val="00B1466C"/>
     <w:rsid w:val="00C0617B"/>
     <w:rsid w:val="00D13753"/>
     <w:rsid w:val="00D955E6"/>

</xml_diff>

<commit_message>
comment on github log output
</commit_message>
<xml_diff>
--- a/report/7COM1079_Group_A104_Report.docx
+++ b/report/7COM1079_Group_A104_Report.docx
@@ -4106,19 +4106,11 @@
           <w:rFonts w:ascii="Times New Roman" w:eastAsia="Times New Roman" w:hAnsi="Times New Roman" w:cs="Times New Roman"/>
         </w:rPr>
       </w:pPr>
-      <w:proofErr w:type="gramStart"/>
-      <w:r>
-        <w:rPr>
-          <w:rFonts w:ascii="Times New Roman" w:eastAsia="Times New Roman" w:hAnsi="Times New Roman" w:cs="Times New Roman"/>
-        </w:rPr>
-        <w:t>The  team</w:t>
-      </w:r>
-      <w:proofErr w:type="gramEnd"/>
-      <w:r>
-        <w:rPr>
-          <w:rFonts w:ascii="Times New Roman" w:eastAsia="Times New Roman" w:hAnsi="Times New Roman" w:cs="Times New Roman"/>
-        </w:rPr>
-        <w:t xml:space="preserve"> communicated effectively, shared responsibilities fairly, and maintained good collaboration throughout the project, regular meetings helped keep everyone aligned, and each member delivered their task om time.</w:t>
+      <w:r>
+        <w:rPr>
+          <w:rFonts w:ascii="Times New Roman" w:eastAsia="Times New Roman" w:hAnsi="Times New Roman" w:cs="Times New Roman"/>
+        </w:rPr>
+        <w:t>The  team communicated effectively, shared responsibilities fairly, and maintained good collaboration throughout the project, regular meetings helped keep everyone aligned, and each member delivered their task om time.</w:t>
       </w:r>
     </w:p>
     <w:p>
@@ -4185,21 +4177,7 @@
         <w:rPr>
           <w:rFonts w:ascii="Times New Roman" w:eastAsia="Times New Roman" w:hAnsi="Times New Roman" w:cs="Times New Roman"/>
         </w:rPr>
-        <w:t xml:space="preserve">Some </w:t>
-      </w:r>
-      <w:proofErr w:type="gramStart"/>
-      <w:r>
-        <w:rPr>
-          <w:rFonts w:ascii="Times New Roman" w:eastAsia="Times New Roman" w:hAnsi="Times New Roman" w:cs="Times New Roman"/>
-        </w:rPr>
-        <w:t>task</w:t>
-      </w:r>
-      <w:proofErr w:type="gramEnd"/>
-      <w:r>
-        <w:rPr>
-          <w:rFonts w:ascii="Times New Roman" w:eastAsia="Times New Roman" w:hAnsi="Times New Roman" w:cs="Times New Roman"/>
-        </w:rPr>
-        <w:t xml:space="preserve"> lacked clear planning at the start, which led to delays, a few meetings could have been better attended, and earlier integration of individual crisis would have prevented last minute issues, using the necessary tools required for the task more consistently would make future work smoother and reduce confusion.</w:t>
+        <w:t>Some task lacked clear planning at the start, which led to delays, a few meetings could have been better attended, and earlier integration of individual crisis would have prevented last minute issues, using the necessary tools required for the task more consistently would make future work smoother and reduce confusion.</w:t>
       </w:r>
     </w:p>
     <w:p>
@@ -4246,35 +4224,7 @@
         <w:rPr>
           <w:rFonts w:ascii="Times New Roman" w:eastAsia="Times New Roman" w:hAnsi="Times New Roman" w:cs="Times New Roman"/>
         </w:rPr>
-        <w:t xml:space="preserve">Time management was effective, with core deadlines being met, Certain task </w:t>
-      </w:r>
-      <w:proofErr w:type="gramStart"/>
-      <w:r>
-        <w:rPr>
-          <w:rFonts w:ascii="Times New Roman" w:eastAsia="Times New Roman" w:hAnsi="Times New Roman" w:cs="Times New Roman"/>
-        </w:rPr>
-        <w:t>were</w:t>
-      </w:r>
-      <w:proofErr w:type="gramEnd"/>
-      <w:r>
-        <w:rPr>
-          <w:rFonts w:ascii="Times New Roman" w:eastAsia="Times New Roman" w:hAnsi="Times New Roman" w:cs="Times New Roman"/>
-        </w:rPr>
-        <w:t xml:space="preserve"> completed later than planned, increasing pressure near end, better scheduling and earlier progress checks would have improved </w:t>
-      </w:r>
-      <w:proofErr w:type="gramStart"/>
-      <w:r>
-        <w:rPr>
-          <w:rFonts w:ascii="Times New Roman" w:eastAsia="Times New Roman" w:hAnsi="Times New Roman" w:cs="Times New Roman"/>
-        </w:rPr>
-        <w:t>work flow</w:t>
-      </w:r>
-      <w:proofErr w:type="gramEnd"/>
-      <w:r>
-        <w:rPr>
-          <w:rFonts w:ascii="Times New Roman" w:eastAsia="Times New Roman" w:hAnsi="Times New Roman" w:cs="Times New Roman"/>
-        </w:rPr>
-        <w:t>, the team adapted well when challenges emerged and ensured the project was completed successfully.</w:t>
+        <w:t>Time management was effective, with core deadlines being met, Certain task were completed later than planned, increasing pressure near end, better scheduling and earlier progress checks would have improved work flow, the team adapted well when challenges emerged and ensured the project was completed successfully.</w:t>
       </w:r>
     </w:p>
     <w:p>
@@ -4322,21 +4272,7 @@
         <w:rPr>
           <w:rFonts w:ascii="Times New Roman" w:eastAsia="Times New Roman" w:hAnsi="Times New Roman" w:cs="Times New Roman"/>
         </w:rPr>
-        <w:t xml:space="preserve">The team met most of its objectives and demonstrated solid </w:t>
-      </w:r>
-      <w:proofErr w:type="gramStart"/>
-      <w:r>
-        <w:rPr>
-          <w:rFonts w:ascii="Times New Roman" w:eastAsia="Times New Roman" w:hAnsi="Times New Roman" w:cs="Times New Roman"/>
-        </w:rPr>
-        <w:t>team work</w:t>
-      </w:r>
-      <w:proofErr w:type="gramEnd"/>
-      <w:r>
-        <w:rPr>
-          <w:rFonts w:ascii="Times New Roman" w:eastAsia="Times New Roman" w:hAnsi="Times New Roman" w:cs="Times New Roman"/>
-        </w:rPr>
-        <w:t xml:space="preserve"> and technical understanding, the quality of work was consistent, and the solution functioned as intended, there was always a room additional refinement, the outcome was well coordinated.</w:t>
+        <w:t>The team met most of its objectives and demonstrated solid team work and technical understanding, the quality of work was consistent, and the solution functioned as intended, there was always a room additional refinement, the outcome was well coordinated.</w:t>
       </w:r>
     </w:p>
     <w:p>
@@ -4458,6 +4394,78 @@
     </w:p>
     <w:p>
       <w:pPr>
+        <w:ind w:left="1440"/>
+        <w:rPr>
+          <w:rFonts w:ascii="Times New Roman" w:eastAsia="Times New Roman" w:hAnsi="Times New Roman" w:cs="Times New Roman"/>
+        </w:rPr>
+      </w:pPr>
+      <w:r>
+        <w:rPr>
+          <w:rFonts w:ascii="Times New Roman" w:eastAsia="Times New Roman" w:hAnsi="Times New Roman" w:cs="Times New Roman"/>
+        </w:rPr>
+        <w:t xml:space="preserve">GitHub logs showed frequent commits from all members, proving active </w:t>
+      </w:r>
+      <w:r>
+        <w:rPr>
+          <w:rFonts w:ascii="Times New Roman" w:eastAsia="Times New Roman" w:hAnsi="Times New Roman" w:cs="Times New Roman"/>
+        </w:rPr>
+        <w:t>participation.</w:t>
+      </w:r>
+    </w:p>
+    <w:p>
+      <w:pPr>
+        <w:ind w:left="1440"/>
+        <w:rPr>
+          <w:rFonts w:ascii="Times New Roman" w:eastAsia="Times New Roman" w:hAnsi="Times New Roman" w:cs="Times New Roman"/>
+        </w:rPr>
+      </w:pPr>
+      <w:r>
+        <w:rPr>
+          <w:rFonts w:ascii="Times New Roman" w:eastAsia="Times New Roman" w:hAnsi="Times New Roman" w:cs="Times New Roman"/>
+        </w:rPr>
+        <w:t>Commit messages were generally clear and informative.</w:t>
+      </w:r>
+    </w:p>
+    <w:p>
+      <w:pPr>
+        <w:ind w:left="1440"/>
+        <w:rPr>
+          <w:rFonts w:ascii="Times New Roman" w:eastAsia="Times New Roman" w:hAnsi="Times New Roman" w:cs="Times New Roman"/>
+        </w:rPr>
+      </w:pPr>
+      <w:r>
+        <w:rPr>
+          <w:rFonts w:ascii="Times New Roman" w:eastAsia="Times New Roman" w:hAnsi="Times New Roman" w:cs="Times New Roman"/>
+        </w:rPr>
+        <w:t>A more uniform commit strategy ( example naming convention, timing) could improve traceability.</w:t>
+      </w:r>
+    </w:p>
+    <w:p>
+      <w:pPr>
+        <w:ind w:left="1440"/>
+        <w:rPr>
+          <w:rFonts w:ascii="Times New Roman" w:eastAsia="Times New Roman" w:hAnsi="Times New Roman" w:cs="Times New Roman"/>
+        </w:rPr>
+      </w:pPr>
+      <w:r>
+        <w:rPr>
+          <w:rFonts w:ascii="Times New Roman" w:eastAsia="Times New Roman" w:hAnsi="Times New Roman" w:cs="Times New Roman"/>
+        </w:rPr>
+        <w:t>Overall, the log output reflects steady progress and balanced workload distribution.</w:t>
+      </w:r>
+    </w:p>
+    <w:p>
+      <w:pPr>
+        <w:ind w:left="1440"/>
+        <w:rPr>
+          <w:rFonts w:ascii="Times New Roman" w:eastAsia="Times New Roman" w:hAnsi="Times New Roman" w:cs="Times New Roman"/>
+          <w:b/>
+          <w:bCs/>
+        </w:rPr>
+      </w:pPr>
+    </w:p>
+    <w:p>
+      <w:pPr>
         <w:pStyle w:val="ListParagraph"/>
         <w:numPr>
           <w:ilvl w:val="1"/>
@@ -4566,8 +4574,6 @@
         <w:ind w:left="1440"/>
         <w:rPr>
           <w:rFonts w:ascii="Times New Roman" w:eastAsia="Times New Roman" w:hAnsi="Times New Roman" w:cs="Times New Roman"/>
-          <w:i/>
-          <w:iCs/>
           <w:highlight w:val="yellow"/>
         </w:rPr>
       </w:pPr>
@@ -5065,6 +5071,7 @@
         <w:rPr>
           <w:rFonts w:ascii="Times New Roman" w:eastAsia="Times New Roman" w:hAnsi="Times New Roman" w:cs="Times New Roman"/>
         </w:rPr>
+        <w:lastRenderedPageBreak/>
         <w:t>Johnson, J.V., Stewart, W., Hall, E.M., Fredlund, P. and Theorell, T. (1996) ‘Long-term psychosocial work environment and cardiovascular mortality among Swedish men’, American journal of public health (1971), 86(3), pp. 324–331.</w:t>
       </w:r>
     </w:p>
@@ -5179,21 +5186,7 @@
         <w:rPr>
           <w:rFonts w:ascii="Times New Roman" w:eastAsia="Times New Roman" w:hAnsi="Times New Roman" w:cs="Times New Roman"/>
         </w:rPr>
-        <w:t xml:space="preserve">Shanafelt, T.D., Hasan, O., Dyrbye, L.N., Sinsky, C., Satele, D., Sloan, J. and West, C.P. (2015) ‘Changes in Burnout and Satisfaction </w:t>
-      </w:r>
-      <w:proofErr w:type="gramStart"/>
-      <w:r>
-        <w:rPr>
-          <w:rFonts w:ascii="Times New Roman" w:eastAsia="Times New Roman" w:hAnsi="Times New Roman" w:cs="Times New Roman"/>
-        </w:rPr>
-        <w:t>With</w:t>
-      </w:r>
-      <w:proofErr w:type="gramEnd"/>
-      <w:r>
-        <w:rPr>
-          <w:rFonts w:ascii="Times New Roman" w:eastAsia="Times New Roman" w:hAnsi="Times New Roman" w:cs="Times New Roman"/>
-        </w:rPr>
-        <w:t xml:space="preserve"> Work-Life Balance in Physicians and the General US Working Population Between 2011 and 2014’, Mayo Clinic proceedings, 90(12), pp. 1600–1613.</w:t>
+        <w:t>Shanafelt, T.D., Hasan, O., Dyrbye, L.N., Sinsky, C., Satele, D., Sloan, J. and West, C.P. (2015) ‘Changes in Burnout and Satisfaction With Work-Life Balance in Physicians and the General US Working Population Between 2011 and 2014’, Mayo Clinic proceedings, 90(12), pp. 1600–1613.</w:t>
       </w:r>
     </w:p>
     <w:p>
@@ -5612,17 +5605,9 @@
         <w:rPr>
           <w:rFonts w:ascii="Times New Roman" w:eastAsia="Times New Roman" w:hAnsi="Times New Roman" w:cs="Times New Roman"/>
         </w:rPr>
-        <w:t xml:space="preserve"> &lt;- </w:t>
-      </w:r>
-      <w:proofErr w:type="gramStart"/>
-      <w:r>
-        <w:rPr>
-          <w:rFonts w:ascii="Times New Roman" w:eastAsia="Times New Roman" w:hAnsi="Times New Roman" w:cs="Times New Roman"/>
-        </w:rPr>
-        <w:t>subset(</w:t>
+        <w:t xml:space="preserve"> &lt;- subset(</w:t>
       </w:r>
       <w:proofErr w:type="spellStart"/>
-      <w:proofErr w:type="gramEnd"/>
       <w:r>
         <w:rPr>
           <w:rFonts w:ascii="Times New Roman" w:eastAsia="Times New Roman" w:hAnsi="Times New Roman" w:cs="Times New Roman"/>
@@ -5700,28 +5685,14 @@
         <w:rPr>
           <w:rFonts w:ascii="Times New Roman" w:eastAsia="Times New Roman" w:hAnsi="Times New Roman" w:cs="Times New Roman"/>
         </w:rPr>
-        <w:t>subset_</w:t>
-      </w:r>
-      <w:proofErr w:type="gramStart"/>
-      <w:r>
-        <w:rPr>
-          <w:rFonts w:ascii="Times New Roman" w:eastAsia="Times New Roman" w:hAnsi="Times New Roman" w:cs="Times New Roman"/>
-        </w:rPr>
-        <w:t>df</w:t>
+        <w:t>subset_df</w:t>
       </w:r>
       <w:proofErr w:type="spellEnd"/>
       <w:r>
         <w:rPr>
           <w:rFonts w:ascii="Times New Roman" w:eastAsia="Times New Roman" w:hAnsi="Times New Roman" w:cs="Times New Roman"/>
         </w:rPr>
-        <w:t>)[8]&lt;</w:t>
-      </w:r>
-      <w:proofErr w:type="gramEnd"/>
-      <w:r>
-        <w:rPr>
-          <w:rFonts w:ascii="Times New Roman" w:eastAsia="Times New Roman" w:hAnsi="Times New Roman" w:cs="Times New Roman"/>
-        </w:rPr>
-        <w:t>- "Stress"</w:t>
+        <w:t>)[8]&lt;- "Stress"</w:t>
       </w:r>
     </w:p>
     <w:p>
@@ -5761,28 +5732,14 @@
         <w:rPr>
           <w:rFonts w:ascii="Times New Roman" w:eastAsia="Times New Roman" w:hAnsi="Times New Roman" w:cs="Times New Roman"/>
         </w:rPr>
-        <w:t>wilcox.</w:t>
-      </w:r>
-      <w:proofErr w:type="gramStart"/>
-      <w:r>
-        <w:rPr>
-          <w:rFonts w:ascii="Times New Roman" w:eastAsia="Times New Roman" w:hAnsi="Times New Roman" w:cs="Times New Roman"/>
-        </w:rPr>
-        <w:t>test</w:t>
+        <w:t>wilcox.test</w:t>
       </w:r>
       <w:proofErr w:type="spellEnd"/>
       <w:r>
         <w:rPr>
           <w:rFonts w:ascii="Times New Roman" w:eastAsia="Times New Roman" w:hAnsi="Times New Roman" w:cs="Times New Roman"/>
         </w:rPr>
-        <w:t>(</w:t>
-      </w:r>
-      <w:proofErr w:type="gramEnd"/>
-      <w:r>
-        <w:rPr>
-          <w:rFonts w:ascii="Times New Roman" w:eastAsia="Times New Roman" w:hAnsi="Times New Roman" w:cs="Times New Roman"/>
-        </w:rPr>
-        <w:t>Stress ~ Occupation, data=</w:t>
+        <w:t>(Stress ~ Occupation, data=</w:t>
       </w:r>
       <w:proofErr w:type="spellStart"/>
       <w:r>
@@ -11008,6 +10965,7 @@
     <w:rsid w:val="00185D8D"/>
     <w:rsid w:val="0020251E"/>
     <w:rsid w:val="00434C71"/>
+    <w:rsid w:val="004F3EA5"/>
     <w:rsid w:val="0052003E"/>
     <w:rsid w:val="00657902"/>
     <w:rsid w:val="006658B9"/>
@@ -11017,6 +10975,7 @@
     <w:rsid w:val="00835653"/>
     <w:rsid w:val="00971FE2"/>
     <w:rsid w:val="009B610C"/>
+    <w:rsid w:val="00A33D86"/>
     <w:rsid w:val="00B1466C"/>
     <w:rsid w:val="00C0617B"/>
     <w:rsid w:val="00D13753"/>

</xml_diff>

<commit_message>
Word comment on the GIthub log output
</commit_message>
<xml_diff>
--- a/report/7COM1079_Group_A104_Report.docx
+++ b/report/7COM1079_Group_A104_Report.docx
@@ -4621,7 +4621,7 @@
           <w:iCs/>
           <w:highlight w:val="yellow"/>
         </w:rPr>
-        <w:t xml:space="preserve"> [Insert Commit Message] Brief explanation of </w:t>
+        <w:t xml:space="preserve"> [</w:t>
       </w:r>
       <w:r>
         <w:rPr>
@@ -4630,7 +4630,7 @@
           <w:iCs/>
           <w:highlight w:val="yellow"/>
         </w:rPr>
-        <w:t>the broader</w:t>
+        <w:t>“I personally committed to github”</w:t>
       </w:r>
       <w:r>
         <w:rPr>
@@ -4639,7 +4639,7 @@
           <w:iCs/>
           <w:highlight w:val="yellow"/>
         </w:rPr>
-        <w:t xml:space="preserve"> impact</w:t>
+        <w:t xml:space="preserve">] Brief explanation of </w:t>
       </w:r>
       <w:r>
         <w:rPr>
@@ -4648,7 +4648,55 @@
           <w:iCs/>
           <w:highlight w:val="yellow"/>
         </w:rPr>
+        <w:t>the broader</w:t>
+      </w:r>
+      <w:r>
+        <w:rPr>
+          <w:rFonts w:ascii="Times New Roman" w:eastAsia="Times New Roman" w:hAnsi="Times New Roman" w:cs="Times New Roman"/>
+          <w:i/>
+          <w:iCs/>
+          <w:highlight w:val="yellow"/>
+        </w:rPr>
+        <w:t xml:space="preserve"> impact</w:t>
+      </w:r>
+      <w:r>
+        <w:rPr>
+          <w:rFonts w:ascii="Times New Roman" w:eastAsia="Times New Roman" w:hAnsi="Times New Roman" w:cs="Times New Roman"/>
+          <w:i/>
+          <w:iCs/>
+          <w:highlight w:val="yellow"/>
+        </w:rPr>
         <w:t xml:space="preserve"> of the change</w:t>
+      </w:r>
+      <w:r>
+        <w:rPr>
+          <w:rFonts w:ascii="Times New Roman" w:eastAsia="Times New Roman" w:hAnsi="Times New Roman" w:cs="Times New Roman"/>
+          <w:i/>
+          <w:iCs/>
+          <w:highlight w:val="yellow"/>
+        </w:rPr>
+        <w:t xml:space="preserve"> </w:t>
+      </w:r>
+    </w:p>
+    <w:p>
+      <w:pPr>
+        <w:spacing w:before="240" w:after="240"/>
+        <w:ind w:left="1890"/>
+        <w:rPr>
+          <w:rFonts w:ascii="Times New Roman" w:eastAsia="Times New Roman" w:hAnsi="Times New Roman" w:cs="Times New Roman"/>
+          <w:i/>
+          <w:iCs/>
+          <w:highlight w:val="yellow"/>
+        </w:rPr>
+      </w:pPr>
+      <w:r>
+        <w:rPr>
+          <w:rFonts w:ascii="Times New Roman" w:eastAsia="Times New Roman" w:hAnsi="Times New Roman" w:cs="Times New Roman"/>
+          <w:i/>
+          <w:iCs/>
+          <w:highlight w:val="yellow"/>
+        </w:rPr>
+        <w:t>Evaluation of the report, Updating references.</w:t>
       </w:r>
     </w:p>
     <w:p>
@@ -4685,7 +4733,7 @@
           <w:iCs/>
           <w:highlight w:val="yellow"/>
         </w:rPr>
-        <w:t xml:space="preserve"> [Insert Commit Message] Brief explanation of the </w:t>
+        <w:t xml:space="preserve"> [</w:t>
       </w:r>
       <w:r>
         <w:rPr>
@@ -4694,7 +4742,46 @@
           <w:iCs/>
           <w:highlight w:val="yellow"/>
         </w:rPr>
+        <w:t xml:space="preserve">Teammates major commits </w:t>
+      </w:r>
+      <w:r>
+        <w:rPr>
+          <w:rFonts w:ascii="Times New Roman" w:eastAsia="Times New Roman" w:hAnsi="Times New Roman" w:cs="Times New Roman"/>
+          <w:i/>
+          <w:iCs/>
+          <w:highlight w:val="yellow"/>
+        </w:rPr>
+        <w:t xml:space="preserve">] Brief explanation of the </w:t>
+      </w:r>
+      <w:r>
+        <w:rPr>
+          <w:rFonts w:ascii="Times New Roman" w:eastAsia="Times New Roman" w:hAnsi="Times New Roman" w:cs="Times New Roman"/>
+          <w:i/>
+          <w:iCs/>
+          <w:highlight w:val="yellow"/>
+        </w:rPr>
         <w:t>broader impact of the change</w:t>
+      </w:r>
+    </w:p>
+    <w:p>
+      <w:pPr>
+        <w:spacing w:before="240" w:after="240"/>
+        <w:ind w:left="1890"/>
+        <w:rPr>
+          <w:rFonts w:ascii="Times New Roman" w:eastAsia="Times New Roman" w:hAnsi="Times New Roman" w:cs="Times New Roman"/>
+          <w:i/>
+          <w:iCs/>
+          <w:highlight w:val="yellow"/>
+        </w:rPr>
+      </w:pPr>
+      <w:r>
+        <w:rPr>
+          <w:rFonts w:ascii="Times New Roman" w:eastAsia="Times New Roman" w:hAnsi="Times New Roman" w:cs="Times New Roman"/>
+          <w:i/>
+          <w:iCs/>
+          <w:highlight w:val="yellow"/>
+        </w:rPr>
+        <w:t>My teammates uploaded sections of the report, added findings and updated the appendix .</w:t>
       </w:r>
     </w:p>
     <w:p>
@@ -4731,7 +4818,7 @@
           <w:iCs/>
           <w:highlight w:val="yellow"/>
         </w:rPr>
-        <w:t xml:space="preserve"> [Insert Commit Message] Brief explanation of the </w:t>
+        <w:t xml:space="preserve"> [</w:t>
       </w:r>
       <w:r>
         <w:rPr>
@@ -4740,7 +4827,46 @@
           <w:iCs/>
           <w:highlight w:val="yellow"/>
         </w:rPr>
+        <w:t xml:space="preserve">Style of commit messages </w:t>
+      </w:r>
+      <w:r>
+        <w:rPr>
+          <w:rFonts w:ascii="Times New Roman" w:eastAsia="Times New Roman" w:hAnsi="Times New Roman" w:cs="Times New Roman"/>
+          <w:i/>
+          <w:iCs/>
+          <w:highlight w:val="yellow"/>
+        </w:rPr>
+        <w:t xml:space="preserve">] Brief explanation of the </w:t>
+      </w:r>
+      <w:r>
+        <w:rPr>
+          <w:rFonts w:ascii="Times New Roman" w:eastAsia="Times New Roman" w:hAnsi="Times New Roman" w:cs="Times New Roman"/>
+          <w:i/>
+          <w:iCs/>
+          <w:highlight w:val="yellow"/>
+        </w:rPr>
         <w:t>broader impact of the change</w:t>
+      </w:r>
+    </w:p>
+    <w:p>
+      <w:pPr>
+        <w:spacing w:before="240" w:after="240"/>
+        <w:ind w:left="1890"/>
+        <w:rPr>
+          <w:rFonts w:ascii="Times New Roman" w:eastAsia="Times New Roman" w:hAnsi="Times New Roman" w:cs="Times New Roman"/>
+          <w:i/>
+          <w:iCs/>
+          <w:highlight w:val="yellow"/>
+        </w:rPr>
+      </w:pPr>
+      <w:r>
+        <w:rPr>
+          <w:rFonts w:ascii="Times New Roman" w:eastAsia="Times New Roman" w:hAnsi="Times New Roman" w:cs="Times New Roman"/>
+          <w:i/>
+          <w:iCs/>
+          <w:highlight w:val="yellow"/>
+        </w:rPr>
+        <w:t>The style of the commit message was simple and clear.</w:t>
       </w:r>
     </w:p>
     <w:p>
@@ -4806,6 +4932,7 @@
         <w:rPr>
           <w:rFonts w:ascii="Times New Roman" w:eastAsia="Times New Roman" w:hAnsi="Times New Roman" w:cs="Times New Roman"/>
         </w:rPr>
+        <w:lastRenderedPageBreak/>
         <w:t>Results explained</w:t>
       </w:r>
       <w:r>
@@ -5071,7 +5198,6 @@
         <w:rPr>
           <w:rFonts w:ascii="Times New Roman" w:eastAsia="Times New Roman" w:hAnsi="Times New Roman" w:cs="Times New Roman"/>
         </w:rPr>
-        <w:lastRenderedPageBreak/>
         <w:t>Johnson, J.V., Stewart, W., Hall, E.M., Fredlund, P. and Theorell, T. (1996) ‘Long-term psychosocial work environment and cardiovascular mortality among Swedish men’, American journal of public health (1971), 86(3), pp. 324–331.</w:t>
       </w:r>
     </w:p>
@@ -5094,77 +5220,7 @@
         <w:rPr>
           <w:rFonts w:ascii="Times New Roman" w:eastAsia="Times New Roman" w:hAnsi="Times New Roman" w:cs="Times New Roman"/>
         </w:rPr>
-        <w:t xml:space="preserve">LIU, Y., YANG, F., JIN, Y., WU, H., CAO, X. and YIN, Y. (2024) ‘Associations of well-being and sleep quality with occupational stress among locomotive engineers in the Yangtze River Delta region’, Huan </w:t>
-      </w:r>
-      <w:proofErr w:type="spellStart"/>
-      <w:r>
-        <w:rPr>
-          <w:rFonts w:ascii="Times New Roman" w:eastAsia="Times New Roman" w:hAnsi="Times New Roman" w:cs="Times New Roman"/>
-        </w:rPr>
-        <w:t>jing</w:t>
-      </w:r>
-      <w:proofErr w:type="spellEnd"/>
-      <w:r>
-        <w:rPr>
-          <w:rFonts w:ascii="Times New Roman" w:eastAsia="Times New Roman" w:hAnsi="Times New Roman" w:cs="Times New Roman"/>
-        </w:rPr>
-        <w:t xml:space="preserve"> </w:t>
-      </w:r>
-      <w:proofErr w:type="spellStart"/>
-      <w:r>
-        <w:rPr>
-          <w:rFonts w:ascii="Times New Roman" w:eastAsia="Times New Roman" w:hAnsi="Times New Roman" w:cs="Times New Roman"/>
-        </w:rPr>
-        <w:t>yu</w:t>
-      </w:r>
-      <w:proofErr w:type="spellEnd"/>
-      <w:r>
-        <w:rPr>
-          <w:rFonts w:ascii="Times New Roman" w:eastAsia="Times New Roman" w:hAnsi="Times New Roman" w:cs="Times New Roman"/>
-        </w:rPr>
-        <w:t xml:space="preserve"> </w:t>
-      </w:r>
-      <w:proofErr w:type="spellStart"/>
-      <w:r>
-        <w:rPr>
-          <w:rFonts w:ascii="Times New Roman" w:eastAsia="Times New Roman" w:hAnsi="Times New Roman" w:cs="Times New Roman"/>
-        </w:rPr>
-        <w:t>zhi</w:t>
-      </w:r>
-      <w:proofErr w:type="spellEnd"/>
-      <w:r>
-        <w:rPr>
-          <w:rFonts w:ascii="Times New Roman" w:eastAsia="Times New Roman" w:hAnsi="Times New Roman" w:cs="Times New Roman"/>
-        </w:rPr>
-        <w:t xml:space="preserve"> ye </w:t>
-      </w:r>
-      <w:proofErr w:type="spellStart"/>
-      <w:r>
-        <w:rPr>
-          <w:rFonts w:ascii="Times New Roman" w:eastAsia="Times New Roman" w:hAnsi="Times New Roman" w:cs="Times New Roman"/>
-        </w:rPr>
-        <w:t>yi</w:t>
-      </w:r>
-      <w:proofErr w:type="spellEnd"/>
-      <w:r>
-        <w:rPr>
-          <w:rFonts w:ascii="Times New Roman" w:eastAsia="Times New Roman" w:hAnsi="Times New Roman" w:cs="Times New Roman"/>
-        </w:rPr>
-        <w:t xml:space="preserve"> </w:t>
-      </w:r>
-      <w:proofErr w:type="spellStart"/>
-      <w:r>
-        <w:rPr>
-          <w:rFonts w:ascii="Times New Roman" w:eastAsia="Times New Roman" w:hAnsi="Times New Roman" w:cs="Times New Roman"/>
-        </w:rPr>
-        <w:t>xue</w:t>
-      </w:r>
-      <w:proofErr w:type="spellEnd"/>
-      <w:r>
-        <w:rPr>
-          <w:rFonts w:ascii="Times New Roman" w:eastAsia="Times New Roman" w:hAnsi="Times New Roman" w:cs="Times New Roman"/>
-        </w:rPr>
-        <w:t xml:space="preserve"> = Journal of environmental &amp; occupational medicine, 41(5), pp. 526–532.</w:t>
+        <w:t>LIU, Y., YANG, F., JIN, Y., WU, H., CAO, X. and YIN, Y. (2024) ‘Associations of well-being and sleep quality with occupational stress among locomotive engineers in the Yangtze River Delta region’, Huan jing yu zhi ye yi xue = Journal of environmental &amp; occupational medicine, 41(5), pp. 526–532.</w:t>
       </w:r>
     </w:p>
     <w:p>
@@ -5515,16 +5571,8 @@
         <w:rPr>
           <w:rFonts w:ascii="Times New Roman" w:eastAsia="Times New Roman" w:hAnsi="Times New Roman" w:cs="Times New Roman"/>
         </w:rPr>
-        <w:t xml:space="preserve">#Reference dataset as </w:t>
-      </w:r>
-      <w:proofErr w:type="spellStart"/>
-      <w:r>
-        <w:rPr>
-          <w:rFonts w:ascii="Times New Roman" w:eastAsia="Times New Roman" w:hAnsi="Times New Roman" w:cs="Times New Roman"/>
-        </w:rPr>
-        <w:t>df</w:t>
-      </w:r>
-      <w:proofErr w:type="spellEnd"/>
+        <w:t>#Reference dataset as df</w:t>
+      </w:r>
     </w:p>
     <w:p>
       <w:pPr>
@@ -5534,19 +5582,11 @@
           <w:rFonts w:ascii="Times New Roman" w:eastAsia="Times New Roman" w:hAnsi="Times New Roman" w:cs="Times New Roman"/>
         </w:rPr>
       </w:pPr>
-      <w:proofErr w:type="spellStart"/>
-      <w:r>
-        <w:rPr>
-          <w:rFonts w:ascii="Times New Roman" w:eastAsia="Times New Roman" w:hAnsi="Times New Roman" w:cs="Times New Roman"/>
-        </w:rPr>
-        <w:t>df</w:t>
-      </w:r>
-      <w:proofErr w:type="spellEnd"/>
-      <w:r>
-        <w:rPr>
-          <w:rFonts w:ascii="Times New Roman" w:eastAsia="Times New Roman" w:hAnsi="Times New Roman" w:cs="Times New Roman"/>
-        </w:rPr>
-        <w:t xml:space="preserve"> &lt;- read.csv("dataset/Sleep_health_and_lifestyle_dataset.csv")</w:t>
+      <w:r>
+        <w:rPr>
+          <w:rFonts w:ascii="Times New Roman" w:eastAsia="Times New Roman" w:hAnsi="Times New Roman" w:cs="Times New Roman"/>
+        </w:rPr>
+        <w:t>df &lt;- read.csv("dataset/Sleep_health_and_lifestyle_dataset.csv")</w:t>
       </w:r>
     </w:p>
     <w:p>
@@ -5593,33 +5633,11 @@
           <w:rFonts w:ascii="Times New Roman" w:eastAsia="Times New Roman" w:hAnsi="Times New Roman" w:cs="Times New Roman"/>
         </w:rPr>
       </w:pPr>
-      <w:proofErr w:type="spellStart"/>
-      <w:r>
-        <w:rPr>
-          <w:rFonts w:ascii="Times New Roman" w:eastAsia="Times New Roman" w:hAnsi="Times New Roman" w:cs="Times New Roman"/>
-        </w:rPr>
-        <w:t>subset_df</w:t>
-      </w:r>
-      <w:proofErr w:type="spellEnd"/>
-      <w:r>
-        <w:rPr>
-          <w:rFonts w:ascii="Times New Roman" w:eastAsia="Times New Roman" w:hAnsi="Times New Roman" w:cs="Times New Roman"/>
-        </w:rPr>
-        <w:t xml:space="preserve"> &lt;- subset(</w:t>
-      </w:r>
-      <w:proofErr w:type="spellStart"/>
-      <w:r>
-        <w:rPr>
-          <w:rFonts w:ascii="Times New Roman" w:eastAsia="Times New Roman" w:hAnsi="Times New Roman" w:cs="Times New Roman"/>
-        </w:rPr>
-        <w:t>df</w:t>
-      </w:r>
-      <w:proofErr w:type="spellEnd"/>
-      <w:r>
-        <w:rPr>
-          <w:rFonts w:ascii="Times New Roman" w:eastAsia="Times New Roman" w:hAnsi="Times New Roman" w:cs="Times New Roman"/>
-        </w:rPr>
-        <w:t>, Occupation == "Doctor" | Occupation == "Engineer")</w:t>
+      <w:r>
+        <w:rPr>
+          <w:rFonts w:ascii="Times New Roman" w:eastAsia="Times New Roman" w:hAnsi="Times New Roman" w:cs="Times New Roman"/>
+        </w:rPr>
+        <w:t>subset_df &lt;- subset(df, Occupation == "Doctor" | Occupation == "Engineer")</w:t>
       </w:r>
     </w:p>
     <w:p>
@@ -5666,33 +5684,11 @@
           <w:rFonts w:ascii="Times New Roman" w:eastAsia="Times New Roman" w:hAnsi="Times New Roman" w:cs="Times New Roman"/>
         </w:rPr>
       </w:pPr>
-      <w:proofErr w:type="spellStart"/>
-      <w:r>
-        <w:rPr>
-          <w:rFonts w:ascii="Times New Roman" w:eastAsia="Times New Roman" w:hAnsi="Times New Roman" w:cs="Times New Roman"/>
-        </w:rPr>
-        <w:t>colnames</w:t>
-      </w:r>
-      <w:proofErr w:type="spellEnd"/>
-      <w:r>
-        <w:rPr>
-          <w:rFonts w:ascii="Times New Roman" w:eastAsia="Times New Roman" w:hAnsi="Times New Roman" w:cs="Times New Roman"/>
-        </w:rPr>
-        <w:t>(</w:t>
-      </w:r>
-      <w:proofErr w:type="spellStart"/>
-      <w:r>
-        <w:rPr>
-          <w:rFonts w:ascii="Times New Roman" w:eastAsia="Times New Roman" w:hAnsi="Times New Roman" w:cs="Times New Roman"/>
-        </w:rPr>
-        <w:t>subset_df</w:t>
-      </w:r>
-      <w:proofErr w:type="spellEnd"/>
-      <w:r>
-        <w:rPr>
-          <w:rFonts w:ascii="Times New Roman" w:eastAsia="Times New Roman" w:hAnsi="Times New Roman" w:cs="Times New Roman"/>
-        </w:rPr>
-        <w:t>)[8]&lt;- "Stress"</w:t>
+      <w:r>
+        <w:rPr>
+          <w:rFonts w:ascii="Times New Roman" w:eastAsia="Times New Roman" w:hAnsi="Times New Roman" w:cs="Times New Roman"/>
+        </w:rPr>
+        <w:t>colnames(subset_df)[8]&lt;- "Stress"</w:t>
       </w:r>
     </w:p>
     <w:p>
@@ -5727,33 +5723,12 @@
           <w:rFonts w:ascii="Times New Roman" w:eastAsia="Times New Roman" w:hAnsi="Times New Roman" w:cs="Times New Roman"/>
         </w:rPr>
       </w:pPr>
-      <w:proofErr w:type="spellStart"/>
-      <w:r>
-        <w:rPr>
-          <w:rFonts w:ascii="Times New Roman" w:eastAsia="Times New Roman" w:hAnsi="Times New Roman" w:cs="Times New Roman"/>
-        </w:rPr>
-        <w:t>wilcox.test</w:t>
-      </w:r>
-      <w:proofErr w:type="spellEnd"/>
-      <w:r>
-        <w:rPr>
-          <w:rFonts w:ascii="Times New Roman" w:eastAsia="Times New Roman" w:hAnsi="Times New Roman" w:cs="Times New Roman"/>
-        </w:rPr>
-        <w:t>(Stress ~ Occupation, data=</w:t>
-      </w:r>
-      <w:proofErr w:type="spellStart"/>
-      <w:r>
-        <w:rPr>
-          <w:rFonts w:ascii="Times New Roman" w:eastAsia="Times New Roman" w:hAnsi="Times New Roman" w:cs="Times New Roman"/>
-        </w:rPr>
-        <w:t>subset_df</w:t>
-      </w:r>
-      <w:proofErr w:type="spellEnd"/>
-      <w:r>
-        <w:rPr>
-          <w:rFonts w:ascii="Times New Roman" w:eastAsia="Times New Roman" w:hAnsi="Times New Roman" w:cs="Times New Roman"/>
-        </w:rPr>
-        <w:t>)</w:t>
+      <w:r>
+        <w:rPr>
+          <w:rFonts w:ascii="Times New Roman" w:eastAsia="Times New Roman" w:hAnsi="Times New Roman" w:cs="Times New Roman"/>
+        </w:rPr>
+        <w:lastRenderedPageBreak/>
+        <w:t>wilcox.test(Stress ~ Occupation, data=subset_df)</w:t>
       </w:r>
     </w:p>
     <w:p>
@@ -10961,8 +10936,10 @@
     <w:rsidRoot w:val="00971FE2"/>
     <w:rsid w:val="00092A16"/>
     <w:rsid w:val="00104EF2"/>
+    <w:rsid w:val="001526F6"/>
     <w:rsid w:val="001551D6"/>
     <w:rsid w:val="00185D8D"/>
+    <w:rsid w:val="001D002A"/>
     <w:rsid w:val="0020251E"/>
     <w:rsid w:val="00434C71"/>
     <w:rsid w:val="004F3EA5"/>

</xml_diff>

<commit_message>
Added 2.1 research gap and future directions
</commit_message>
<xml_diff>
--- a/report/7COM1079_Group_A104_Report.docx
+++ b/report/7COM1079_Group_A104_Report.docx
@@ -2694,19 +2694,7 @@
         <w:rPr>
           <w:rFonts w:ascii="Times New Roman" w:hAnsi="Times New Roman" w:cs="Times New Roman"/>
         </w:rPr>
-        <w:t>Occupational stress has been widely explored in both organisational psychology and healt</w:t>
-      </w:r>
-      <w:r>
-        <w:rPr>
-          <w:rFonts w:ascii="Times New Roman" w:hAnsi="Times New Roman" w:cs="Times New Roman"/>
-        </w:rPr>
-        <w:t>h</w:t>
-      </w:r>
-      <w:r>
-        <w:rPr>
-          <w:rFonts w:ascii="Times New Roman" w:hAnsi="Times New Roman" w:cs="Times New Roman"/>
-        </w:rPr>
-        <w:t xml:space="preserve"> research, with many studies showing that different professions experience stress in different ways.</w:t>
+        <w:t>Occupational stress has been widely explored in organisational psychology and health research, with many studies showing that professions experience stress in different ways.</w:t>
       </w:r>
       <w:r>
         <w:rPr>
@@ -2720,8 +2708,8 @@
             <w:rFonts w:ascii="Times New Roman" w:hAnsi="Times New Roman" w:cs="Times New Roman"/>
             <w:color w:val="000000"/>
           </w:rPr>
-          <w:tag w:val="MENDELEY_CITATION_v3_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"/>
-          <w:id w:val="605386655"/>
+          <w:tag w:val="MENDELEY_CITATION_v3_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"/>
+          <w:id w:val="-643201396"/>
           <w:placeholder>
             <w:docPart w:val="DefaultPlaceholder_-1854013440"/>
           </w:placeholder>
@@ -2740,13 +2728,7 @@
         <w:rPr>
           <w:rFonts w:ascii="Times New Roman" w:hAnsi="Times New Roman" w:cs="Times New Roman"/>
         </w:rPr>
-        <w:t xml:space="preserve"> </w:t>
-      </w:r>
-      <w:r>
-        <w:rPr>
-          <w:rFonts w:ascii="Times New Roman" w:hAnsi="Times New Roman" w:cs="Times New Roman"/>
-        </w:rPr>
-        <w:t>conducted a large national survey of U.S. physicians, in which 6,880 doctors responded to questions about burnout and work–life balance. Their findings showed that doctors reported substantially higher levels of work-related pressure than the general workforce, highlighting how clinical decision-making, long shifts and emotional responsibility contribute to increased stress in medical roles.</w:t>
+        <w:t xml:space="preserve"> conducted a large national survey of U.S. physicians, in which 6,880 doctors answered questions about burnout and work–life balance. Their findings showed that doctors reported higher levels of work-related pressure than the general workforce, highlighting how clinical decision-making, long shifts and emotional responsibility contribute to increased stress in medical roles.</w:t>
       </w:r>
     </w:p>
     <w:p>
@@ -2761,9 +2743,8 @@
     </w:p>
     <w:p>
       <w:pPr>
-        <w:spacing w:after="160" w:line="278" w:lineRule="auto"/>
+        <w:pStyle w:val="ListParagraph"/>
         <w:ind w:left="1440"/>
-        <w:contextualSpacing/>
         <w:jc w:val="both"/>
         <w:rPr>
           <w:rFonts w:ascii="Times New Roman" w:hAnsi="Times New Roman" w:cs="Times New Roman"/>
@@ -2787,10 +2768,10 @@
             <w:rFonts w:ascii="Times New Roman" w:hAnsi="Times New Roman" w:cs="Times New Roman"/>
             <w:color w:val="000000"/>
           </w:rPr>
-          <w:tag w:val="MENDELEY_CITATION_v3_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"/>
-          <w:id w:val="-1662462371"/>
+          <w:tag w:val="MENDELEY_CITATION_v3_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"/>
+          <w:id w:val="1390916534"/>
           <w:placeholder>
-            <w:docPart w:val="F6EF149536B84AF285F7102C49317FE0"/>
+            <w:docPart w:val="DefaultPlaceholder_-1854013440"/>
           </w:placeholder>
         </w:sdtPr>
         <w:sdtContent>
@@ -2813,70 +2794,47 @@
         <w:rPr>
           <w:rFonts w:ascii="Times New Roman" w:hAnsi="Times New Roman" w:cs="Times New Roman"/>
         </w:rPr>
-        <w:t xml:space="preserve">examined occupational stress among locomotive engineers in the Yangtze River Delta region and surveyed nearly 8,000 participants using recognised measures of sleep quality and well-being such as Pittsburgh Sleep Quality Index (PSQI). The study found </w:t>
-      </w:r>
-      <w:r>
+        <w:t>examined occupational stress among locomotive engineers in the Yangtze River Delta region and surveyed nearly 8,000 participants using recognised measures such as the Pittsburgh Sleep Quality Index (PSQI). The study found that better sleep and higher well-being were linked to lower stress, while frequent night shifts and long commutes increased stress risk. These findings demonstrate how lifestyle and work patterns shape stress experiences in engineering roles.</w:t>
+      </w:r>
+    </w:p>
+    <w:p>
+      <w:pPr>
+        <w:jc w:val="both"/>
         <w:rPr>
           <w:rFonts w:ascii="Times New Roman" w:hAnsi="Times New Roman" w:cs="Times New Roman"/>
         </w:rPr>
-        <w:t xml:space="preserve">showed that good sleep quality and higher well-being were associated with a reduced likelihood of stress, while factors like frequent night shifts and long commutes increased stress risk. </w:t>
-      </w:r>
-      <w:r>
+      </w:pPr>
+    </w:p>
+    <w:p>
+      <w:pPr>
+        <w:pStyle w:val="ListParagraph"/>
+        <w:ind w:left="1440"/>
         <w:rPr>
           <w:rFonts w:ascii="Times New Roman" w:hAnsi="Times New Roman" w:cs="Times New Roman"/>
         </w:rPr>
-        <w:t>These findings demonstrate how lifestyle and work patterns shape stress experiences in engineering roles.</w:t>
-      </w:r>
+      </w:pPr>
       <w:r>
         <w:rPr>
           <w:rFonts w:ascii="Times New Roman" w:hAnsi="Times New Roman" w:cs="Times New Roman"/>
         </w:rPr>
-        <w:t xml:space="preserve"> </w:t>
-      </w:r>
-    </w:p>
-    <w:p>
-      <w:pPr>
-        <w:spacing w:after="160" w:line="278" w:lineRule="auto"/>
-        <w:ind w:left="1440"/>
-        <w:contextualSpacing/>
-        <w:jc w:val="both"/>
-        <w:rPr>
-          <w:rFonts w:ascii="Times New Roman" w:hAnsi="Times New Roman" w:cs="Times New Roman"/>
-        </w:rPr>
-      </w:pPr>
-    </w:p>
-    <w:p>
-      <w:pPr>
-        <w:spacing w:after="160" w:line="278" w:lineRule="auto"/>
-        <w:ind w:left="1440"/>
-        <w:contextualSpacing/>
-        <w:jc w:val="both"/>
-        <w:rPr>
-          <w:rFonts w:ascii="Times New Roman" w:eastAsia="Aptos" w:hAnsi="Times New Roman" w:cs="Times New Roman"/>
-        </w:rPr>
-      </w:pPr>
-      <w:r>
-        <w:rPr>
-          <w:rFonts w:ascii="Times New Roman" w:eastAsia="Aptos" w:hAnsi="Times New Roman" w:cs="Times New Roman"/>
-        </w:rPr>
-        <w:t xml:space="preserve">Broader research further supports the idea that stress varies across occupations. </w:t>
+        <w:t xml:space="preserve">Broader literature also suggests that stress varies across occupations. </w:t>
       </w:r>
       <w:sdt>
         <w:sdtPr>
           <w:rPr>
-            <w:rFonts w:ascii="Times New Roman" w:eastAsia="Aptos" w:hAnsi="Times New Roman" w:cs="Times New Roman"/>
+            <w:rFonts w:ascii="Times New Roman" w:hAnsi="Times New Roman" w:cs="Times New Roman"/>
             <w:color w:val="000000"/>
           </w:rPr>
-          <w:tag w:val="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"/>
-          <w:id w:val="1968618399"/>
+          <w:tag w:val="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"/>
+          <w:id w:val="-1220509752"/>
           <w:placeholder>
-            <w:docPart w:val="4DF79FF2BEA64B81B3C1389B1A5F0B7E"/>
+            <w:docPart w:val="DefaultPlaceholder_-1854013440"/>
           </w:placeholder>
         </w:sdtPr>
         <w:sdtContent>
           <w:r>
             <w:rPr>
-              <w:rFonts w:ascii="Times New Roman" w:eastAsia="Aptos" w:hAnsi="Times New Roman" w:cs="Times New Roman"/>
+              <w:rFonts w:ascii="Times New Roman" w:hAnsi="Times New Roman" w:cs="Times New Roman"/>
               <w:color w:val="000000"/>
             </w:rPr>
             <w:t>Johnson et al. (1996)</w:t>
@@ -2885,7 +2843,7 @@
       </w:sdt>
       <w:r>
         <w:rPr>
-          <w:rFonts w:ascii="Times New Roman" w:eastAsia="Aptos" w:hAnsi="Times New Roman" w:cs="Times New Roman"/>
+          <w:rFonts w:ascii="Times New Roman" w:hAnsi="Times New Roman" w:cs="Times New Roman"/>
         </w:rPr>
         <w:t xml:space="preserve"> showed that differences in job control and psychosocial work conditions contribute to varying levels of strain between professions. Together, these studies justify comparing stress levels between doctors and engineers.</w:t>
       </w:r>
@@ -2942,6 +2900,54 @@
     </w:p>
     <w:p>
       <w:pPr>
+        <w:pStyle w:val="ListParagraph"/>
+        <w:ind w:left="1440"/>
+        <w:rPr>
+          <w:rFonts w:ascii="Times New Roman" w:eastAsia="Times New Roman" w:hAnsi="Times New Roman" w:cs="Times New Roman"/>
+          <w:b/>
+          <w:bCs/>
+        </w:rPr>
+      </w:pPr>
+    </w:p>
+    <w:p>
+      <w:pPr>
+        <w:pStyle w:val="ListParagraph"/>
+        <w:ind w:left="1440"/>
+        <w:rPr>
+          <w:rFonts w:ascii="Times New Roman" w:eastAsia="Times New Roman" w:hAnsi="Times New Roman" w:cs="Times New Roman"/>
+        </w:rPr>
+      </w:pPr>
+      <w:r>
+        <w:rPr>
+          <w:rFonts w:ascii="Times New Roman" w:eastAsia="Times New Roman" w:hAnsi="Times New Roman" w:cs="Times New Roman"/>
+        </w:rPr>
+        <w:t>Existing research shows that doctors and engineers experience stress in different ways, yet very few studies compare these professions directly, especially within a consistent working-age group (27 - 59). This creates a gap in understanding how two high-demand technical roles differ in their stress patterns. Since workplace conditions and role expectations influence strain, examining these occupations together helps clarify how job-specific pressures shape overall stress experiences.</w:t>
+      </w:r>
+      <w:r>
+        <w:rPr>
+          <w:rFonts w:ascii="Times New Roman" w:eastAsia="Times New Roman" w:hAnsi="Times New Roman" w:cs="Times New Roman"/>
+        </w:rPr>
+        <w:br/>
+      </w:r>
+    </w:p>
+    <w:p>
+      <w:pPr>
+        <w:pStyle w:val="ListParagraph"/>
+        <w:ind w:left="1440"/>
+        <w:rPr>
+          <w:rFonts w:ascii="Times New Roman" w:eastAsia="Times New Roman" w:hAnsi="Times New Roman" w:cs="Times New Roman"/>
+        </w:rPr>
+      </w:pPr>
+      <w:r>
+        <w:rPr>
+          <w:rFonts w:ascii="Times New Roman" w:eastAsia="Times New Roman" w:hAnsi="Times New Roman" w:cs="Times New Roman"/>
+        </w:rPr>
+        <w:t>Future studies could explore how environmental lifestyle factors such as neighbourhood noise levels, living conditions, commute environments or urban stress exposure can interact with occupational demands to influence stress levels, particularly through their impact on sleep quality and daily recovery.</w:t>
+      </w:r>
+    </w:p>
+    <w:p>
+      <w:pPr>
+        <w:pStyle w:val="ListParagraph"/>
         <w:ind w:left="1440"/>
         <w:rPr>
           <w:rFonts w:ascii="Times New Roman" w:eastAsia="Times New Roman" w:hAnsi="Times New Roman" w:cs="Times New Roman"/>
@@ -3154,6 +3160,7 @@
           <w:highlight w:val="yellow"/>
           <w:shd w:val="clear" w:color="auto" w:fill="FFFFFF"/>
         </w:rPr>
+        <w:lastRenderedPageBreak/>
         <w:t xml:space="preserve">Include </w:t>
       </w:r>
       <w:r>
@@ -3495,7 +3502,6 @@
         <w:rPr>
           <w:rFonts w:ascii="Times New Roman" w:eastAsia="Times New Roman" w:hAnsi="Times New Roman" w:cs="Times New Roman"/>
         </w:rPr>
-        <w:lastRenderedPageBreak/>
         <w:t>Additional information relating to understanding the data (optional)</w:t>
       </w:r>
       <w:r>
@@ -4110,7 +4116,8 @@
         <w:rPr>
           <w:rFonts w:ascii="Times New Roman" w:eastAsia="Times New Roman" w:hAnsi="Times New Roman" w:cs="Times New Roman"/>
         </w:rPr>
-        <w:t>The  team communicated effectively, shared responsibilities fairly, and maintained good collaboration throughout the project, regular meetings helped keep everyone aligned, and each member delivered their task om time.</w:t>
+        <w:lastRenderedPageBreak/>
+        <w:t>The team communicated effectively, shared responsibilities fairly, and maintained good collaboration throughout the project, regular meetings helped keep everyone aligned, and each member delivered their task om time.</w:t>
       </w:r>
     </w:p>
     <w:p>
@@ -4177,7 +4184,19 @@
         <w:rPr>
           <w:rFonts w:ascii="Times New Roman" w:eastAsia="Times New Roman" w:hAnsi="Times New Roman" w:cs="Times New Roman"/>
         </w:rPr>
-        <w:t>Some task lacked clear planning at the start, which led to delays, a few meetings could have been better attended, and earlier integration of individual crisis would have prevented last minute issues, using the necessary tools required for the task more consistently would make future work smoother and reduce confusion.</w:t>
+        <w:t xml:space="preserve">Some </w:t>
+      </w:r>
+      <w:r>
+        <w:rPr>
+          <w:rFonts w:ascii="Times New Roman" w:eastAsia="Times New Roman" w:hAnsi="Times New Roman" w:cs="Times New Roman"/>
+        </w:rPr>
+        <w:t>tasks</w:t>
+      </w:r>
+      <w:r>
+        <w:rPr>
+          <w:rFonts w:ascii="Times New Roman" w:eastAsia="Times New Roman" w:hAnsi="Times New Roman" w:cs="Times New Roman"/>
+        </w:rPr>
+        <w:t xml:space="preserve"> lacked clear planning at the start, which led to delays, a few meetings could have been better attended, and earlier integration of individual crisis would have prevented last minute issues, using the necessary tools required for the task more consistently would make future work smoother and reduce confusion.</w:t>
       </w:r>
     </w:p>
     <w:p>
@@ -4224,7 +4243,31 @@
         <w:rPr>
           <w:rFonts w:ascii="Times New Roman" w:eastAsia="Times New Roman" w:hAnsi="Times New Roman" w:cs="Times New Roman"/>
         </w:rPr>
-        <w:t>Time management was effective, with core deadlines being met, Certain task were completed later than planned, increasing pressure near end, better scheduling and earlier progress checks would have improved work flow, the team adapted well when challenges emerged and ensured the project was completed successfully.</w:t>
+        <w:t xml:space="preserve">Time management was effective, with core deadlines being met, Certain task </w:t>
+      </w:r>
+      <w:r>
+        <w:rPr>
+          <w:rFonts w:ascii="Times New Roman" w:eastAsia="Times New Roman" w:hAnsi="Times New Roman" w:cs="Times New Roman"/>
+        </w:rPr>
+        <w:t>was</w:t>
+      </w:r>
+      <w:r>
+        <w:rPr>
+          <w:rFonts w:ascii="Times New Roman" w:eastAsia="Times New Roman" w:hAnsi="Times New Roman" w:cs="Times New Roman"/>
+        </w:rPr>
+        <w:t xml:space="preserve"> completed later than planned, increasing pressure near end, better scheduling and earlier progress checks would have improved </w:t>
+      </w:r>
+      <w:r>
+        <w:rPr>
+          <w:rFonts w:ascii="Times New Roman" w:eastAsia="Times New Roman" w:hAnsi="Times New Roman" w:cs="Times New Roman"/>
+        </w:rPr>
+        <w:t>workflow</w:t>
+      </w:r>
+      <w:r>
+        <w:rPr>
+          <w:rFonts w:ascii="Times New Roman" w:eastAsia="Times New Roman" w:hAnsi="Times New Roman" w:cs="Times New Roman"/>
+        </w:rPr>
+        <w:t>, the team adapted well when challenges emerged and ensured the project was completed successfully.</w:t>
       </w:r>
     </w:p>
     <w:p>
@@ -4272,7 +4315,19 @@
         <w:rPr>
           <w:rFonts w:ascii="Times New Roman" w:eastAsia="Times New Roman" w:hAnsi="Times New Roman" w:cs="Times New Roman"/>
         </w:rPr>
-        <w:t>The team met most of its objectives and demonstrated solid team work and technical understanding, the quality of work was consistent, and the solution functioned as intended, there was always a room additional refinement, the outcome was well coordinated.</w:t>
+        <w:t xml:space="preserve">The team met most of its objectives and demonstrated solid </w:t>
+      </w:r>
+      <w:r>
+        <w:rPr>
+          <w:rFonts w:ascii="Times New Roman" w:eastAsia="Times New Roman" w:hAnsi="Times New Roman" w:cs="Times New Roman"/>
+        </w:rPr>
+        <w:t>teamwork</w:t>
+      </w:r>
+      <w:r>
+        <w:rPr>
+          <w:rFonts w:ascii="Times New Roman" w:eastAsia="Times New Roman" w:hAnsi="Times New Roman" w:cs="Times New Roman"/>
+        </w:rPr>
+        <w:t xml:space="preserve"> and technical understanding, the quality of work was consistent, and the solution functioned as intended, there was always a room additional refinement, the outcome was well coordinated.</w:t>
       </w:r>
     </w:p>
     <w:p>
@@ -4437,7 +4492,19 @@
         <w:rPr>
           <w:rFonts w:ascii="Times New Roman" w:eastAsia="Times New Roman" w:hAnsi="Times New Roman" w:cs="Times New Roman"/>
         </w:rPr>
-        <w:t>A more uniform commit strategy ( example naming convention, timing) could improve traceability.</w:t>
+        <w:t xml:space="preserve">A more uniform commit strategy </w:t>
+      </w:r>
+      <w:r>
+        <w:rPr>
+          <w:rFonts w:ascii="Times New Roman" w:eastAsia="Times New Roman" w:hAnsi="Times New Roman" w:cs="Times New Roman"/>
+        </w:rPr>
+        <w:t>(example</w:t>
+      </w:r>
+      <w:r>
+        <w:rPr>
+          <w:rFonts w:ascii="Times New Roman" w:eastAsia="Times New Roman" w:hAnsi="Times New Roman" w:cs="Times New Roman"/>
+        </w:rPr>
+        <w:t xml:space="preserve"> naming convention, timing) could improve traceability.</w:t>
       </w:r>
     </w:p>
     <w:p>
@@ -4630,7 +4697,27 @@
           <w:iCs/>
           <w:highlight w:val="yellow"/>
         </w:rPr>
-        <w:t>“I personally committed to github”</w:t>
+        <w:t xml:space="preserve">“I personally committed to </w:t>
+      </w:r>
+      <w:proofErr w:type="spellStart"/>
+      <w:r>
+        <w:rPr>
+          <w:rFonts w:ascii="Times New Roman" w:eastAsia="Times New Roman" w:hAnsi="Times New Roman" w:cs="Times New Roman"/>
+          <w:i/>
+          <w:iCs/>
+          <w:highlight w:val="yellow"/>
+        </w:rPr>
+        <w:t>github</w:t>
+      </w:r>
+      <w:proofErr w:type="spellEnd"/>
+      <w:r>
+        <w:rPr>
+          <w:rFonts w:ascii="Times New Roman" w:eastAsia="Times New Roman" w:hAnsi="Times New Roman" w:cs="Times New Roman"/>
+          <w:i/>
+          <w:iCs/>
+          <w:highlight w:val="yellow"/>
+        </w:rPr>
+        <w:t>”</w:t>
       </w:r>
       <w:r>
         <w:rPr>
@@ -4781,6 +4868,7 @@
           <w:iCs/>
           <w:highlight w:val="yellow"/>
         </w:rPr>
+        <w:lastRenderedPageBreak/>
         <w:t>My teammates uploaded sections of the report, added findings and updated the appendix .</w:t>
       </w:r>
     </w:p>
@@ -4932,7 +5020,6 @@
         <w:rPr>
           <w:rFonts w:ascii="Times New Roman" w:eastAsia="Times New Roman" w:hAnsi="Times New Roman" w:cs="Times New Roman"/>
         </w:rPr>
-        <w:lastRenderedPageBreak/>
         <w:t>Results explained</w:t>
       </w:r>
       <w:r>
@@ -5220,7 +5307,77 @@
         <w:rPr>
           <w:rFonts w:ascii="Times New Roman" w:eastAsia="Times New Roman" w:hAnsi="Times New Roman" w:cs="Times New Roman"/>
         </w:rPr>
-        <w:t>LIU, Y., YANG, F., JIN, Y., WU, H., CAO, X. and YIN, Y. (2024) ‘Associations of well-being and sleep quality with occupational stress among locomotive engineers in the Yangtze River Delta region’, Huan jing yu zhi ye yi xue = Journal of environmental &amp; occupational medicine, 41(5), pp. 526–532.</w:t>
+        <w:t xml:space="preserve">LIU, Y., YANG, F., JIN, Y., WU, H., CAO, X. and YIN, Y. (2024) ‘Associations of well-being and sleep quality with occupational stress among locomotive engineers in the Yangtze River Delta region’, Huan </w:t>
+      </w:r>
+      <w:proofErr w:type="spellStart"/>
+      <w:r>
+        <w:rPr>
+          <w:rFonts w:ascii="Times New Roman" w:eastAsia="Times New Roman" w:hAnsi="Times New Roman" w:cs="Times New Roman"/>
+        </w:rPr>
+        <w:t>jing</w:t>
+      </w:r>
+      <w:proofErr w:type="spellEnd"/>
+      <w:r>
+        <w:rPr>
+          <w:rFonts w:ascii="Times New Roman" w:eastAsia="Times New Roman" w:hAnsi="Times New Roman" w:cs="Times New Roman"/>
+        </w:rPr>
+        <w:t xml:space="preserve"> </w:t>
+      </w:r>
+      <w:proofErr w:type="spellStart"/>
+      <w:r>
+        <w:rPr>
+          <w:rFonts w:ascii="Times New Roman" w:eastAsia="Times New Roman" w:hAnsi="Times New Roman" w:cs="Times New Roman"/>
+        </w:rPr>
+        <w:t>yu</w:t>
+      </w:r>
+      <w:proofErr w:type="spellEnd"/>
+      <w:r>
+        <w:rPr>
+          <w:rFonts w:ascii="Times New Roman" w:eastAsia="Times New Roman" w:hAnsi="Times New Roman" w:cs="Times New Roman"/>
+        </w:rPr>
+        <w:t xml:space="preserve"> </w:t>
+      </w:r>
+      <w:proofErr w:type="spellStart"/>
+      <w:r>
+        <w:rPr>
+          <w:rFonts w:ascii="Times New Roman" w:eastAsia="Times New Roman" w:hAnsi="Times New Roman" w:cs="Times New Roman"/>
+        </w:rPr>
+        <w:t>zhi</w:t>
+      </w:r>
+      <w:proofErr w:type="spellEnd"/>
+      <w:r>
+        <w:rPr>
+          <w:rFonts w:ascii="Times New Roman" w:eastAsia="Times New Roman" w:hAnsi="Times New Roman" w:cs="Times New Roman"/>
+        </w:rPr>
+        <w:t xml:space="preserve"> ye </w:t>
+      </w:r>
+      <w:proofErr w:type="spellStart"/>
+      <w:r>
+        <w:rPr>
+          <w:rFonts w:ascii="Times New Roman" w:eastAsia="Times New Roman" w:hAnsi="Times New Roman" w:cs="Times New Roman"/>
+        </w:rPr>
+        <w:t>yi</w:t>
+      </w:r>
+      <w:proofErr w:type="spellEnd"/>
+      <w:r>
+        <w:rPr>
+          <w:rFonts w:ascii="Times New Roman" w:eastAsia="Times New Roman" w:hAnsi="Times New Roman" w:cs="Times New Roman"/>
+        </w:rPr>
+        <w:t xml:space="preserve"> </w:t>
+      </w:r>
+      <w:proofErr w:type="spellStart"/>
+      <w:r>
+        <w:rPr>
+          <w:rFonts w:ascii="Times New Roman" w:eastAsia="Times New Roman" w:hAnsi="Times New Roman" w:cs="Times New Roman"/>
+        </w:rPr>
+        <w:t>xue</w:t>
+      </w:r>
+      <w:proofErr w:type="spellEnd"/>
+      <w:r>
+        <w:rPr>
+          <w:rFonts w:ascii="Times New Roman" w:eastAsia="Times New Roman" w:hAnsi="Times New Roman" w:cs="Times New Roman"/>
+        </w:rPr>
+        <w:t xml:space="preserve"> = Journal of environmental &amp; occupational medicine, 41(5), pp. 526–532.</w:t>
       </w:r>
     </w:p>
     <w:p>
@@ -5571,8 +5728,16 @@
         <w:rPr>
           <w:rFonts w:ascii="Times New Roman" w:eastAsia="Times New Roman" w:hAnsi="Times New Roman" w:cs="Times New Roman"/>
         </w:rPr>
-        <w:t>#Reference dataset as df</w:t>
-      </w:r>
+        <w:t xml:space="preserve">#Reference dataset as </w:t>
+      </w:r>
+      <w:proofErr w:type="spellStart"/>
+      <w:r>
+        <w:rPr>
+          <w:rFonts w:ascii="Times New Roman" w:eastAsia="Times New Roman" w:hAnsi="Times New Roman" w:cs="Times New Roman"/>
+        </w:rPr>
+        <w:t>df</w:t>
+      </w:r>
+      <w:proofErr w:type="spellEnd"/>
     </w:p>
     <w:p>
       <w:pPr>
@@ -5582,11 +5747,19 @@
           <w:rFonts w:ascii="Times New Roman" w:eastAsia="Times New Roman" w:hAnsi="Times New Roman" w:cs="Times New Roman"/>
         </w:rPr>
       </w:pPr>
-      <w:r>
-        <w:rPr>
-          <w:rFonts w:ascii="Times New Roman" w:eastAsia="Times New Roman" w:hAnsi="Times New Roman" w:cs="Times New Roman"/>
-        </w:rPr>
-        <w:t>df &lt;- read.csv("dataset/Sleep_health_and_lifestyle_dataset.csv")</w:t>
+      <w:proofErr w:type="spellStart"/>
+      <w:r>
+        <w:rPr>
+          <w:rFonts w:ascii="Times New Roman" w:eastAsia="Times New Roman" w:hAnsi="Times New Roman" w:cs="Times New Roman"/>
+        </w:rPr>
+        <w:t>df</w:t>
+      </w:r>
+      <w:proofErr w:type="spellEnd"/>
+      <w:r>
+        <w:rPr>
+          <w:rFonts w:ascii="Times New Roman" w:eastAsia="Times New Roman" w:hAnsi="Times New Roman" w:cs="Times New Roman"/>
+        </w:rPr>
+        <w:t xml:space="preserve"> &lt;- read.csv("dataset/Sleep_health_and_lifestyle_dataset.csv")</w:t>
       </w:r>
     </w:p>
     <w:p>
@@ -5633,11 +5806,33 @@
           <w:rFonts w:ascii="Times New Roman" w:eastAsia="Times New Roman" w:hAnsi="Times New Roman" w:cs="Times New Roman"/>
         </w:rPr>
       </w:pPr>
-      <w:r>
-        <w:rPr>
-          <w:rFonts w:ascii="Times New Roman" w:eastAsia="Times New Roman" w:hAnsi="Times New Roman" w:cs="Times New Roman"/>
-        </w:rPr>
-        <w:t>subset_df &lt;- subset(df, Occupation == "Doctor" | Occupation == "Engineer")</w:t>
+      <w:proofErr w:type="spellStart"/>
+      <w:r>
+        <w:rPr>
+          <w:rFonts w:ascii="Times New Roman" w:eastAsia="Times New Roman" w:hAnsi="Times New Roman" w:cs="Times New Roman"/>
+        </w:rPr>
+        <w:t>subset_df</w:t>
+      </w:r>
+      <w:proofErr w:type="spellEnd"/>
+      <w:r>
+        <w:rPr>
+          <w:rFonts w:ascii="Times New Roman" w:eastAsia="Times New Roman" w:hAnsi="Times New Roman" w:cs="Times New Roman"/>
+        </w:rPr>
+        <w:t xml:space="preserve"> &lt;- subset(</w:t>
+      </w:r>
+      <w:proofErr w:type="spellStart"/>
+      <w:r>
+        <w:rPr>
+          <w:rFonts w:ascii="Times New Roman" w:eastAsia="Times New Roman" w:hAnsi="Times New Roman" w:cs="Times New Roman"/>
+        </w:rPr>
+        <w:t>df</w:t>
+      </w:r>
+      <w:proofErr w:type="spellEnd"/>
+      <w:r>
+        <w:rPr>
+          <w:rFonts w:ascii="Times New Roman" w:eastAsia="Times New Roman" w:hAnsi="Times New Roman" w:cs="Times New Roman"/>
+        </w:rPr>
+        <w:t>, Occupation == "Doctor" | Occupation == "Engineer")</w:t>
       </w:r>
     </w:p>
     <w:p>
@@ -5684,11 +5879,33 @@
           <w:rFonts w:ascii="Times New Roman" w:eastAsia="Times New Roman" w:hAnsi="Times New Roman" w:cs="Times New Roman"/>
         </w:rPr>
       </w:pPr>
-      <w:r>
-        <w:rPr>
-          <w:rFonts w:ascii="Times New Roman" w:eastAsia="Times New Roman" w:hAnsi="Times New Roman" w:cs="Times New Roman"/>
-        </w:rPr>
-        <w:t>colnames(subset_df)[8]&lt;- "Stress"</w:t>
+      <w:proofErr w:type="spellStart"/>
+      <w:r>
+        <w:rPr>
+          <w:rFonts w:ascii="Times New Roman" w:eastAsia="Times New Roman" w:hAnsi="Times New Roman" w:cs="Times New Roman"/>
+        </w:rPr>
+        <w:t>colnames</w:t>
+      </w:r>
+      <w:proofErr w:type="spellEnd"/>
+      <w:r>
+        <w:rPr>
+          <w:rFonts w:ascii="Times New Roman" w:eastAsia="Times New Roman" w:hAnsi="Times New Roman" w:cs="Times New Roman"/>
+        </w:rPr>
+        <w:t>(</w:t>
+      </w:r>
+      <w:proofErr w:type="spellStart"/>
+      <w:r>
+        <w:rPr>
+          <w:rFonts w:ascii="Times New Roman" w:eastAsia="Times New Roman" w:hAnsi="Times New Roman" w:cs="Times New Roman"/>
+        </w:rPr>
+        <w:t>subset_df</w:t>
+      </w:r>
+      <w:proofErr w:type="spellEnd"/>
+      <w:r>
+        <w:rPr>
+          <w:rFonts w:ascii="Times New Roman" w:eastAsia="Times New Roman" w:hAnsi="Times New Roman" w:cs="Times New Roman"/>
+        </w:rPr>
+        <w:t>)[8]&lt;- "Stress"</w:t>
       </w:r>
     </w:p>
     <w:p>
@@ -5723,12 +5940,33 @@
           <w:rFonts w:ascii="Times New Roman" w:eastAsia="Times New Roman" w:hAnsi="Times New Roman" w:cs="Times New Roman"/>
         </w:rPr>
       </w:pPr>
-      <w:r>
-        <w:rPr>
-          <w:rFonts w:ascii="Times New Roman" w:eastAsia="Times New Roman" w:hAnsi="Times New Roman" w:cs="Times New Roman"/>
-        </w:rPr>
-        <w:lastRenderedPageBreak/>
-        <w:t>wilcox.test(Stress ~ Occupation, data=subset_df)</w:t>
+      <w:proofErr w:type="spellStart"/>
+      <w:r>
+        <w:rPr>
+          <w:rFonts w:ascii="Times New Roman" w:eastAsia="Times New Roman" w:hAnsi="Times New Roman" w:cs="Times New Roman"/>
+        </w:rPr>
+        <w:t>wilcox.test</w:t>
+      </w:r>
+      <w:proofErr w:type="spellEnd"/>
+      <w:r>
+        <w:rPr>
+          <w:rFonts w:ascii="Times New Roman" w:eastAsia="Times New Roman" w:hAnsi="Times New Roman" w:cs="Times New Roman"/>
+        </w:rPr>
+        <w:t>(Stress ~ Occupation, data=</w:t>
+      </w:r>
+      <w:proofErr w:type="spellStart"/>
+      <w:r>
+        <w:rPr>
+          <w:rFonts w:ascii="Times New Roman" w:eastAsia="Times New Roman" w:hAnsi="Times New Roman" w:cs="Times New Roman"/>
+        </w:rPr>
+        <w:t>subset_df</w:t>
+      </w:r>
+      <w:proofErr w:type="spellEnd"/>
+      <w:r>
+        <w:rPr>
+          <w:rFonts w:ascii="Times New Roman" w:eastAsia="Times New Roman" w:hAnsi="Times New Roman" w:cs="Times New Roman"/>
+        </w:rPr>
+        <w:t>)</w:t>
       </w:r>
     </w:p>
     <w:p>
@@ -10266,7 +10504,6 @@
   <w:style w:type="character" w:default="1" w:styleId="DefaultParagraphFont">
     <w:name w:val="Default Paragraph Font"/>
     <w:uiPriority w:val="1"/>
-    <w:semiHidden/>
     <w:unhideWhenUsed/>
   </w:style>
   <w:style w:type="table" w:default="1" w:styleId="TableNormal">
@@ -10788,64 +11025,6 @@
         </w:p>
       </w:docPartBody>
     </w:docPart>
-    <w:docPart>
-      <w:docPartPr>
-        <w:name w:val="F6EF149536B84AF285F7102C49317FE0"/>
-        <w:category>
-          <w:name w:val="General"/>
-          <w:gallery w:val="placeholder"/>
-        </w:category>
-        <w:types>
-          <w:type w:val="bbPlcHdr"/>
-        </w:types>
-        <w:behaviors>
-          <w:behavior w:val="content"/>
-        </w:behaviors>
-        <w:guid w:val="{CCADF61A-E1C9-4C01-B45B-00ECF1E8985B}"/>
-      </w:docPartPr>
-      <w:docPartBody>
-        <w:p>
-          <w:pPr>
-            <w:pStyle w:val="F6EF149536B84AF285F7102C49317FE0"/>
-          </w:pPr>
-          <w:r>
-            <w:rPr>
-              <w:rStyle w:val="PlaceholderText"/>
-            </w:rPr>
-            <w:t>Click or tap here to enter text.</w:t>
-          </w:r>
-        </w:p>
-      </w:docPartBody>
-    </w:docPart>
-    <w:docPart>
-      <w:docPartPr>
-        <w:name w:val="4DF79FF2BEA64B81B3C1389B1A5F0B7E"/>
-        <w:category>
-          <w:name w:val="General"/>
-          <w:gallery w:val="placeholder"/>
-        </w:category>
-        <w:types>
-          <w:type w:val="bbPlcHdr"/>
-        </w:types>
-        <w:behaviors>
-          <w:behavior w:val="content"/>
-        </w:behaviors>
-        <w:guid w:val="{C71072D6-C802-4866-B36D-359C015BBFDE}"/>
-      </w:docPartPr>
-      <w:docPartBody>
-        <w:p>
-          <w:pPr>
-            <w:pStyle w:val="4DF79FF2BEA64B81B3C1389B1A5F0B7E"/>
-          </w:pPr>
-          <w:r>
-            <w:rPr>
-              <w:rStyle w:val="PlaceholderText"/>
-            </w:rPr>
-            <w:t>Click or tap here to enter text.</w:t>
-          </w:r>
-        </w:p>
-      </w:docPartBody>
-    </w:docPart>
   </w:docParts>
 </w:glossaryDocument>
 </file>
@@ -10938,9 +11117,11 @@
     <w:rsid w:val="00104EF2"/>
     <w:rsid w:val="001526F6"/>
     <w:rsid w:val="001551D6"/>
+    <w:rsid w:val="00182EE2"/>
     <w:rsid w:val="00185D8D"/>
     <w:rsid w:val="001D002A"/>
     <w:rsid w:val="0020251E"/>
+    <w:rsid w:val="002F6F28"/>
     <w:rsid w:val="00434C71"/>
     <w:rsid w:val="004F3EA5"/>
     <w:rsid w:val="0052003E"/>
@@ -11748,7 +11929,7 @@
   <we:properties>
     <we:property name="MENDELEY_BIBLIOGRAPHY_IS_DIRTY" value="true"/>
     <we:property name="MENDELEY_BIBLIOGRAPHY_LAST_MODIFIED" value="1765286224896"/>
-    <we:property name="MENDELEY_CITATIONS" value="[{&quot;citationID&quot;:&quot;MENDELEY_CITATION_635f6344-cef4-4dab-9e4f-a6f8d9cf0cbb&quot;,&quot;properties&quot;:{&quot;noteIndex&quot;:0,&quot;mode&quot;:&quot;composite&quot;},&quot;isEdited&quot;:false,&quot;manualOverride&quot;:{&quot;isManuallyOverridden&quot;:false,&quot;citeprocText&quot;:&quot;Shanafelt et al. (2015)&quot;,&quot;manualOverrideText&quot;:&quot;&quot;},&quot;citationTag&quot;:&quot;MENDELEY_CITATION_v3_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&quot;,&quot;citationItems&quot;:[{&quot;id&quot;:&quot;07d4edd2-65d8-31ba-a02c-3b9ef854baa0&quot;,&quot;itemData&quot;:{&quot;type&quot;:&quot;article-journal&quot;,&quot;id&quot;:&quot;07d4edd2-65d8-31ba-a02c-3b9ef854baa0&quot;,&quot;title&quot;:&quot;Changes in Burnout and Satisfaction With Work-Life Balance in Physicians and the General US Working Population Between 2011 and 2014&quot;,&quot;author&quot;:[{&quot;family&quot;:&quot;Shanafelt&quot;,&quot;given&quot;:&quot;Tait D.&quot;,&quot;parse-names&quot;:false,&quot;dropping-particle&quot;:&quot;&quot;,&quot;non-dropping-particle&quot;:&quot;&quot;},{&quot;family&quot;:&quot;Hasan&quot;,&quot;given&quot;:&quot;Omar&quot;,&quot;parse-names&quot;:false,&quot;dropping-particle&quot;:&quot;&quot;,&quot;non-dropping-particle&quot;:&quot;&quot;},{&quot;family&quot;:&quot;Dyrbye&quot;,&quot;given&quot;:&quot;Lotte N.&quot;,&quot;parse-names&quot;:false,&quot;dropping-particle&quot;:&quot;&quot;,&quot;non-dropping-particle&quot;:&quot;&quot;},{&quot;family&quot;:&quot;Sinsky&quot;,&quot;given&quot;:&quot;Christine&quot;,&quot;parse-names&quot;:false,&quot;dropping-particle&quot;:&quot;&quot;,&quot;non-dropping-particle&quot;:&quot;&quot;},{&quot;family&quot;:&quot;Satele&quot;,&quot;given&quot;:&quot;Daniel&quot;,&quot;parse-names&quot;:false,&quot;dropping-particle&quot;:&quot;&quot;,&quot;non-dropping-particle&quot;:&quot;&quot;},{&quot;family&quot;:&quot;Sloan&quot;,&quot;given&quot;:&quot;Jeff&quot;,&quot;parse-names&quot;:false,&quot;dropping-particle&quot;:&quot;&quot;,&quot;non-dropping-particle&quot;:&quot;&quot;},{&quot;family&quot;:&quot;West&quot;,&quot;given&quot;:&quot;Colin P.&quot;,&quot;parse-names&quot;:false,&quot;dropping-particle&quot;:&quot;&quot;,&quot;non-dropping-particle&quot;:&quot;&quot;}],&quot;container-title&quot;:&quot;Mayo Clinic Proceedings&quot;,&quot;container-title-short&quot;:&quot;Mayo Clin Proc&quot;,&quot;DOI&quot;:&quot;10.1016/j.mayocp.2015.08.023&quot;,&quot;ISSN&quot;:&quot;00256196&quot;,&quot;issued&quot;:{&quot;date-parts&quot;:[[2015,12]]},&quot;page&quot;:&quot;1600-1613&quot;,&quot;issue&quot;:&quot;12&quot;,&quot;volume&quot;:&quot;90&quot;},&quot;isTemporary&quot;:false,&quot;displayAs&quot;:&quot;composite&quot;,&quot;suppress-author&quot;:false,&quot;composite&quot;:true,&quot;author-only&quot;:false}]}]"/>
+    <we:property name="MENDELEY_CITATIONS" value="[{&quot;citationID&quot;:&quot;MENDELEY_CITATION_1a40485c-c81f-4264-99d7-dfa9e90f5cc5&quot;,&quot;properties&quot;:{&quot;noteIndex&quot;:0,&quot;mode&quot;:&quot;composite&quot;},&quot;isEdited&quot;:false,&quot;manualOverride&quot;:{&quot;isManuallyOverridden&quot;:false,&quot;citeprocText&quot;:&quot;Shanafelt et al. (2015)&quot;,&quot;manualOverrideText&quot;:&quot;&quot;},&quot;citationTag&quot;:&quot;MENDELEY_CITATION_v3_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&quot;,&quot;citationItems&quot;:[{&quot;id&quot;:&quot;07d4edd2-65d8-31ba-a02c-3b9ef854baa0&quot;,&quot;itemData&quot;:{&quot;type&quot;:&quot;article-journal&quot;,&quot;id&quot;:&quot;07d4edd2-65d8-31ba-a02c-3b9ef854baa0&quot;,&quot;title&quot;:&quot;Changes in Burnout and Satisfaction With Work-Life Balance in Physicians and the General US Working Population Between 2011 and 2014&quot;,&quot;author&quot;:[{&quot;family&quot;:&quot;Shanafelt&quot;,&quot;given&quot;:&quot;Tait D.&quot;,&quot;parse-names&quot;:false,&quot;dropping-particle&quot;:&quot;&quot;,&quot;non-dropping-particle&quot;:&quot;&quot;},{&quot;family&quot;:&quot;Hasan&quot;,&quot;given&quot;:&quot;Omar&quot;,&quot;parse-names&quot;:false,&quot;dropping-particle&quot;:&quot;&quot;,&quot;non-dropping-particle&quot;:&quot;&quot;},{&quot;family&quot;:&quot;Dyrbye&quot;,&quot;given&quot;:&quot;Lotte N.&quot;,&quot;parse-names&quot;:false,&quot;dropping-particle&quot;:&quot;&quot;,&quot;non-dropping-particle&quot;:&quot;&quot;},{&quot;family&quot;:&quot;Sinsky&quot;,&quot;given&quot;:&quot;Christine&quot;,&quot;parse-names&quot;:false,&quot;dropping-particle&quot;:&quot;&quot;,&quot;non-dropping-particle&quot;:&quot;&quot;},{&quot;family&quot;:&quot;Satele&quot;,&quot;given&quot;:&quot;Daniel&quot;,&quot;parse-names&quot;:false,&quot;dropping-particle&quot;:&quot;&quot;,&quot;non-dropping-particle&quot;:&quot;&quot;},{&quot;family&quot;:&quot;Sloan&quot;,&quot;given&quot;:&quot;Jeff&quot;,&quot;parse-names&quot;:false,&quot;dropping-particle&quot;:&quot;&quot;,&quot;non-dropping-particle&quot;:&quot;&quot;},{&quot;family&quot;:&quot;West&quot;,&quot;given&quot;:&quot;Colin P.&quot;,&quot;parse-names&quot;:false,&quot;dropping-particle&quot;:&quot;&quot;,&quot;non-dropping-particle&quot;:&quot;&quot;}],&quot;container-title&quot;:&quot;Mayo Clinic Proceedings&quot;,&quot;container-title-short&quot;:&quot;Mayo Clin Proc&quot;,&quot;DOI&quot;:&quot;10.1016/j.mayocp.2015.08.023&quot;,&quot;ISSN&quot;:&quot;00256196&quot;,&quot;issued&quot;:{&quot;date-parts&quot;:[[2015,12]]},&quot;page&quot;:&quot;1600-1613&quot;,&quot;issue&quot;:&quot;12&quot;,&quot;volume&quot;:&quot;90&quot;},&quot;isTemporary&quot;:false,&quot;displayAs&quot;:&quot;composite&quot;,&quot;suppress-author&quot;:false,&quot;composite&quot;:true,&quot;author-only&quot;:false}]},{&quot;citationID&quot;:&quot;MENDELEY_CITATION_c48d1740-9e34-4d56-84f9-bf431d3d16a5&quot;,&quot;properties&quot;:{&quot;noteIndex&quot;:0,&quot;mode&quot;:&quot;composite&quot;},&quot;isEdited&quot;:false,&quot;manualOverride&quot;:{&quot;isManuallyOverridden&quot;:false,&quot;citeprocText&quot;:&quot;LIU et al. (2024)&quot;,&quot;manualOverrideText&quot;:&quot;&quot;},&quot;citationTag&quot;:&quot;MENDELEY_CITATION_v3_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&quot;,&quot;citationItems&quot;:[{&quot;id&quot;:&quot;6dad7615-28ce-302e-895a-0a0cab705910&quot;,&quot;itemData&quot;:{&quot;type&quot;:&quot;article-journal&quot;,&quot;id&quot;:&quot;6dad7615-28ce-302e-895a-0a0cab705910&quot;,&quot;title&quot;:&quot;Associations of well-being and sleep quality with occupational stress among locomotive engineers in the Yangtze River Delta region&quot;,&quot;author&quot;:[{&quot;family&quot;:&quot;LIU&quot;,&quot;given&quot;:&quot;Yan&quot;,&quot;parse-names&quot;:false,&quot;dropping-particle&quot;:&quot;&quot;,&quot;non-dropping-particle&quot;:&quot;&quot;},{&quot;family&quot;:&quot;YANG&quot;,&quot;given&quot;:&quot;Feng&quot;,&quot;parse-names&quot;:false,&quot;dropping-particle&quot;:&quot;&quot;,&quot;non-dropping-particle&quot;:&quot;&quot;},{&quot;family&quot;:&quot;JIN&quot;,&quot;given&quot;:&quot;Yu&quot;,&quot;parse-names&quot;:false,&quot;dropping-particle&quot;:&quot;&quot;,&quot;non-dropping-particle&quot;:&quot;&quot;},{&quot;family&quot;:&quot;WU&quot;,&quot;given&quot;:&quot;Huishuan&quot;,&quot;parse-names&quot;:false,&quot;dropping-particle&quot;:&quot;&quot;,&quot;non-dropping-particle&quot;:&quot;&quot;},{&quot;family&quot;:&quot;CAO&quot;,&quot;given&quot;:&quot;Xueling&quot;,&quot;parse-names&quot;:false,&quot;dropping-particle&quot;:&quot;&quot;,&quot;non-dropping-particle&quot;:&quot;&quot;},{&quot;family&quot;:&quot;YIN&quot;,&quot;given&quot;:&quot;Yan&quot;,&quot;parse-names&quot;:false,&quot;dropping-particle&quot;:&quot;&quot;,&quot;non-dropping-particle&quot;:&quot;&quot;}],&quot;container-title&quot;:&quot;Huan jing yu zhi ye yi xue = Journal of environmental &amp; occupational medicine&quot;,&quot;ISBN&quot;:&quot;2095-9982&quot;,&quot;issued&quot;:{&quot;date-parts&quot;:[[2024]]},&quot;page&quot;:&quot;526-532&quot;,&quot;language&quot;:&quot;English&quot;,&quot;abstract&quot;:&quot;BackgroundOccupational stress is an important factor affecting the health of working population, wellness is a topic that has received much attention in recent years, and sleep quality and wellness have a certain impact on occupational stress. ObjectiveTo understand the current situation of occupational stress among locomotive engineers in in the Yangtze River Delta, explore the influence of well-being and sleep quality on occupational stress, and provide a theoretical basis for occupational stress intervention among locomotive engineers. MethodsSampling was conducted from October to December 2022 using stratified random sampling. The Chinese version of the Brief Occupational Tension Questionnaire based on the Job Demand-Control Model (JDC model), the World Health Organization 5-item Well-Being Index (WHO-5), and the Pittsburgh Sleep Quality Index (PSQI) scale were used to investigate the occupational stress, well-being, and sleep quality of locomotive engineers. Logistic regression was used to analyze the effects of sleep quality and well-being on occupational stress, and additive and multiplicative interaction models were applied to evaluate the interactive effects of well-being and sleep quality on occupational stress. ResultsA total of 8243 questionnaires were collected from five locomotive companies, and after excluding unqualified questionnaires, a total of 7976 questionnaires were included in the analysis. The number of locomotive engineers in the Yangtze River Delta reporting positive occupational stress was 4633 (58.09%), the number of low-level well-being was 4949 (62.05%), and the number of poor sleep quality was 4129 (51.77%). The distribution of occupational stress varied by age, length of service, region, technical level, nature of vehicle, education, per capita monthly family income, marital status, smoking, drinking, number of exercise sessions per week, quality of sleep, work shifts, and length of commute (P&lt;0.01). The results of logistic regression showed that a lower level of occupational stress was associated with &gt;11000 yuan per capita monthly household income (OR=0.795, 95%CI: 0.656, 0.964), high level of well-being (OR=0.477, 95%CI: 0.430, 0.528), and good sleep quality (OR=0.588, 95%CI: 0.531, 0.651); a higher level of occupational stress was associated with night shifts: 1 or fewer night shifts (OR=1.707, 95%CI: 1.312, 2.221), 2 to 3 night shifts (OR=2.649, 95%CI: 2.111, 3.325), and 4 or more night shifts (OR=2.804, 95%CI: 2.202, 3.571); a higher level of occupational stress was associated with 60 min or more commuting time (OR=1.353, 95%CI: 1.111, 1.646). Regarding interaction between poor sleep quality and low well-being on occupational stress, the relative excess risk ratio (RERI), attributable risk index (API), and synergy index (SI) were 1.451 (1.059, 1.844), 0.417 (0.327, 0.507), and 2.407 (1.787, 3.241), respectively, and the result of the multiplicative interaction was an OR of 1.546 (95%CI: 1.262, 1.893). ConclusionThe prevalence of occupational stress among locomotive engineers in the Yangtze River Delta region is generally at a medium level compared with other industries. Good sleep quality reduces the risk of occupational stress to a greater extent than high well-being, and poor sleep quality and low well-being can interact and further increase the risk of occupational stress.&quot;,&quot;issue&quot;:&quot;5&quot;,&quot;volume&quot;:&quot;41&quot;,&quot;container-title-short&quot;:&quot;&quot;},&quot;isTemporary&quot;:false,&quot;displayAs&quot;:&quot;composite&quot;,&quot;suppress-author&quot;:false,&quot;composite&quot;:true,&quot;author-only&quot;:false}]},{&quot;citationID&quot;:&quot;MENDELEY_CITATION_5ca6f845-6cf0-4f7e-b41a-5ecb2f20f863&quot;,&quot;properties&quot;:{&quot;noteIndex&quot;:0,&quot;mode&quot;:&quot;composite&quot;},&quot;isEdited&quot;:false,&quot;manualOverride&quot;:{&quot;isManuallyOverridden&quot;:false,&quot;citeprocText&quot;:&quot;Johnson et al. (1996)&quot;,&quot;manualOverrideText&quot;:&quot;&quot;},&quot;citationTag&quot;:&quot;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&quot;,&quot;citationItems&quot;:[{&quot;id&quot;:&quot;4db84155-3d61-3099-b4d8-64840212861a&quot;,&quot;itemData&quot;:{&quot;type&quot;:&quot;article-journal&quot;,&quot;id&quot;:&quot;4db84155-3d61-3099-b4d8-64840212861a&quot;,&quot;title&quot;:&quot;Long-term psychosocial work environment and cardiovascular mortality among Swedish men&quot;,&quot;author&quot;:[{&quot;family&quot;:&quot;Johnson&quot;,&quot;given&quot;:&quot;J&quot;,&quot;parse-names&quot;:false,&quot;dropping-particle&quot;:&quot;V&quot;,&quot;non-dropping-particle&quot;:&quot;&quot;},{&quot;family&quot;:&quot;Stewart&quot;,&quot;given&quot;:&quot;W&quot;,&quot;parse-names&quot;:false,&quot;dropping-particle&quot;:&quot;&quot;,&quot;non-dropping-particle&quot;:&quot;&quot;},{&quot;family&quot;:&quot;Hall&quot;,&quot;given&quot;:&quot;E M&quot;,&quot;parse-names&quot;:false,&quot;dropping-particle&quot;:&quot;&quot;,&quot;non-dropping-particle&quot;:&quot;&quot;},{&quot;family&quot;:&quot;Fredlund&quot;,&quot;given&quot;:&quot;P&quot;,&quot;parse-names&quot;:false,&quot;dropping-particle&quot;:&quot;&quot;,&quot;non-dropping-particle&quot;:&quot;&quot;},{&quot;family&quot;:&quot;Theorell&quot;,&quot;given&quot;:&quot;T&quot;,&quot;parse-names&quot;:false,&quot;dropping-particle&quot;:&quot;&quot;,&quot;non-dropping-particle&quot;:&quot;&quot;}],&quot;container-title&quot;:&quot;American journal of public health (1971)&quot;,&quot;DOI&quot;:&quot;10.2105/AJPH.86.3.324&quot;,&quot;ISSN&quot;:&quot;0090-0036;1541-0048;&quot;,&quot;URL&quot;:&quot;https://go.exlibris.link/CV8Vvdgr&quot;,&quot;issued&quot;:{&quot;date-parts&quot;:[[1996]]},&quot;publisher-place&quot;:&quot;Washington, DC&quot;,&quot;page&quot;:&quot;324-331&quot;,&quot;language&quot;:&quot;English&quot;,&quot;abstract&quot;:&quot;The source population was a national sample of 12517 Ss selected from the male population by Statistics Sweden in annual surveys between 1977-81. Over a 14-yr followup period, 521 deaths from cardiovascular diseases were identified. A nested case-control design was used. Work environment exposure scores were assigned to cases and controls by linking lifetime job histories with a job exposure matrix. Results of conditional logistic regression analyses indicate that longterm exposure to low work control is a risk factor for cardiovascular disease mortality. (Original abstract-amended);OBJECTIVES. This study examined the effect of cumulative exposure to work organization--psychological demands, work control, and social support on prospectively measured cardiovascular disease mortality risk. METHODS. The source population was a national sample of 12517 subjects selected from the Swedish male population by Statistics Sweden in annual surveys between 1977 and 1981. Over a 14-year follow-up period, 521 deaths from cardiovascular disease were identified. A nested case-control design was used. Work environment exposure scores were assigned to cases and controls by linking lifetime job histories with a job exposure matrix. RESULTS. Conditional logistic regression analysis was used in examining cardiovascular mortality risk in relation to work exposure after adjustment for age, year last employed, smoking, exercise, education, social class, nationality, and physical job demands. In the final multi-variable analysis, workers with low work control had a relative risk of 1.83 (95% confidence interval [CI] = 1.19, 2.82) for cardiovascular mortality. Workers with combined exposure to low control and low support had a relative risk of 2.62 (95% CI=1.22, 5.61). CONCLUSIONS. These results indicate that long-term exposure to low work control is a risk factor for cardiovascular disease mortality.;This study examined the effect of cumulative exposure to work organization--psychological demands, work control, and social support on prospectively measured cardiovascular disease mortality risk.OBJECTIVESThis study examined the effect of cumulative exposure to work organization--psychological demands, work control, and social support on prospectively measured cardiovascular disease mortality risk.The source population was a national sample of 12517 subjects selected from the Swedish male population by Statistics Sweden in annual surveys between 1977 and 1981. Over a 14-year follow-up period, 521 deaths from cardiovascular disease were identified. A nested case-control design was used. Work environment exposure scores were assigned to cases and controls by linking lifetime job histories with a job exposure matrix.METHODSThe source population was a national sample of 12517 subjects selected from the Swedish male population by Statistics Sweden in annual surveys between 1977 and 1981. Over a 14-year follow-up period, 521 deaths from cardiovascular disease were identified. A nested case-control design was used. Work environment exposure scores were assigned to cases and controls by linking lifetime job histories with a job exposure matrix.Conditional logistic regression analysis was used in examining cardiovascular mortality risk in relation to work exposure after adjustment for age, year last employed, smoking, exercise, education, social class, nationality, and physical job demands. In the final multi-variable analysis, workers with low work control had a relative risk of 1.83 (95% confidence interval [CI] = 1.19, 2.82) for cardiovascular mortality. Workers with combined exposure to low control and low support had a relative risk of 2.62 (95% CI=1.22, 5.61).RESULTSConditional logistic regression analysis was used in examining cardiovascular mortality risk in relation to work exposure after adjustment for age, year last employed, smoking, exercise, education, social class, nationality, and physical job demands. In the final multi-variable analysis, workers with low work control had a relative risk of 1.83 (95% confidence interval [CI] = 1.19, 2.82) for cardiovascular mortality. Workers with combined exposure to low control and low support had a relative risk of 2.62 (95% CI=1.22, 5.61).These results indicate that long-term exposure to low work control is a risk factor for cardiovascular disease mortality.CONCLUSIONSThese results indicate that long-term exposure to low work control is a risk factor for cardiovascular disease mortality.;This study examined the effect of cumulative exposure to work organization--psychological demands, work control, and social support on prospectively measured cardiovascular disease mortality risk. The source population was a national sample of 12517 subjects selected from the Swedish male population by Statistics Sweden in annual surveys between 1977 and 1981. Over a 14-year follow-up period, 521 deaths from cardiovascular disease were identified. A nested case-control design was used. Work environment exposure scores were assigned to cases and controls by linking lifetime job histories with a job exposure matrix. Conditional logistic regression analysis was used in examining cardiovascular mortality risk in relation to work exposure after adjustment for age, year last employed, smoking, exercise, education, social class, nationality, and physical job demands. In the final multi-variable analysis, workers with low work control had a relative risk of 1.83 (95% confidence interval [CI] = 1.19, 2.82) for cardiovascular mortality. Workers with combined exposure to low control and low support had a relative risk of 2.62 (95% CI=1.22, 5.61). These results indicate that long-term exposure to low work control is a risk factor for cardiovascular disease mortality.;This study examined the effect of cumulative exposure to work organization--psychological demands, work control, and social support on prospectively measured cardiovascular disease mortality risk.\n\nThe source population was a national sample of 12517 subjects selected from the Swedish male population by Statistics Sweden in annual surveys between 1977 and 1981. Over a 14-year follow-up period, 521 deaths from cardiovascular disease were identified. A nested case-control design was used. Work environment exposure scores were assigned to cases and controls by linking lifetime job histories with a job exposure matrix.\n\nConditional logistic regression analysis was used in examining cardiovascular mortality risk in relation to work exposure after adjustment for age, year last employed, smoking, exercise, education, social class, nationality, and physical job demands. In the final multi-variable analysis, workers with low work control had a relative risk of 1.83 (95% confidence interval [CI] = 1.19, 2.82) for cardiovascular mortality. Workers with combined exposure to low control and low support had a relative risk of 2.62 (95% CI=1.22, 5.61).\n\nThese results indicate that long-term exposure to low work control is a risk factor for cardiovascular disease mortality.;&quot;,&quot;publisher&quot;:&quot;Am Public Health Assoc&quot;,&quot;issue&quot;:&quot;3&quot;,&quot;volume&quot;:&quot;86&quot;,&quot;container-title-short&quot;:&quot;&quot;},&quot;isTemporary&quot;:false,&quot;displayAs&quot;:&quot;composite&quot;,&quot;suppress-author&quot;:false,&quot;composite&quot;:true,&quot;author-only&quot;:false}]}]"/>
     <we:property name="MENDELEY_CITATIONS_LOCALE_CODE" value="&quot;en-GB&quot;"/>
     <we:property name="MENDELEY_CITATIONS_STYLE" value="{&quot;id&quot;:&quot;https://www.zotero.org/styles/harvard-cite-them-right&quot;,&quot;title&quot;:&quot;Cite Them Right 12th edition - Harvard&quot;,&quot;format&quot;:&quot;author-date&quot;,&quot;defaultLocale&quot;:null,&quot;isLocaleCodeValid&quot;:true}"/>
   </we:properties>

</xml_diff>

<commit_message>
updated Student name and ID
</commit_message>
<xml_diff>
--- a/report/7COM1079_Group_A104_Report.docx
+++ b/report/7COM1079_Group_A104_Report.docx
@@ -182,7 +182,7 @@
       <w:pPr>
         <w:rPr>
           <w:rFonts w:ascii="Times New Roman" w:eastAsia="Times New Roman" w:hAnsi="Times New Roman" w:cs="Times New Roman"/>
-          <w:i/>
+          <w:iCs/>
         </w:rPr>
       </w:pPr>
       <w:r>
@@ -209,44 +209,36 @@
           <w:rFonts w:ascii="Times New Roman" w:eastAsia="Times New Roman" w:hAnsi="Times New Roman" w:cs="Times New Roman"/>
           <w:iCs/>
         </w:rPr>
-        <w:t xml:space="preserve">, </w:t>
-      </w:r>
-    </w:p>
-    <w:p>
-      <w:pPr>
-        <w:ind w:left="720"/>
-        <w:rPr>
-          <w:rFonts w:ascii="Times New Roman" w:eastAsia="Times New Roman" w:hAnsi="Times New Roman" w:cs="Times New Roman"/>
-          <w:i/>
-        </w:rPr>
-      </w:pPr>
-      <w:r>
-        <w:rPr>
-          <w:rFonts w:ascii="Times New Roman" w:eastAsia="Times New Roman" w:hAnsi="Times New Roman" w:cs="Times New Roman"/>
-          <w:i/>
-        </w:rPr>
-        <w:t xml:space="preserve">      </w:t>
-      </w:r>
-      <w:r>
-        <w:rPr>
-          <w:rFonts w:ascii="Times New Roman" w:eastAsia="Times New Roman" w:hAnsi="Times New Roman" w:cs="Times New Roman"/>
-          <w:i/>
-        </w:rPr>
-        <w:t xml:space="preserve"> </w:t>
-      </w:r>
-      <w:r>
-        <w:rPr>
-          <w:rFonts w:ascii="Times New Roman" w:eastAsia="Times New Roman" w:hAnsi="Times New Roman" w:cs="Times New Roman"/>
-          <w:i/>
-        </w:rPr>
-        <w:t xml:space="preserve">  [Name and ID of other group members]</w:t>
-      </w:r>
-      <w:r>
-        <w:rPr>
-          <w:rFonts w:ascii="Times New Roman" w:eastAsia="Times New Roman" w:hAnsi="Times New Roman" w:cs="Times New Roman"/>
-          <w:i/>
-        </w:rPr>
-        <w:t xml:space="preserve"> </w:t>
+        <w:t>,</w:t>
+      </w:r>
+    </w:p>
+    <w:p>
+      <w:pPr>
+        <w:rPr>
+          <w:rFonts w:ascii="Times New Roman" w:eastAsia="Times New Roman" w:hAnsi="Times New Roman" w:cs="Times New Roman"/>
+          <w:i/>
+        </w:rPr>
+      </w:pPr>
+      <w:r>
+        <w:rPr>
+          <w:rFonts w:ascii="Times New Roman" w:eastAsia="Times New Roman" w:hAnsi="Times New Roman" w:cs="Times New Roman"/>
+          <w:iCs/>
+        </w:rPr>
+        <w:t xml:space="preserve">                     Dhairya Mistry</w:t>
+      </w:r>
+      <w:r>
+        <w:rPr>
+          <w:rFonts w:ascii="Times New Roman" w:eastAsia="Times New Roman" w:hAnsi="Times New Roman" w:cs="Times New Roman"/>
+          <w:iCs/>
+        </w:rPr>
+        <w:t xml:space="preserve"> (19033970)</w:t>
+      </w:r>
+      <w:r>
+        <w:rPr>
+          <w:rFonts w:ascii="Times New Roman" w:eastAsia="Times New Roman" w:hAnsi="Times New Roman" w:cs="Times New Roman"/>
+          <w:iCs/>
+        </w:rPr>
+        <w:t>,</w:t>
       </w:r>
     </w:p>
     <w:p>
@@ -4829,8 +4821,9 @@
           <w:iCs/>
           <w:highlight w:val="yellow"/>
         </w:rPr>
-        <w:t xml:space="preserve">Teammates major commits </w:t>
-      </w:r>
+        <w:t xml:space="preserve">Teammates major </w:t>
+      </w:r>
+      <w:proofErr w:type="gramStart"/>
       <w:r>
         <w:rPr>
           <w:rFonts w:ascii="Times New Roman" w:eastAsia="Times New Roman" w:hAnsi="Times New Roman" w:cs="Times New Roman"/>
@@ -4838,7 +4831,26 @@
           <w:iCs/>
           <w:highlight w:val="yellow"/>
         </w:rPr>
-        <w:t xml:space="preserve">] Brief explanation of the </w:t>
+        <w:t xml:space="preserve">commits </w:t>
+      </w:r>
+      <w:r>
+        <w:rPr>
+          <w:rFonts w:ascii="Times New Roman" w:eastAsia="Times New Roman" w:hAnsi="Times New Roman" w:cs="Times New Roman"/>
+          <w:i/>
+          <w:iCs/>
+          <w:highlight w:val="yellow"/>
+        </w:rPr>
+        <w:t>]</w:t>
+      </w:r>
+      <w:proofErr w:type="gramEnd"/>
+      <w:r>
+        <w:rPr>
+          <w:rFonts w:ascii="Times New Roman" w:eastAsia="Times New Roman" w:hAnsi="Times New Roman" w:cs="Times New Roman"/>
+          <w:i/>
+          <w:iCs/>
+          <w:highlight w:val="yellow"/>
+        </w:rPr>
+        <w:t xml:space="preserve"> Brief explanation of the </w:t>
       </w:r>
       <w:r>
         <w:rPr>
@@ -4869,8 +4881,19 @@
           <w:highlight w:val="yellow"/>
         </w:rPr>
         <w:lastRenderedPageBreak/>
-        <w:t>My teammates uploaded sections of the report, added findings and updated the appendix .</w:t>
-      </w:r>
+        <w:t xml:space="preserve">My teammates uploaded sections of the report, added findings and updated the </w:t>
+      </w:r>
+      <w:proofErr w:type="gramStart"/>
+      <w:r>
+        <w:rPr>
+          <w:rFonts w:ascii="Times New Roman" w:eastAsia="Times New Roman" w:hAnsi="Times New Roman" w:cs="Times New Roman"/>
+          <w:i/>
+          <w:iCs/>
+          <w:highlight w:val="yellow"/>
+        </w:rPr>
+        <w:t>appendix .</w:t>
+      </w:r>
+      <w:proofErr w:type="gramEnd"/>
     </w:p>
     <w:p>
       <w:pPr>
@@ -4915,8 +4938,9 @@
           <w:iCs/>
           <w:highlight w:val="yellow"/>
         </w:rPr>
-        <w:t xml:space="preserve">Style of commit messages </w:t>
-      </w:r>
+        <w:t xml:space="preserve">Style of commit </w:t>
+      </w:r>
+      <w:proofErr w:type="gramStart"/>
       <w:r>
         <w:rPr>
           <w:rFonts w:ascii="Times New Roman" w:eastAsia="Times New Roman" w:hAnsi="Times New Roman" w:cs="Times New Roman"/>
@@ -4924,7 +4948,26 @@
           <w:iCs/>
           <w:highlight w:val="yellow"/>
         </w:rPr>
-        <w:t xml:space="preserve">] Brief explanation of the </w:t>
+        <w:t xml:space="preserve">messages </w:t>
+      </w:r>
+      <w:r>
+        <w:rPr>
+          <w:rFonts w:ascii="Times New Roman" w:eastAsia="Times New Roman" w:hAnsi="Times New Roman" w:cs="Times New Roman"/>
+          <w:i/>
+          <w:iCs/>
+          <w:highlight w:val="yellow"/>
+        </w:rPr>
+        <w:t>]</w:t>
+      </w:r>
+      <w:proofErr w:type="gramEnd"/>
+      <w:r>
+        <w:rPr>
+          <w:rFonts w:ascii="Times New Roman" w:eastAsia="Times New Roman" w:hAnsi="Times New Roman" w:cs="Times New Roman"/>
+          <w:i/>
+          <w:iCs/>
+          <w:highlight w:val="yellow"/>
+        </w:rPr>
+        <w:t xml:space="preserve"> Brief explanation of the </w:t>
       </w:r>
       <w:r>
         <w:rPr>
@@ -5399,7 +5442,21 @@
         <w:rPr>
           <w:rFonts w:ascii="Times New Roman" w:eastAsia="Times New Roman" w:hAnsi="Times New Roman" w:cs="Times New Roman"/>
         </w:rPr>
-        <w:t>Shanafelt, T.D., Hasan, O., Dyrbye, L.N., Sinsky, C., Satele, D., Sloan, J. and West, C.P. (2015) ‘Changes in Burnout and Satisfaction With Work-Life Balance in Physicians and the General US Working Population Between 2011 and 2014’, Mayo Clinic proceedings, 90(12), pp. 1600–1613.</w:t>
+        <w:t xml:space="preserve">Shanafelt, T.D., Hasan, O., Dyrbye, L.N., Sinsky, C., Satele, D., Sloan, J. and West, C.P. (2015) ‘Changes in Burnout and Satisfaction </w:t>
+      </w:r>
+      <w:proofErr w:type="gramStart"/>
+      <w:r>
+        <w:rPr>
+          <w:rFonts w:ascii="Times New Roman" w:eastAsia="Times New Roman" w:hAnsi="Times New Roman" w:cs="Times New Roman"/>
+        </w:rPr>
+        <w:t>With</w:t>
+      </w:r>
+      <w:proofErr w:type="gramEnd"/>
+      <w:r>
+        <w:rPr>
+          <w:rFonts w:ascii="Times New Roman" w:eastAsia="Times New Roman" w:hAnsi="Times New Roman" w:cs="Times New Roman"/>
+        </w:rPr>
+        <w:t xml:space="preserve"> Work-Life Balance in Physicians and the General US Working Population Between 2011 and 2014’, Mayo Clinic proceedings, 90(12), pp. 1600–1613.</w:t>
       </w:r>
     </w:p>
     <w:p>
@@ -5818,9 +5875,17 @@
         <w:rPr>
           <w:rFonts w:ascii="Times New Roman" w:eastAsia="Times New Roman" w:hAnsi="Times New Roman" w:cs="Times New Roman"/>
         </w:rPr>
-        <w:t xml:space="preserve"> &lt;- subset(</w:t>
+        <w:t xml:space="preserve"> &lt;- </w:t>
+      </w:r>
+      <w:proofErr w:type="gramStart"/>
+      <w:r>
+        <w:rPr>
+          <w:rFonts w:ascii="Times New Roman" w:eastAsia="Times New Roman" w:hAnsi="Times New Roman" w:cs="Times New Roman"/>
+        </w:rPr>
+        <w:t>subset(</w:t>
       </w:r>
       <w:proofErr w:type="spellStart"/>
+      <w:proofErr w:type="gramEnd"/>
       <w:r>
         <w:rPr>
           <w:rFonts w:ascii="Times New Roman" w:eastAsia="Times New Roman" w:hAnsi="Times New Roman" w:cs="Times New Roman"/>
@@ -5898,14 +5963,28 @@
         <w:rPr>
           <w:rFonts w:ascii="Times New Roman" w:eastAsia="Times New Roman" w:hAnsi="Times New Roman" w:cs="Times New Roman"/>
         </w:rPr>
-        <w:t>subset_df</w:t>
+        <w:t>subset_</w:t>
+      </w:r>
+      <w:proofErr w:type="gramStart"/>
+      <w:r>
+        <w:rPr>
+          <w:rFonts w:ascii="Times New Roman" w:eastAsia="Times New Roman" w:hAnsi="Times New Roman" w:cs="Times New Roman"/>
+        </w:rPr>
+        <w:t>df</w:t>
       </w:r>
       <w:proofErr w:type="spellEnd"/>
       <w:r>
         <w:rPr>
           <w:rFonts w:ascii="Times New Roman" w:eastAsia="Times New Roman" w:hAnsi="Times New Roman" w:cs="Times New Roman"/>
         </w:rPr>
-        <w:t>)[8]&lt;- "Stress"</w:t>
+        <w:t>)[8]&lt;</w:t>
+      </w:r>
+      <w:proofErr w:type="gramEnd"/>
+      <w:r>
+        <w:rPr>
+          <w:rFonts w:ascii="Times New Roman" w:eastAsia="Times New Roman" w:hAnsi="Times New Roman" w:cs="Times New Roman"/>
+        </w:rPr>
+        <w:t>- "Stress"</w:t>
       </w:r>
     </w:p>
     <w:p>
@@ -5945,14 +6024,28 @@
         <w:rPr>
           <w:rFonts w:ascii="Times New Roman" w:eastAsia="Times New Roman" w:hAnsi="Times New Roman" w:cs="Times New Roman"/>
         </w:rPr>
-        <w:t>wilcox.test</w:t>
+        <w:t>wilcox.</w:t>
+      </w:r>
+      <w:proofErr w:type="gramStart"/>
+      <w:r>
+        <w:rPr>
+          <w:rFonts w:ascii="Times New Roman" w:eastAsia="Times New Roman" w:hAnsi="Times New Roman" w:cs="Times New Roman"/>
+        </w:rPr>
+        <w:t>test</w:t>
       </w:r>
       <w:proofErr w:type="spellEnd"/>
       <w:r>
         <w:rPr>
           <w:rFonts w:ascii="Times New Roman" w:eastAsia="Times New Roman" w:hAnsi="Times New Roman" w:cs="Times New Roman"/>
         </w:rPr>
-        <w:t>(Stress ~ Occupation, data=</w:t>
+        <w:t>(</w:t>
+      </w:r>
+      <w:proofErr w:type="gramEnd"/>
+      <w:r>
+        <w:rPr>
+          <w:rFonts w:ascii="Times New Roman" w:eastAsia="Times New Roman" w:hAnsi="Times New Roman" w:cs="Times New Roman"/>
+        </w:rPr>
+        <w:t>Stress ~ Occupation, data=</w:t>
       </w:r>
       <w:proofErr w:type="spellStart"/>
       <w:r>
@@ -10504,6 +10597,7 @@
   <w:style w:type="character" w:default="1" w:styleId="DefaultParagraphFont">
     <w:name w:val="Default Paragraph Font"/>
     <w:uiPriority w:val="1"/>
+    <w:semiHidden/>
     <w:unhideWhenUsed/>
   </w:style>
   <w:style w:type="table" w:default="1" w:styleId="TableNormal">
@@ -11131,6 +11225,7 @@
     <w:rsid w:val="00783A3E"/>
     <w:rsid w:val="00797ABC"/>
     <w:rsid w:val="00835653"/>
+    <w:rsid w:val="00916ABD"/>
     <w:rsid w:val="00971FE2"/>
     <w:rsid w:val="009B610C"/>
     <w:rsid w:val="00A33D86"/>
@@ -11599,14 +11694,6 @@
       <w:color w:val="666666"/>
     </w:rPr>
   </w:style>
-  <w:style w:type="paragraph" w:customStyle="1" w:styleId="F6EF149536B84AF285F7102C49317FE0">
-    <w:name w:val="F6EF149536B84AF285F7102C49317FE0"/>
-    <w:rsid w:val="00797ABC"/>
-  </w:style>
-  <w:style w:type="paragraph" w:customStyle="1" w:styleId="4DF79FF2BEA64B81B3C1389B1A5F0B7E">
-    <w:name w:val="4DF79FF2BEA64B81B3C1389B1A5F0B7E"/>
-    <w:rsid w:val="00C0617B"/>
-  </w:style>
 </w:styles>
 </file>
 

</xml_diff>

<commit_message>
Updated report formatting for clarity
</commit_message>
<xml_diff>
--- a/report/7COM1079_Group_A104_Report.docx
+++ b/report/7COM1079_Group_A104_Report.docx
@@ -259,6 +259,13 @@
       <w:r>
         <w:rPr>
           <w:rFonts w:ascii="Times New Roman" w:eastAsia="Times New Roman" w:hAnsi="Times New Roman" w:cs="Times New Roman"/>
+          <w:i/>
+        </w:rPr>
+        <w:t xml:space="preserve"> </w:t>
+      </w:r>
+      <w:r>
+        <w:rPr>
+          <w:rFonts w:ascii="Times New Roman" w:eastAsia="Times New Roman" w:hAnsi="Times New Roman" w:cs="Times New Roman"/>
         </w:rPr>
         <w:t>Halimat Ayomide Aminu (24088076),</w:t>
       </w:r>
@@ -276,7 +283,21 @@
           <w:rFonts w:ascii="Times New Roman" w:eastAsia="Times New Roman" w:hAnsi="Times New Roman" w:cs="Times New Roman"/>
           <w:i/>
         </w:rPr>
-        <w:t xml:space="preserve">       </w:t>
+        <w:t xml:space="preserve">      </w:t>
+      </w:r>
+      <w:r>
+        <w:rPr>
+          <w:rFonts w:ascii="Times New Roman" w:eastAsia="Times New Roman" w:hAnsi="Times New Roman" w:cs="Times New Roman"/>
+          <w:i/>
+        </w:rPr>
+        <w:t xml:space="preserve">  </w:t>
+      </w:r>
+      <w:r>
+        <w:rPr>
+          <w:rFonts w:ascii="Times New Roman" w:eastAsia="Times New Roman" w:hAnsi="Times New Roman" w:cs="Times New Roman"/>
+          <w:i/>
+        </w:rPr>
+        <w:t xml:space="preserve"> </w:t>
       </w:r>
       <w:r>
         <w:rPr>
@@ -306,7 +327,14 @@
           <w:rFonts w:ascii="Times New Roman" w:eastAsia="Times New Roman" w:hAnsi="Times New Roman" w:cs="Times New Roman"/>
           <w:i/>
         </w:rPr>
-        <w:t>[Name and ID of other group members]</w:t>
+        <w:t xml:space="preserve">   </w:t>
+      </w:r>
+      <w:r>
+        <w:rPr>
+          <w:rFonts w:ascii="Times New Roman" w:eastAsia="Times New Roman" w:hAnsi="Times New Roman" w:cs="Times New Roman"/>
+          <w:iCs/>
+        </w:rPr>
+        <w:t>Orji Kelechi Bernard (24036988)</w:t>
       </w:r>
     </w:p>
     <w:p>
@@ -1844,46 +1872,6 @@
     </w:p>
     <w:p>
       <w:pPr>
-        <w:rPr>
-          <w:rFonts w:ascii="Times New Roman" w:eastAsia="Times New Roman" w:hAnsi="Times New Roman" w:cs="Times New Roman"/>
-        </w:rPr>
-      </w:pPr>
-    </w:p>
-    <w:p>
-      <w:pPr>
-        <w:pStyle w:val="ListParagraph"/>
-        <w:ind w:left="1440" w:hanging="720"/>
-        <w:rPr>
-          <w:rFonts w:ascii="Times New Roman" w:eastAsia="Times New Roman" w:hAnsi="Times New Roman" w:cs="Times New Roman"/>
-          <w:i/>
-          <w:iCs/>
-          <w:highlight w:val="yellow"/>
-        </w:rPr>
-      </w:pPr>
-      <w:r>
-        <w:rPr>
-          <w:rFonts w:ascii="Times New Roman" w:eastAsia="Times New Roman" w:hAnsi="Times New Roman" w:cs="Times New Roman"/>
-          <w:i/>
-          <w:iCs/>
-          <w:highlight w:val="yellow"/>
-        </w:rPr>
-        <w:t>The list below outlines the chapter/subchapter numbers, names, word count limits, and explanations of what to write in each section.</w:t>
-      </w:r>
-    </w:p>
-    <w:p>
-      <w:pPr>
-        <w:pStyle w:val="ListParagraph"/>
-        <w:ind w:left="1440" w:hanging="720"/>
-        <w:rPr>
-          <w:rFonts w:ascii="Times New Roman" w:eastAsia="Times New Roman" w:hAnsi="Times New Roman" w:cs="Times New Roman"/>
-          <w:i/>
-          <w:iCs/>
-          <w:highlight w:val="yellow"/>
-        </w:rPr>
-      </w:pPr>
-    </w:p>
-    <w:p>
-      <w:pPr>
         <w:pStyle w:val="ListParagraph"/>
         <w:numPr>
           <w:ilvl w:val="0"/>
@@ -1901,6 +1889,7 @@
           <w:b/>
           <w:bCs/>
         </w:rPr>
+        <w:lastRenderedPageBreak/>
         <w:t>Introduction</w:t>
       </w:r>
     </w:p>
@@ -2588,6 +2577,23 @@
           <w:rFonts w:ascii="Times New Roman" w:eastAsia="Times New Roman" w:hAnsi="Times New Roman" w:cs="Times New Roman"/>
         </w:rPr>
         <w:t xml:space="preserve"> </w:t>
+      </w:r>
+    </w:p>
+    <w:p>
+      <w:pPr>
+        <w:rPr>
+          <w:rFonts w:ascii="Times New Roman" w:eastAsia="Times New Roman" w:hAnsi="Times New Roman" w:cs="Times New Roman"/>
+          <w:b/>
+          <w:bCs/>
+        </w:rPr>
+      </w:pPr>
+      <w:r>
+        <w:rPr>
+          <w:rFonts w:ascii="Times New Roman" w:eastAsia="Times New Roman" w:hAnsi="Times New Roman" w:cs="Times New Roman"/>
+          <w:b/>
+          <w:bCs/>
+        </w:rPr>
+        <w:br w:type="page"/>
       </w:r>
     </w:p>
     <w:p>
@@ -2946,6 +2952,23 @@
     </w:p>
     <w:p>
       <w:pPr>
+        <w:rPr>
+          <w:rFonts w:ascii="Times New Roman" w:eastAsia="Times New Roman" w:hAnsi="Times New Roman" w:cs="Times New Roman"/>
+          <w:b/>
+          <w:bCs/>
+        </w:rPr>
+      </w:pPr>
+      <w:r>
+        <w:rPr>
+          <w:rFonts w:ascii="Times New Roman" w:eastAsia="Times New Roman" w:hAnsi="Times New Roman" w:cs="Times New Roman"/>
+          <w:b/>
+          <w:bCs/>
+        </w:rPr>
+        <w:br w:type="page"/>
+      </w:r>
+    </w:p>
+    <w:p>
+      <w:pPr>
         <w:pStyle w:val="ListParagraph"/>
         <w:numPr>
           <w:ilvl w:val="0"/>
@@ -2963,6 +2986,7 @@
           <w:b/>
           <w:bCs/>
         </w:rPr>
+        <w:lastRenderedPageBreak/>
         <w:t>Visualisation</w:t>
       </w:r>
     </w:p>
@@ -3051,15 +3075,7 @@
           <w:rFonts w:ascii="Times New Roman" w:hAnsi="Times New Roman" w:cs="Times New Roman"/>
           <w:lang w:val="en-US"/>
         </w:rPr>
-        <w:t xml:space="preserve">A box plot was selected as the main visualization to address the research question because it compares the distribution and median stress levels between doctors and </w:t>
-      </w:r>
-      <w:r>
-        <w:rPr>
-          <w:rFonts w:ascii="Times New Roman" w:hAnsi="Times New Roman" w:cs="Times New Roman"/>
-          <w:lang w:val="en-US"/>
-        </w:rPr>
-        <w:lastRenderedPageBreak/>
-        <w:t xml:space="preserve">engineers. In addition, a histogram was included to show the overall spread and frequency of stress levels between both occupations. </w:t>
+        <w:t xml:space="preserve">A box plot was selected as the main visualization to address the research question because it compares the distribution and median stress levels between doctors and engineers. In addition, a histogram was included to show the overall spread and frequency of stress levels between both occupations. </w:t>
       </w:r>
     </w:p>
     <w:p>
@@ -3191,6 +3207,7 @@
         <w:rPr>
           <w:rFonts w:ascii="Times New Roman" w:eastAsia="Times New Roman" w:hAnsi="Times New Roman" w:cs="Times New Roman"/>
         </w:rPr>
+        <w:lastRenderedPageBreak/>
         <w:t>Additional information relating to understanding the data (optional)</w:t>
       </w:r>
       <w:r>
@@ -3254,15 +3271,7 @@
           <w:rFonts w:ascii="Times New Roman" w:eastAsia="Times New Roman" w:hAnsi="Times New Roman" w:cs="Times New Roman"/>
           <w:lang w:bidi="en-US"/>
         </w:rPr>
-        <w:t xml:space="preserve"> each other. This </w:t>
-      </w:r>
-      <w:r>
-        <w:rPr>
-          <w:rFonts w:ascii="Times New Roman" w:eastAsia="Times New Roman" w:hAnsi="Times New Roman" w:cs="Times New Roman"/>
-          <w:lang w:bidi="en-US"/>
-        </w:rPr>
-        <w:lastRenderedPageBreak/>
-        <w:t xml:space="preserve">shows that doctors report around the same level of stress compared to engineers whose average ratings are lower but more spread out.  </w:t>
+        <w:t xml:space="preserve"> each other. This shows that doctors report around the same level of stress compared to engineers whose average ratings are lower but more spread out.  </w:t>
       </w:r>
     </w:p>
     <w:p>
@@ -3437,6 +3446,23 @@
     </w:p>
     <w:p>
       <w:pPr>
+        <w:rPr>
+          <w:rFonts w:ascii="Times New Roman" w:eastAsia="Times New Roman" w:hAnsi="Times New Roman" w:cs="Times New Roman"/>
+          <w:b/>
+          <w:bCs/>
+        </w:rPr>
+      </w:pPr>
+      <w:r>
+        <w:rPr>
+          <w:rFonts w:ascii="Times New Roman" w:eastAsia="Times New Roman" w:hAnsi="Times New Roman" w:cs="Times New Roman"/>
+          <w:b/>
+          <w:bCs/>
+        </w:rPr>
+        <w:br w:type="page"/>
+      </w:r>
+    </w:p>
+    <w:p>
+      <w:pPr>
         <w:pStyle w:val="ListParagraph"/>
         <w:numPr>
           <w:ilvl w:val="0"/>
@@ -3454,6 +3480,7 @@
           <w:b/>
           <w:bCs/>
         </w:rPr>
+        <w:lastRenderedPageBreak/>
         <w:t>Analysis</w:t>
       </w:r>
     </w:p>
@@ -3815,6 +3842,23 @@
     </w:p>
     <w:p>
       <w:pPr>
+        <w:rPr>
+          <w:rFonts w:ascii="Times New Roman" w:eastAsia="Times New Roman" w:hAnsi="Times New Roman" w:cs="Times New Roman"/>
+          <w:b/>
+          <w:bCs/>
+        </w:rPr>
+      </w:pPr>
+      <w:r>
+        <w:rPr>
+          <w:rFonts w:ascii="Times New Roman" w:eastAsia="Times New Roman" w:hAnsi="Times New Roman" w:cs="Times New Roman"/>
+          <w:b/>
+          <w:bCs/>
+        </w:rPr>
+        <w:br w:type="page"/>
+      </w:r>
+    </w:p>
+    <w:p>
+      <w:pPr>
         <w:pStyle w:val="ListParagraph"/>
         <w:numPr>
           <w:ilvl w:val="0"/>
@@ -3832,6 +3876,7 @@
           <w:b/>
           <w:bCs/>
         </w:rPr>
+        <w:lastRenderedPageBreak/>
         <w:t>Evaluation – group’s experience at 7COM1079</w:t>
       </w:r>
     </w:p>
@@ -3888,7 +3933,6 @@
         <w:rPr>
           <w:rFonts w:ascii="Times New Roman" w:eastAsia="Times New Roman" w:hAnsi="Times New Roman" w:cs="Times New Roman"/>
         </w:rPr>
-        <w:lastRenderedPageBreak/>
         <w:t>The team communicated effectively, shared responsibilities fairly, and maintained good collaboration throughout the project, regular meetings helped keep everyone aligned, and each member delivered their task om time.</w:t>
       </w:r>
     </w:p>
@@ -4807,6 +4851,23 @@
     </w:p>
     <w:p>
       <w:pPr>
+        <w:rPr>
+          <w:rFonts w:ascii="Times New Roman" w:eastAsia="Times New Roman" w:hAnsi="Times New Roman" w:cs="Times New Roman"/>
+          <w:b/>
+          <w:bCs/>
+        </w:rPr>
+      </w:pPr>
+      <w:r>
+        <w:rPr>
+          <w:rFonts w:ascii="Times New Roman" w:eastAsia="Times New Roman" w:hAnsi="Times New Roman" w:cs="Times New Roman"/>
+          <w:b/>
+          <w:bCs/>
+        </w:rPr>
+        <w:br w:type="page"/>
+      </w:r>
+    </w:p>
+    <w:p>
+      <w:pPr>
         <w:pStyle w:val="ListParagraph"/>
         <w:numPr>
           <w:ilvl w:val="0"/>
@@ -4824,6 +4885,7 @@
           <w:b/>
           <w:bCs/>
         </w:rPr>
+        <w:lastRenderedPageBreak/>
         <w:t>Conclusions</w:t>
       </w:r>
     </w:p>
@@ -5025,6 +5087,23 @@
     </w:p>
     <w:p>
       <w:pPr>
+        <w:rPr>
+          <w:rFonts w:ascii="Times New Roman" w:eastAsia="Times New Roman" w:hAnsi="Times New Roman" w:cs="Times New Roman"/>
+          <w:b/>
+          <w:bCs/>
+        </w:rPr>
+      </w:pPr>
+      <w:r>
+        <w:rPr>
+          <w:rFonts w:ascii="Times New Roman" w:eastAsia="Times New Roman" w:hAnsi="Times New Roman" w:cs="Times New Roman"/>
+          <w:b/>
+          <w:bCs/>
+        </w:rPr>
+        <w:br w:type="page"/>
+      </w:r>
+    </w:p>
+    <w:p>
+      <w:pPr>
         <w:pStyle w:val="ListParagraph"/>
         <w:numPr>
           <w:ilvl w:val="0"/>
@@ -5042,6 +5121,7 @@
           <w:b/>
           <w:bCs/>
         </w:rPr>
+        <w:lastRenderedPageBreak/>
         <w:t>Reference list</w:t>
       </w:r>
       <w:r>
@@ -5348,6 +5428,23 @@
     </w:p>
     <w:p>
       <w:pPr>
+        <w:rPr>
+          <w:rFonts w:ascii="Times New Roman" w:eastAsia="Times New Roman" w:hAnsi="Times New Roman" w:cs="Times New Roman"/>
+          <w:b/>
+          <w:bCs/>
+        </w:rPr>
+      </w:pPr>
+      <w:r>
+        <w:rPr>
+          <w:rFonts w:ascii="Times New Roman" w:eastAsia="Times New Roman" w:hAnsi="Times New Roman" w:cs="Times New Roman"/>
+          <w:b/>
+          <w:bCs/>
+        </w:rPr>
+        <w:br w:type="page"/>
+      </w:r>
+    </w:p>
+    <w:p>
+      <w:pPr>
         <w:pStyle w:val="ListParagraph"/>
         <w:numPr>
           <w:ilvl w:val="0"/>
@@ -5366,6 +5463,7 @@
           <w:b/>
           <w:bCs/>
         </w:rPr>
+        <w:lastRenderedPageBreak/>
         <w:t>Appendices</w:t>
       </w:r>
     </w:p>
@@ -6316,7 +6414,6 @@
         <w:rPr>
           <w:rFonts w:ascii="Times New Roman" w:eastAsia="Times New Roman" w:hAnsi="Times New Roman" w:cs="Times New Roman"/>
         </w:rPr>
-        <w:lastRenderedPageBreak/>
         <w:t>)</w:t>
       </w:r>
     </w:p>
@@ -6561,6 +6658,7 @@
         <w:rPr>
           <w:rFonts w:ascii="Times New Roman" w:eastAsia="Times New Roman" w:hAnsi="Times New Roman" w:cs="Times New Roman"/>
         </w:rPr>
+        <w:lastRenderedPageBreak/>
         <w:t># Creating a subset of rows with only doctor or engineer as occupation</w:t>
       </w:r>
     </w:p>
@@ -7141,17 +7239,6 @@
     </w:p>
     <w:p>
       <w:pPr>
-        <w:pStyle w:val="ListParagraph"/>
-        <w:ind w:left="2250" w:hanging="810"/>
-        <w:rPr>
-          <w:rFonts w:ascii="Times New Roman" w:eastAsia="Times New Roman" w:hAnsi="Times New Roman" w:cs="Times New Roman"/>
-        </w:rPr>
-      </w:pPr>
-    </w:p>
-    <w:p>
-      <w:pPr>
-        <w:pStyle w:val="ListParagraph"/>
-        <w:ind w:left="2250" w:hanging="810"/>
         <w:rPr>
           <w:rFonts w:ascii="Times New Roman" w:eastAsia="Times New Roman" w:hAnsi="Times New Roman" w:cs="Times New Roman"/>
         </w:rPr>
@@ -7374,7 +7461,6 @@
         <w:rPr>
           <w:rFonts w:ascii="Times New Roman" w:eastAsia="Times New Roman" w:hAnsi="Times New Roman" w:cs="Times New Roman"/>
         </w:rPr>
-        <w:lastRenderedPageBreak/>
         <w:t>colnames</w:t>
       </w:r>
       <w:proofErr w:type="spellEnd"/>
@@ -7491,103 +7577,12 @@
     <w:p>
       <w:pPr>
         <w:pStyle w:val="ListParagraph"/>
-        <w:ind w:left="2250" w:hanging="810"/>
-        <w:rPr>
-          <w:rFonts w:ascii="Times New Roman" w:eastAsia="Times New Roman" w:hAnsi="Times New Roman" w:cs="Times New Roman"/>
-        </w:rPr>
-      </w:pPr>
-    </w:p>
-    <w:p>
-      <w:pPr>
-        <w:pStyle w:val="ListParagraph"/>
-        <w:numPr>
-          <w:ilvl w:val="0"/>
-          <w:numId w:val="19"/>
-        </w:numPr>
         <w:ind w:left="1440"/>
         <w:rPr>
           <w:rFonts w:ascii="Times New Roman" w:eastAsia="Times New Roman" w:hAnsi="Times New Roman" w:cs="Times New Roman"/>
-          <w:i/>
-          <w:iCs/>
           <w:highlight w:val="yellow"/>
         </w:rPr>
       </w:pPr>
-      <w:r>
-        <w:rPr>
-          <w:rFonts w:ascii="Times New Roman" w:eastAsia="Times New Roman" w:hAnsi="Times New Roman" w:cs="Times New Roman"/>
-          <w:b/>
-          <w:bCs/>
-          <w:i/>
-          <w:iCs/>
-          <w:highlight w:val="yellow"/>
-        </w:rPr>
-        <w:t>No word count</w:t>
-      </w:r>
-      <w:r>
-        <w:rPr>
-          <w:rFonts w:ascii="Times New Roman" w:eastAsia="Times New Roman" w:hAnsi="Times New Roman" w:cs="Times New Roman"/>
-          <w:i/>
-          <w:iCs/>
-          <w:highlight w:val="yellow"/>
-        </w:rPr>
-        <w:t>, but ensure the code is without redundant lines, well-commented and produces the correct output.</w:t>
-      </w:r>
-      <w:r>
-        <w:rPr>
-          <w:rFonts w:ascii="Times New Roman" w:eastAsia="Times New Roman" w:hAnsi="Times New Roman" w:cs="Times New Roman"/>
-          <w:i/>
-          <w:iCs/>
-        </w:rPr>
-        <w:t xml:space="preserve"> </w:t>
-      </w:r>
-    </w:p>
-    <w:p>
-      <w:pPr>
-        <w:pStyle w:val="ListParagraph"/>
-        <w:numPr>
-          <w:ilvl w:val="0"/>
-          <w:numId w:val="19"/>
-        </w:numPr>
-        <w:ind w:left="1440"/>
-        <w:rPr>
-          <w:rFonts w:ascii="Times New Roman" w:eastAsia="Times New Roman" w:hAnsi="Times New Roman" w:cs="Times New Roman"/>
-          <w:i/>
-          <w:iCs/>
-          <w:highlight w:val="yellow"/>
-        </w:rPr>
-      </w:pPr>
-      <w:r>
-        <w:rPr>
-          <w:rFonts w:ascii="Times New Roman" w:eastAsia="Times New Roman" w:hAnsi="Times New Roman" w:cs="Times New Roman"/>
-          <w:i/>
-          <w:iCs/>
-          <w:highlight w:val="yellow"/>
-        </w:rPr>
-        <w:t>Make sure it runs (look in Rscript.log for output from a statistical test)</w:t>
-      </w:r>
-    </w:p>
-    <w:p>
-      <w:pPr>
-        <w:pStyle w:val="ListParagraph"/>
-        <w:numPr>
-          <w:ilvl w:val="0"/>
-          <w:numId w:val="19"/>
-        </w:numPr>
-        <w:ind w:left="1440"/>
-        <w:rPr>
-          <w:rFonts w:ascii="Times New Roman" w:eastAsia="Times New Roman" w:hAnsi="Times New Roman" w:cs="Times New Roman"/>
-          <w:highlight w:val="yellow"/>
-        </w:rPr>
-      </w:pPr>
-      <w:r>
-        <w:rPr>
-          <w:rFonts w:ascii="Times New Roman" w:eastAsia="Times New Roman" w:hAnsi="Times New Roman" w:cs="Times New Roman"/>
-          <w:i/>
-          <w:iCs/>
-          <w:highlight w:val="yellow"/>
-        </w:rPr>
-        <w:t>It should compute appropriate statistics to test the hypotheses</w:t>
-      </w:r>
     </w:p>
     <w:p>
       <w:pPr>
@@ -12683,6 +12678,7 @@
   <w:style w:type="character" w:default="1" w:styleId="DefaultParagraphFont">
     <w:name w:val="Default Paragraph Font"/>
     <w:uiPriority w:val="1"/>
+    <w:semiHidden/>
     <w:unhideWhenUsed/>
   </w:style>
   <w:style w:type="table" w:default="1" w:styleId="TableNormal">
@@ -13240,7 +13236,7 @@
   <w:font w:name="Symbol">
     <w:panose1 w:val="05050102010706020507"/>
     <w:charset w:val="02"/>
-    <w:family w:val="decorative"/>
+    <w:family w:val="roman"/>
     <w:pitch w:val="variable"/>
     <w:sig w:usb0="00000000" w:usb1="10000000" w:usb2="00000000" w:usb3="00000000" w:csb0="80000000" w:csb1="00000000"/>
   </w:font>
@@ -13256,17 +13252,16 @@
     <w:charset w:val="00"/>
     <w:family w:val="modern"/>
     <w:pitch w:val="fixed"/>
-    <w:sig w:usb0="E0002AFF" w:usb1="C0007843" w:usb2="00000009" w:usb3="00000000" w:csb0="000001FF" w:csb1="00000000"/>
+    <w:sig w:usb0="E0002EFF" w:usb1="C0007843" w:usb2="00000009" w:usb3="00000000" w:csb0="000001FF" w:csb1="00000000"/>
   </w:font>
   <w:font w:name="Wingdings">
     <w:panose1 w:val="05000000000000000000"/>
-    <w:charset w:val="4D"/>
-    <w:family w:val="decorative"/>
+    <w:charset w:val="02"/>
+    <w:family w:val="auto"/>
     <w:pitch w:val="variable"/>
-    <w:sig w:usb0="00000003" w:usb1="00000000" w:usb2="00000000" w:usb3="00000000" w:csb0="80000001" w:csb1="00000000"/>
+    <w:sig w:usb0="00000000" w:usb1="10000000" w:usb2="00000000" w:usb3="00000000" w:csb0="80000000" w:csb1="00000000"/>
   </w:font>
   <w:font w:name="Aptos">
-    <w:panose1 w:val="020B0004020202020204"/>
     <w:charset w:val="00"/>
     <w:family w:val="swiss"/>
     <w:pitch w:val="variable"/>
@@ -13277,10 +13272,9 @@
     <w:charset w:val="00"/>
     <w:family w:val="swiss"/>
     <w:pitch w:val="variable"/>
-    <w:sig w:usb0="E0002AFF" w:usb1="C0007843" w:usb2="00000009" w:usb3="00000000" w:csb0="000001FF" w:csb1="00000000"/>
+    <w:sig w:usb0="E0002EFF" w:usb1="C000785B" w:usb2="00000009" w:usb3="00000000" w:csb0="000001FF" w:csb1="00000000"/>
   </w:font>
   <w:font w:name="Aptos Display">
-    <w:panose1 w:val="020B0004020202020204"/>
     <w:charset w:val="00"/>
     <w:family w:val="swiss"/>
     <w:pitch w:val="variable"/>
@@ -13320,6 +13314,7 @@
     <w:rsid w:val="002F6F28"/>
     <w:rsid w:val="00434C71"/>
     <w:rsid w:val="00457FDA"/>
+    <w:rsid w:val="004D5F49"/>
     <w:rsid w:val="004F3EA5"/>
     <w:rsid w:val="0052003E"/>
     <w:rsid w:val="00657902"/>
@@ -13336,6 +13331,7 @@
     <w:rsid w:val="00B1466C"/>
     <w:rsid w:val="00C0617B"/>
     <w:rsid w:val="00D13753"/>
+    <w:rsid w:val="00D63E2A"/>
     <w:rsid w:val="00D955E6"/>
     <w:rsid w:val="00ED4A5F"/>
   </w:rsids>

</xml_diff>